<commit_message>
Generate thesis package from secret-clean source
</commit_message>
<xml_diff>
--- a/thesis/output/VEGO-AI-MSc-Thesis-Evidence-Ready-Draft-2026-07-25.docx
+++ b/thesis/output/VEGO-AI-MSc-Thesis-Evidence-Ready-Draft-2026-07-25.docx
@@ -82,7 +82,7 @@
         <w:br/>
         <w:t>25 July 2026</w:t>
         <w:br/>
-        <w:t>Source revision da239a1a819b</w:t>
+        <w:t>Source revision 1e8c0412d49e</w:t>
       </w:r>
     </w:p>
     <w:p>
@@ -31788,7 +31788,7 @@
         <w:color w:val="596573"/>
         <w:sz w:val="17"/>
       </w:rPr>
-      <w:t xml:space="preserve">   |   source da239a1a</w:t>
+      <w:t xml:space="preserve">   |   source 1e8c0412</w:t>
     </w:r>
   </w:p>
 </w:hdr>

</xml_diff>

<commit_message>
Refresh thesis package after review hardening
</commit_message>
<xml_diff>
--- a/thesis/output/VEGO-AI-MSc-Thesis-Evidence-Ready-Draft-2026-07-25.docx
+++ b/thesis/output/VEGO-AI-MSc-Thesis-Evidence-Ready-Draft-2026-07-25.docx
@@ -82,7 +82,7 @@
         <w:br/>
         <w:t>25 July 2026</w:t>
         <w:br/>
-        <w:t>Source revision 1e8c0412d49e</w:t>
+        <w:t>Source revision 145b2e6cea14</w:t>
       </w:r>
     </w:p>
     <w:p>
@@ -30008,7 +30008,7 @@
         <w:t xml:space="preserve">16. </w:t>
       </w:r>
       <w:r>
-        <w:t>Test suite passes (94 tests)</w:t>
+        <w:t>Current verified inventory passes (105 VEGO-AI tests, 82 research-infrastructure tests plus 7 subtests, and 39 offline H-layer tests)</w:t>
       </w:r>
     </w:p>
     <w:p>
@@ -30503,16 +30503,16 @@
           <w:p>
             <w:pPr>
               <w:spacing w:before="0" w:after="0" w:line="252" w:lineRule="auto"/>
-              <w:jc w:val="center"/>
-            </w:pPr>
-            <w:r>
-              <w:rPr>
-                <w:rFonts w:ascii="Calibri" w:hAnsi="Calibri"/>
-                <w:b w:val="0"/>
-                <w:color w:val="1E232A"/>
-                <w:sz w:val="18"/>
-              </w:rPr>
-              <w:t>Run test suite</w:t>
+              <w:jc w:val="left"/>
+            </w:pPr>
+            <w:r>
+              <w:rPr>
+                <w:rFonts w:ascii="Calibri" w:hAnsi="Calibri"/>
+                <w:b w:val="0"/>
+                <w:color w:val="1E232A"/>
+                <w:sz w:val="18"/>
+              </w:rPr>
+              <w:t>Run test inventories</w:t>
             </w:r>
           </w:p>
         </w:tc>
@@ -30539,7 +30539,7 @@
                 <w:color w:val="1E232A"/>
                 <w:sz w:val="18"/>
               </w:rPr>
-              <w:t>python -m pytest VEGO-AI/tests -q</w:t>
+              <w:t>python -m pytest VEGO-AI/tests scripts/tests tests/hlayer_offline -q</w:t>
             </w:r>
           </w:p>
         </w:tc>
@@ -30557,16 +30557,16 @@
           <w:p>
             <w:pPr>
               <w:spacing w:before="0" w:after="0" w:line="252" w:lineRule="auto"/>
-              <w:jc w:val="center"/>
-            </w:pPr>
-            <w:r>
-              <w:rPr>
-                <w:rFonts w:ascii="Calibri" w:hAnsi="Calibri"/>
-                <w:b w:val="0"/>
-                <w:color w:val="1E232A"/>
-                <w:sz w:val="18"/>
-              </w:rPr>
-              <w:t>94 tests pass</w:t>
+              <w:jc w:val="left"/>
+            </w:pPr>
+            <w:r>
+              <w:rPr>
+                <w:rFonts w:ascii="Calibri" w:hAnsi="Calibri"/>
+                <w:b w:val="0"/>
+                <w:color w:val="1E232A"/>
+                <w:sz w:val="18"/>
+              </w:rPr>
+              <w:t>105 VEGO-AI tests, 82 research-infrastructure tests plus 7 subtests, and 39 offline H-layer tests pass</w:t>
             </w:r>
           </w:p>
         </w:tc>
@@ -31788,7 +31788,7 @@
         <w:color w:val="596573"/>
         <w:sz w:val="17"/>
       </w:rPr>
-      <w:t xml:space="preserve">   |   source 1e8c0412</w:t>
+      <w:t xml:space="preserve">   |   source 145b2e6c</w:t>
     </w:r>
   </w:p>
 </w:hdr>

</xml_diff>

<commit_message>
Publish polished thesis review artifacts
</commit_message>
<xml_diff>
--- a/thesis/output/VEGO-AI-MSc-Thesis-Evidence-Ready-Draft-2026-07-25.docx
+++ b/thesis/output/VEGO-AI-MSc-Thesis-Evidence-Ready-Draft-2026-07-25.docx
@@ -82,7 +82,7 @@
         <w:br/>
         <w:t>25 July 2026</w:t>
         <w:br/>
-        <w:t>Source revision 145b2e6cea14</w:t>
+        <w:t>Source revision 9f7287fc1d00</w:t>
       </w:r>
     </w:p>
     <w:p>
@@ -253,6 +253,7 @@
           </w:tcPr>
           <w:p>
             <w:pPr>
+              <w:keepNext/>
               <w:spacing w:before="0" w:after="0" w:line="252" w:lineRule="auto"/>
               <w:jc w:val="left"/>
             </w:pPr>
@@ -280,6 +281,7 @@
           </w:tcPr>
           <w:p>
             <w:pPr>
+              <w:keepNext/>
               <w:spacing w:before="0" w:after="0" w:line="252" w:lineRule="auto"/>
               <w:jc w:val="center"/>
             </w:pPr>
@@ -307,6 +309,7 @@
           </w:tcPr>
           <w:p>
             <w:pPr>
+              <w:keepNext/>
               <w:spacing w:before="0" w:after="0" w:line="252" w:lineRule="auto"/>
               <w:jc w:val="left"/>
             </w:pPr>
@@ -339,6 +342,7 @@
           </w:tcPr>
           <w:p>
             <w:pPr>
+              <w:keepNext/>
               <w:spacing w:before="0" w:after="0" w:line="252" w:lineRule="auto"/>
               <w:jc w:val="center"/>
             </w:pPr>
@@ -366,6 +370,7 @@
           </w:tcPr>
           <w:p>
             <w:pPr>
+              <w:keepNext/>
               <w:spacing w:before="0" w:after="0" w:line="252" w:lineRule="auto"/>
               <w:jc w:val="center"/>
             </w:pPr>
@@ -393,6 +398,7 @@
           </w:tcPr>
           <w:p>
             <w:pPr>
+              <w:keepNext/>
               <w:spacing w:before="0" w:after="0" w:line="252" w:lineRule="auto"/>
               <w:jc w:val="left"/>
             </w:pPr>
@@ -425,6 +431,7 @@
           </w:tcPr>
           <w:p>
             <w:pPr>
+              <w:keepNext/>
               <w:spacing w:before="0" w:after="0" w:line="252" w:lineRule="auto"/>
               <w:jc w:val="center"/>
             </w:pPr>
@@ -452,6 +459,7 @@
           </w:tcPr>
           <w:p>
             <w:pPr>
+              <w:keepNext/>
               <w:spacing w:before="0" w:after="0" w:line="252" w:lineRule="auto"/>
               <w:jc w:val="center"/>
             </w:pPr>
@@ -479,6 +487,7 @@
           </w:tcPr>
           <w:p>
             <w:pPr>
+              <w:keepNext/>
               <w:spacing w:before="0" w:after="0" w:line="252" w:lineRule="auto"/>
               <w:jc w:val="left"/>
             </w:pPr>
@@ -511,6 +520,7 @@
           </w:tcPr>
           <w:p>
             <w:pPr>
+              <w:keepNext/>
               <w:spacing w:before="0" w:after="0" w:line="252" w:lineRule="auto"/>
               <w:jc w:val="left"/>
             </w:pPr>
@@ -538,6 +548,7 @@
           </w:tcPr>
           <w:p>
             <w:pPr>
+              <w:keepNext/>
               <w:spacing w:before="0" w:after="0" w:line="252" w:lineRule="auto"/>
               <w:jc w:val="center"/>
             </w:pPr>
@@ -565,6 +576,7 @@
           </w:tcPr>
           <w:p>
             <w:pPr>
+              <w:keepNext/>
               <w:spacing w:before="0" w:after="0" w:line="252" w:lineRule="auto"/>
               <w:jc w:val="left"/>
             </w:pPr>
@@ -597,6 +609,7 @@
           </w:tcPr>
           <w:p>
             <w:pPr>
+              <w:keepNext/>
               <w:spacing w:before="0" w:after="0" w:line="252" w:lineRule="auto"/>
               <w:jc w:val="center"/>
             </w:pPr>
@@ -624,6 +637,7 @@
           </w:tcPr>
           <w:p>
             <w:pPr>
+              <w:keepNext/>
               <w:spacing w:before="0" w:after="0" w:line="252" w:lineRule="auto"/>
               <w:jc w:val="left"/>
             </w:pPr>
@@ -651,6 +665,7 @@
           </w:tcPr>
           <w:p>
             <w:pPr>
+              <w:keepNext/>
               <w:spacing w:before="0" w:after="0" w:line="252" w:lineRule="auto"/>
               <w:jc w:val="left"/>
             </w:pPr>
@@ -683,6 +698,7 @@
           </w:tcPr>
           <w:p>
             <w:pPr>
+              <w:keepNext w:val="0"/>
               <w:spacing w:before="0" w:after="0" w:line="252" w:lineRule="auto"/>
               <w:jc w:val="center"/>
             </w:pPr>
@@ -710,6 +726,7 @@
           </w:tcPr>
           <w:p>
             <w:pPr>
+              <w:keepNext w:val="0"/>
               <w:spacing w:before="0" w:after="0" w:line="252" w:lineRule="auto"/>
               <w:jc w:val="left"/>
             </w:pPr>
@@ -737,6 +754,7 @@
           </w:tcPr>
           <w:p>
             <w:pPr>
+              <w:keepNext w:val="0"/>
               <w:spacing w:before="0" w:after="0" w:line="252" w:lineRule="auto"/>
               <w:jc w:val="left"/>
             </w:pPr>
@@ -2367,6 +2385,7 @@
           </w:tcPr>
           <w:p>
             <w:pPr>
+              <w:keepNext/>
               <w:spacing w:before="0" w:after="0" w:line="252" w:lineRule="auto"/>
               <w:jc w:val="center"/>
             </w:pPr>
@@ -2394,6 +2413,7 @@
           </w:tcPr>
           <w:p>
             <w:pPr>
+              <w:keepNext/>
               <w:spacing w:before="0" w:after="0" w:line="252" w:lineRule="auto"/>
               <w:jc w:val="left"/>
             </w:pPr>
@@ -2421,6 +2441,7 @@
           </w:tcPr>
           <w:p>
             <w:pPr>
+              <w:keepNext/>
               <w:spacing w:before="0" w:after="0" w:line="252" w:lineRule="auto"/>
               <w:jc w:val="left"/>
             </w:pPr>
@@ -2453,6 +2474,7 @@
           </w:tcPr>
           <w:p>
             <w:pPr>
+              <w:keepNext/>
               <w:spacing w:before="0" w:after="0" w:line="252" w:lineRule="auto"/>
               <w:jc w:val="left"/>
             </w:pPr>
@@ -2480,6 +2502,7 @@
           </w:tcPr>
           <w:p>
             <w:pPr>
+              <w:keepNext/>
               <w:spacing w:before="0" w:after="0" w:line="252" w:lineRule="auto"/>
               <w:jc w:val="left"/>
             </w:pPr>
@@ -2507,6 +2530,7 @@
           </w:tcPr>
           <w:p>
             <w:pPr>
+              <w:keepNext/>
               <w:spacing w:before="0" w:after="0" w:line="252" w:lineRule="auto"/>
               <w:jc w:val="left"/>
             </w:pPr>
@@ -2539,6 +2563,7 @@
           </w:tcPr>
           <w:p>
             <w:pPr>
+              <w:keepNext/>
               <w:spacing w:before="0" w:after="0" w:line="252" w:lineRule="auto"/>
               <w:jc w:val="center"/>
             </w:pPr>
@@ -2566,6 +2591,7 @@
           </w:tcPr>
           <w:p>
             <w:pPr>
+              <w:keepNext/>
               <w:spacing w:before="0" w:after="0" w:line="252" w:lineRule="auto"/>
               <w:jc w:val="left"/>
             </w:pPr>
@@ -2593,6 +2619,7 @@
           </w:tcPr>
           <w:p>
             <w:pPr>
+              <w:keepNext/>
               <w:spacing w:before="0" w:after="0" w:line="252" w:lineRule="auto"/>
               <w:jc w:val="left"/>
             </w:pPr>
@@ -2625,6 +2652,7 @@
           </w:tcPr>
           <w:p>
             <w:pPr>
+              <w:keepNext/>
               <w:spacing w:before="0" w:after="0" w:line="252" w:lineRule="auto"/>
               <w:jc w:val="center"/>
             </w:pPr>
@@ -2652,6 +2680,7 @@
           </w:tcPr>
           <w:p>
             <w:pPr>
+              <w:keepNext/>
               <w:spacing w:before="0" w:after="0" w:line="252" w:lineRule="auto"/>
               <w:jc w:val="left"/>
             </w:pPr>
@@ -2679,6 +2708,7 @@
           </w:tcPr>
           <w:p>
             <w:pPr>
+              <w:keepNext/>
               <w:spacing w:before="0" w:after="0" w:line="252" w:lineRule="auto"/>
               <w:jc w:val="left"/>
             </w:pPr>
@@ -2711,6 +2741,7 @@
           </w:tcPr>
           <w:p>
             <w:pPr>
+              <w:keepNext/>
               <w:spacing w:before="0" w:after="0" w:line="252" w:lineRule="auto"/>
               <w:jc w:val="left"/>
             </w:pPr>
@@ -2738,6 +2769,7 @@
           </w:tcPr>
           <w:p>
             <w:pPr>
+              <w:keepNext/>
               <w:spacing w:before="0" w:after="0" w:line="252" w:lineRule="auto"/>
               <w:jc w:val="left"/>
             </w:pPr>
@@ -2765,6 +2797,7 @@
           </w:tcPr>
           <w:p>
             <w:pPr>
+              <w:keepNext/>
               <w:spacing w:before="0" w:after="0" w:line="252" w:lineRule="auto"/>
               <w:jc w:val="left"/>
             </w:pPr>
@@ -2797,6 +2830,7 @@
           </w:tcPr>
           <w:p>
             <w:pPr>
+              <w:keepNext w:val="0"/>
               <w:spacing w:before="0" w:after="0" w:line="252" w:lineRule="auto"/>
               <w:jc w:val="left"/>
             </w:pPr>
@@ -2824,6 +2858,7 @@
           </w:tcPr>
           <w:p>
             <w:pPr>
+              <w:keepNext w:val="0"/>
               <w:spacing w:before="0" w:after="0" w:line="252" w:lineRule="auto"/>
               <w:jc w:val="center"/>
             </w:pPr>
@@ -2851,6 +2886,7 @@
           </w:tcPr>
           <w:p>
             <w:pPr>
+              <w:keepNext w:val="0"/>
               <w:spacing w:before="0" w:after="0" w:line="252" w:lineRule="auto"/>
               <w:jc w:val="left"/>
             </w:pPr>
@@ -3978,6 +4014,7 @@
           </w:tcPr>
           <w:p>
             <w:pPr>
+              <w:keepNext/>
               <w:spacing w:before="0" w:after="0" w:line="252" w:lineRule="auto"/>
               <w:jc w:val="center"/>
             </w:pPr>
@@ -4005,6 +4042,7 @@
           </w:tcPr>
           <w:p>
             <w:pPr>
+              <w:keepNext/>
               <w:spacing w:before="0" w:after="0" w:line="252" w:lineRule="auto"/>
               <w:jc w:val="left"/>
             </w:pPr>
@@ -4032,6 +4070,7 @@
           </w:tcPr>
           <w:p>
             <w:pPr>
+              <w:keepNext/>
               <w:spacing w:before="0" w:after="0" w:line="252" w:lineRule="auto"/>
               <w:jc w:val="center"/>
             </w:pPr>
@@ -4059,6 +4098,7 @@
           </w:tcPr>
           <w:p>
             <w:pPr>
+              <w:keepNext/>
               <w:spacing w:before="0" w:after="0" w:line="252" w:lineRule="auto"/>
               <w:jc w:val="left"/>
             </w:pPr>
@@ -4091,6 +4131,7 @@
           </w:tcPr>
           <w:p>
             <w:pPr>
+              <w:keepNext/>
               <w:spacing w:before="0" w:after="0" w:line="252" w:lineRule="auto"/>
               <w:jc w:val="center"/>
             </w:pPr>
@@ -4118,6 +4159,7 @@
           </w:tcPr>
           <w:p>
             <w:pPr>
+              <w:keepNext/>
               <w:spacing w:before="0" w:after="0" w:line="252" w:lineRule="auto"/>
               <w:jc w:val="left"/>
             </w:pPr>
@@ -4145,6 +4187,7 @@
           </w:tcPr>
           <w:p>
             <w:pPr>
+              <w:keepNext/>
               <w:spacing w:before="0" w:after="0" w:line="252" w:lineRule="auto"/>
               <w:jc w:val="center"/>
             </w:pPr>
@@ -4172,6 +4215,7 @@
           </w:tcPr>
           <w:p>
             <w:pPr>
+              <w:keepNext/>
               <w:spacing w:before="0" w:after="0" w:line="252" w:lineRule="auto"/>
               <w:jc w:val="center"/>
             </w:pPr>
@@ -4204,6 +4248,7 @@
           </w:tcPr>
           <w:p>
             <w:pPr>
+              <w:keepNext/>
               <w:spacing w:before="0" w:after="0" w:line="252" w:lineRule="auto"/>
               <w:jc w:val="center"/>
             </w:pPr>
@@ -4231,6 +4276,7 @@
           </w:tcPr>
           <w:p>
             <w:pPr>
+              <w:keepNext/>
               <w:spacing w:before="0" w:after="0" w:line="252" w:lineRule="auto"/>
               <w:jc w:val="left"/>
             </w:pPr>
@@ -4258,6 +4304,7 @@
           </w:tcPr>
           <w:p>
             <w:pPr>
+              <w:keepNext/>
               <w:spacing w:before="0" w:after="0" w:line="252" w:lineRule="auto"/>
               <w:jc w:val="left"/>
             </w:pPr>
@@ -4285,6 +4332,7 @@
           </w:tcPr>
           <w:p>
             <w:pPr>
+              <w:keepNext/>
               <w:spacing w:before="0" w:after="0" w:line="252" w:lineRule="auto"/>
               <w:jc w:val="left"/>
             </w:pPr>
@@ -4317,6 +4365,7 @@
           </w:tcPr>
           <w:p>
             <w:pPr>
+              <w:keepNext w:val="0"/>
               <w:spacing w:before="0" w:after="0" w:line="252" w:lineRule="auto"/>
               <w:jc w:val="center"/>
             </w:pPr>
@@ -4344,6 +4393,7 @@
           </w:tcPr>
           <w:p>
             <w:pPr>
+              <w:keepNext w:val="0"/>
               <w:spacing w:before="0" w:after="0" w:line="252" w:lineRule="auto"/>
               <w:jc w:val="left"/>
             </w:pPr>
@@ -4371,6 +4421,7 @@
           </w:tcPr>
           <w:p>
             <w:pPr>
+              <w:keepNext w:val="0"/>
               <w:spacing w:before="0" w:after="0" w:line="252" w:lineRule="auto"/>
               <w:jc w:val="left"/>
             </w:pPr>
@@ -4398,6 +4449,7 @@
           </w:tcPr>
           <w:p>
             <w:pPr>
+              <w:keepNext w:val="0"/>
               <w:spacing w:before="0" w:after="0" w:line="252" w:lineRule="auto"/>
               <w:jc w:val="left"/>
             </w:pPr>
@@ -4726,6 +4778,7 @@
           </w:tcPr>
           <w:p>
             <w:pPr>
+              <w:keepNext/>
               <w:spacing w:before="0" w:after="0" w:line="252" w:lineRule="auto"/>
               <w:jc w:val="left"/>
             </w:pPr>
@@ -4753,6 +4806,7 @@
           </w:tcPr>
           <w:p>
             <w:pPr>
+              <w:keepNext/>
               <w:spacing w:before="0" w:after="0" w:line="252" w:lineRule="auto"/>
               <w:jc w:val="left"/>
             </w:pPr>
@@ -4780,6 +4834,7 @@
           </w:tcPr>
           <w:p>
             <w:pPr>
+              <w:keepNext/>
               <w:spacing w:before="0" w:after="0" w:line="252" w:lineRule="auto"/>
               <w:jc w:val="left"/>
             </w:pPr>
@@ -4807,6 +4862,7 @@
           </w:tcPr>
           <w:p>
             <w:pPr>
+              <w:keepNext/>
               <w:spacing w:before="0" w:after="0" w:line="252" w:lineRule="auto"/>
               <w:jc w:val="center"/>
             </w:pPr>
@@ -4839,6 +4895,7 @@
           </w:tcPr>
           <w:p>
             <w:pPr>
+              <w:keepNext/>
               <w:spacing w:before="0" w:after="0" w:line="252" w:lineRule="auto"/>
               <w:jc w:val="left"/>
             </w:pPr>
@@ -4866,6 +4923,7 @@
           </w:tcPr>
           <w:p>
             <w:pPr>
+              <w:keepNext/>
               <w:spacing w:before="0" w:after="0" w:line="252" w:lineRule="auto"/>
               <w:jc w:val="left"/>
             </w:pPr>
@@ -4893,6 +4951,7 @@
           </w:tcPr>
           <w:p>
             <w:pPr>
+              <w:keepNext/>
               <w:spacing w:before="0" w:after="0" w:line="252" w:lineRule="auto"/>
               <w:jc w:val="center"/>
             </w:pPr>
@@ -4920,6 +4979,7 @@
           </w:tcPr>
           <w:p>
             <w:pPr>
+              <w:keepNext/>
               <w:spacing w:before="0" w:after="0" w:line="252" w:lineRule="auto"/>
               <w:jc w:val="center"/>
             </w:pPr>
@@ -4952,6 +5012,7 @@
           </w:tcPr>
           <w:p>
             <w:pPr>
+              <w:keepNext/>
               <w:spacing w:before="0" w:after="0" w:line="252" w:lineRule="auto"/>
               <w:jc w:val="left"/>
             </w:pPr>
@@ -4979,6 +5040,7 @@
           </w:tcPr>
           <w:p>
             <w:pPr>
+              <w:keepNext/>
               <w:spacing w:before="0" w:after="0" w:line="252" w:lineRule="auto"/>
               <w:jc w:val="left"/>
             </w:pPr>
@@ -5006,6 +5068,7 @@
           </w:tcPr>
           <w:p>
             <w:pPr>
+              <w:keepNext/>
               <w:spacing w:before="0" w:after="0" w:line="252" w:lineRule="auto"/>
               <w:jc w:val="left"/>
             </w:pPr>
@@ -5033,6 +5096,7 @@
           </w:tcPr>
           <w:p>
             <w:pPr>
+              <w:keepNext/>
               <w:spacing w:before="0" w:after="0" w:line="252" w:lineRule="auto"/>
               <w:jc w:val="center"/>
             </w:pPr>
@@ -5065,6 +5129,7 @@
           </w:tcPr>
           <w:p>
             <w:pPr>
+              <w:keepNext/>
               <w:spacing w:before="0" w:after="0" w:line="252" w:lineRule="auto"/>
               <w:jc w:val="left"/>
             </w:pPr>
@@ -5092,6 +5157,7 @@
           </w:tcPr>
           <w:p>
             <w:pPr>
+              <w:keepNext/>
               <w:spacing w:before="0" w:after="0" w:line="252" w:lineRule="auto"/>
               <w:jc w:val="center"/>
             </w:pPr>
@@ -5119,6 +5185,7 @@
           </w:tcPr>
           <w:p>
             <w:pPr>
+              <w:keepNext/>
               <w:spacing w:before="0" w:after="0" w:line="252" w:lineRule="auto"/>
               <w:jc w:val="center"/>
             </w:pPr>
@@ -5146,6 +5213,7 @@
           </w:tcPr>
           <w:p>
             <w:pPr>
+              <w:keepNext/>
               <w:spacing w:before="0" w:after="0" w:line="252" w:lineRule="auto"/>
               <w:jc w:val="center"/>
             </w:pPr>
@@ -5178,6 +5246,7 @@
           </w:tcPr>
           <w:p>
             <w:pPr>
+              <w:keepNext/>
               <w:spacing w:before="0" w:after="0" w:line="252" w:lineRule="auto"/>
               <w:jc w:val="left"/>
             </w:pPr>
@@ -5205,6 +5274,7 @@
           </w:tcPr>
           <w:p>
             <w:pPr>
+              <w:keepNext/>
               <w:spacing w:before="0" w:after="0" w:line="252" w:lineRule="auto"/>
               <w:jc w:val="left"/>
             </w:pPr>
@@ -5232,6 +5302,7 @@
           </w:tcPr>
           <w:p>
             <w:pPr>
+              <w:keepNext/>
               <w:spacing w:before="0" w:after="0" w:line="252" w:lineRule="auto"/>
               <w:jc w:val="center"/>
             </w:pPr>
@@ -5259,6 +5330,7 @@
           </w:tcPr>
           <w:p>
             <w:pPr>
+              <w:keepNext/>
               <w:spacing w:before="0" w:after="0" w:line="252" w:lineRule="auto"/>
               <w:jc w:val="center"/>
             </w:pPr>
@@ -5291,6 +5363,7 @@
           </w:tcPr>
           <w:p>
             <w:pPr>
+              <w:keepNext/>
               <w:spacing w:before="0" w:after="0" w:line="252" w:lineRule="auto"/>
               <w:jc w:val="left"/>
             </w:pPr>
@@ -5318,6 +5391,7 @@
           </w:tcPr>
           <w:p>
             <w:pPr>
+              <w:keepNext/>
               <w:spacing w:before="0" w:after="0" w:line="252" w:lineRule="auto"/>
               <w:jc w:val="center"/>
             </w:pPr>
@@ -5345,6 +5419,7 @@
           </w:tcPr>
           <w:p>
             <w:pPr>
+              <w:keepNext/>
               <w:spacing w:before="0" w:after="0" w:line="252" w:lineRule="auto"/>
               <w:jc w:val="center"/>
             </w:pPr>
@@ -5372,6 +5447,7 @@
           </w:tcPr>
           <w:p>
             <w:pPr>
+              <w:keepNext/>
               <w:spacing w:before="0" w:after="0" w:line="252" w:lineRule="auto"/>
               <w:jc w:val="center"/>
             </w:pPr>
@@ -5404,6 +5480,7 @@
           </w:tcPr>
           <w:p>
             <w:pPr>
+              <w:keepNext/>
               <w:spacing w:before="0" w:after="0" w:line="252" w:lineRule="auto"/>
               <w:jc w:val="left"/>
             </w:pPr>
@@ -5431,6 +5508,7 @@
           </w:tcPr>
           <w:p>
             <w:pPr>
+              <w:keepNext/>
               <w:spacing w:before="0" w:after="0" w:line="252" w:lineRule="auto"/>
               <w:jc w:val="center"/>
             </w:pPr>
@@ -5458,6 +5536,7 @@
           </w:tcPr>
           <w:p>
             <w:pPr>
+              <w:keepNext/>
               <w:spacing w:before="0" w:after="0" w:line="252" w:lineRule="auto"/>
               <w:jc w:val="center"/>
             </w:pPr>
@@ -5485,6 +5564,7 @@
           </w:tcPr>
           <w:p>
             <w:pPr>
+              <w:keepNext/>
               <w:spacing w:before="0" w:after="0" w:line="252" w:lineRule="auto"/>
               <w:jc w:val="center"/>
             </w:pPr>
@@ -5517,6 +5597,7 @@
           </w:tcPr>
           <w:p>
             <w:pPr>
+              <w:keepNext w:val="0"/>
               <w:spacing w:before="0" w:after="0" w:line="252" w:lineRule="auto"/>
               <w:jc w:val="left"/>
             </w:pPr>
@@ -5544,6 +5625,7 @@
           </w:tcPr>
           <w:p>
             <w:pPr>
+              <w:keepNext w:val="0"/>
               <w:spacing w:before="0" w:after="0" w:line="252" w:lineRule="auto"/>
               <w:jc w:val="center"/>
             </w:pPr>
@@ -5571,6 +5653,7 @@
           </w:tcPr>
           <w:p>
             <w:pPr>
+              <w:keepNext w:val="0"/>
               <w:spacing w:before="0" w:after="0" w:line="252" w:lineRule="auto"/>
               <w:jc w:val="center"/>
             </w:pPr>
@@ -5598,6 +5681,7 @@
           </w:tcPr>
           <w:p>
             <w:pPr>
+              <w:keepNext w:val="0"/>
               <w:spacing w:before="0" w:after="0" w:line="252" w:lineRule="auto"/>
               <w:jc w:val="center"/>
             </w:pPr>
@@ -6649,6 +6733,7 @@
           </w:tcPr>
           <w:p>
             <w:pPr>
+              <w:keepNext/>
               <w:spacing w:before="0" w:after="0" w:line="252" w:lineRule="auto"/>
               <w:jc w:val="center"/>
             </w:pPr>
@@ -6676,6 +6761,7 @@
           </w:tcPr>
           <w:p>
             <w:pPr>
+              <w:keepNext/>
               <w:spacing w:before="0" w:after="0" w:line="252" w:lineRule="auto"/>
               <w:jc w:val="left"/>
             </w:pPr>
@@ -6703,6 +6789,7 @@
           </w:tcPr>
           <w:p>
             <w:pPr>
+              <w:keepNext/>
               <w:spacing w:before="0" w:after="0" w:line="252" w:lineRule="auto"/>
               <w:jc w:val="center"/>
             </w:pPr>
@@ -6730,6 +6817,7 @@
           </w:tcPr>
           <w:p>
             <w:pPr>
+              <w:keepNext/>
               <w:spacing w:before="0" w:after="0" w:line="252" w:lineRule="auto"/>
               <w:jc w:val="center"/>
             </w:pPr>
@@ -6757,6 +6845,7 @@
           </w:tcPr>
           <w:p>
             <w:pPr>
+              <w:keepNext/>
               <w:spacing w:before="0" w:after="0" w:line="252" w:lineRule="auto"/>
               <w:jc w:val="center"/>
             </w:pPr>
@@ -6789,6 +6878,7 @@
           </w:tcPr>
           <w:p>
             <w:pPr>
+              <w:keepNext/>
               <w:spacing w:before="0" w:after="0" w:line="252" w:lineRule="auto"/>
               <w:jc w:val="center"/>
             </w:pPr>
@@ -6816,6 +6906,7 @@
           </w:tcPr>
           <w:p>
             <w:pPr>
+              <w:keepNext/>
               <w:spacing w:before="0" w:after="0" w:line="252" w:lineRule="auto"/>
               <w:jc w:val="left"/>
             </w:pPr>
@@ -6843,6 +6934,7 @@
           </w:tcPr>
           <w:p>
             <w:pPr>
+              <w:keepNext/>
               <w:spacing w:before="0" w:after="0" w:line="252" w:lineRule="auto"/>
               <w:jc w:val="center"/>
             </w:pPr>
@@ -6870,6 +6962,7 @@
           </w:tcPr>
           <w:p>
             <w:pPr>
+              <w:keepNext/>
               <w:spacing w:before="0" w:after="0" w:line="252" w:lineRule="auto"/>
               <w:jc w:val="center"/>
             </w:pPr>
@@ -6897,6 +6990,7 @@
           </w:tcPr>
           <w:p>
             <w:pPr>
+              <w:keepNext/>
               <w:spacing w:before="0" w:after="0" w:line="252" w:lineRule="auto"/>
               <w:jc w:val="center"/>
             </w:pPr>
@@ -6929,6 +7023,7 @@
           </w:tcPr>
           <w:p>
             <w:pPr>
+              <w:keepNext/>
               <w:spacing w:before="0" w:after="0" w:line="252" w:lineRule="auto"/>
               <w:jc w:val="center"/>
             </w:pPr>
@@ -6956,6 +7051,7 @@
           </w:tcPr>
           <w:p>
             <w:pPr>
+              <w:keepNext/>
               <w:spacing w:before="0" w:after="0" w:line="252" w:lineRule="auto"/>
               <w:jc w:val="left"/>
             </w:pPr>
@@ -6983,6 +7079,7 @@
           </w:tcPr>
           <w:p>
             <w:pPr>
+              <w:keepNext/>
               <w:spacing w:before="0" w:after="0" w:line="252" w:lineRule="auto"/>
               <w:jc w:val="center"/>
             </w:pPr>
@@ -7010,6 +7107,7 @@
           </w:tcPr>
           <w:p>
             <w:pPr>
+              <w:keepNext/>
               <w:spacing w:before="0" w:after="0" w:line="252" w:lineRule="auto"/>
               <w:jc w:val="center"/>
             </w:pPr>
@@ -7037,6 +7135,7 @@
           </w:tcPr>
           <w:p>
             <w:pPr>
+              <w:keepNext/>
               <w:spacing w:before="0" w:after="0" w:line="252" w:lineRule="auto"/>
               <w:jc w:val="center"/>
             </w:pPr>
@@ -7069,6 +7168,7 @@
           </w:tcPr>
           <w:p>
             <w:pPr>
+              <w:keepNext w:val="0"/>
               <w:spacing w:before="0" w:after="0" w:line="252" w:lineRule="auto"/>
               <w:jc w:val="center"/>
             </w:pPr>
@@ -7096,6 +7196,7 @@
           </w:tcPr>
           <w:p>
             <w:pPr>
+              <w:keepNext w:val="0"/>
               <w:spacing w:before="0" w:after="0" w:line="252" w:lineRule="auto"/>
               <w:jc w:val="left"/>
             </w:pPr>
@@ -7123,6 +7224,7 @@
           </w:tcPr>
           <w:p>
             <w:pPr>
+              <w:keepNext w:val="0"/>
               <w:spacing w:before="0" w:after="0" w:line="252" w:lineRule="auto"/>
               <w:jc w:val="center"/>
             </w:pPr>
@@ -7150,6 +7252,7 @@
           </w:tcPr>
           <w:p>
             <w:pPr>
+              <w:keepNext w:val="0"/>
               <w:spacing w:before="0" w:after="0" w:line="252" w:lineRule="auto"/>
               <w:jc w:val="center"/>
             </w:pPr>
@@ -7177,6 +7280,7 @@
           </w:tcPr>
           <w:p>
             <w:pPr>
+              <w:keepNext w:val="0"/>
               <w:spacing w:before="0" w:after="0" w:line="252" w:lineRule="auto"/>
               <w:jc w:val="center"/>
             </w:pPr>
@@ -8708,6 +8812,7 @@
           </w:tcPr>
           <w:p>
             <w:pPr>
+              <w:keepNext/>
               <w:spacing w:before="0" w:after="0" w:line="252" w:lineRule="auto"/>
               <w:jc w:val="center"/>
             </w:pPr>
@@ -8735,6 +8840,7 @@
           </w:tcPr>
           <w:p>
             <w:pPr>
+              <w:keepNext/>
               <w:spacing w:before="0" w:after="0" w:line="252" w:lineRule="auto"/>
               <w:jc w:val="center"/>
             </w:pPr>
@@ -8762,6 +8868,7 @@
           </w:tcPr>
           <w:p>
             <w:pPr>
+              <w:keepNext/>
               <w:spacing w:before="0" w:after="0" w:line="252" w:lineRule="auto"/>
               <w:jc w:val="center"/>
             </w:pPr>
@@ -8789,6 +8896,7 @@
           </w:tcPr>
           <w:p>
             <w:pPr>
+              <w:keepNext/>
               <w:spacing w:before="0" w:after="0" w:line="252" w:lineRule="auto"/>
               <w:jc w:val="center"/>
             </w:pPr>
@@ -8821,6 +8929,7 @@
           </w:tcPr>
           <w:p>
             <w:pPr>
+              <w:keepNext/>
               <w:spacing w:before="0" w:after="0" w:line="252" w:lineRule="auto"/>
               <w:jc w:val="center"/>
             </w:pPr>
@@ -8848,6 +8957,7 @@
           </w:tcPr>
           <w:p>
             <w:pPr>
+              <w:keepNext/>
               <w:spacing w:before="0" w:after="0" w:line="252" w:lineRule="auto"/>
               <w:jc w:val="center"/>
             </w:pPr>
@@ -8875,6 +8985,7 @@
           </w:tcPr>
           <w:p>
             <w:pPr>
+              <w:keepNext/>
               <w:spacing w:before="0" w:after="0" w:line="252" w:lineRule="auto"/>
               <w:jc w:val="center"/>
             </w:pPr>
@@ -8902,6 +9013,7 @@
           </w:tcPr>
           <w:p>
             <w:pPr>
+              <w:keepNext/>
               <w:spacing w:before="0" w:after="0" w:line="252" w:lineRule="auto"/>
               <w:jc w:val="center"/>
             </w:pPr>
@@ -8934,6 +9046,7 @@
           </w:tcPr>
           <w:p>
             <w:pPr>
+              <w:keepNext/>
               <w:spacing w:before="0" w:after="0" w:line="252" w:lineRule="auto"/>
               <w:jc w:val="center"/>
             </w:pPr>
@@ -8961,6 +9074,7 @@
           </w:tcPr>
           <w:p>
             <w:pPr>
+              <w:keepNext/>
               <w:spacing w:before="0" w:after="0" w:line="252" w:lineRule="auto"/>
               <w:jc w:val="center"/>
             </w:pPr>
@@ -8988,6 +9102,7 @@
           </w:tcPr>
           <w:p>
             <w:pPr>
+              <w:keepNext/>
               <w:spacing w:before="0" w:after="0" w:line="252" w:lineRule="auto"/>
               <w:jc w:val="center"/>
             </w:pPr>
@@ -9015,6 +9130,7 @@
           </w:tcPr>
           <w:p>
             <w:pPr>
+              <w:keepNext/>
               <w:spacing w:before="0" w:after="0" w:line="252" w:lineRule="auto"/>
               <w:jc w:val="left"/>
             </w:pPr>
@@ -9056,6 +9172,7 @@
           </w:tcPr>
           <w:p>
             <w:pPr>
+              <w:keepNext/>
               <w:spacing w:before="0" w:after="0" w:line="252" w:lineRule="auto"/>
               <w:jc w:val="center"/>
             </w:pPr>
@@ -9083,6 +9200,7 @@
           </w:tcPr>
           <w:p>
             <w:pPr>
+              <w:keepNext/>
               <w:spacing w:before="0" w:after="0" w:line="252" w:lineRule="auto"/>
               <w:jc w:val="center"/>
             </w:pPr>
@@ -9110,6 +9228,7 @@
           </w:tcPr>
           <w:p>
             <w:pPr>
+              <w:keepNext/>
               <w:spacing w:before="0" w:after="0" w:line="252" w:lineRule="auto"/>
               <w:jc w:val="center"/>
             </w:pPr>
@@ -9137,6 +9256,7 @@
           </w:tcPr>
           <w:p>
             <w:pPr>
+              <w:keepNext/>
               <w:spacing w:before="0" w:after="0" w:line="252" w:lineRule="auto"/>
               <w:jc w:val="center"/>
             </w:pPr>
@@ -9169,6 +9289,7 @@
           </w:tcPr>
           <w:p>
             <w:pPr>
+              <w:keepNext/>
               <w:spacing w:before="0" w:after="0" w:line="252" w:lineRule="auto"/>
               <w:jc w:val="center"/>
             </w:pPr>
@@ -9196,6 +9317,7 @@
           </w:tcPr>
           <w:p>
             <w:pPr>
+              <w:keepNext/>
               <w:spacing w:before="0" w:after="0" w:line="252" w:lineRule="auto"/>
               <w:jc w:val="center"/>
             </w:pPr>
@@ -9223,6 +9345,7 @@
           </w:tcPr>
           <w:p>
             <w:pPr>
+              <w:keepNext/>
               <w:spacing w:before="0" w:after="0" w:line="252" w:lineRule="auto"/>
               <w:jc w:val="center"/>
             </w:pPr>
@@ -9250,6 +9373,7 @@
           </w:tcPr>
           <w:p>
             <w:pPr>
+              <w:keepNext/>
               <w:spacing w:before="0" w:after="0" w:line="252" w:lineRule="auto"/>
               <w:jc w:val="left"/>
             </w:pPr>
@@ -9282,6 +9406,7 @@
           </w:tcPr>
           <w:p>
             <w:pPr>
+              <w:keepNext w:val="0"/>
               <w:spacing w:before="0" w:after="0" w:line="252" w:lineRule="auto"/>
               <w:jc w:val="center"/>
             </w:pPr>
@@ -9309,6 +9434,7 @@
           </w:tcPr>
           <w:p>
             <w:pPr>
+              <w:keepNext w:val="0"/>
               <w:spacing w:before="0" w:after="0" w:line="252" w:lineRule="auto"/>
               <w:jc w:val="center"/>
             </w:pPr>
@@ -9336,6 +9462,7 @@
           </w:tcPr>
           <w:p>
             <w:pPr>
+              <w:keepNext w:val="0"/>
               <w:spacing w:before="0" w:after="0" w:line="252" w:lineRule="auto"/>
               <w:jc w:val="center"/>
             </w:pPr>
@@ -9363,6 +9490,7 @@
           </w:tcPr>
           <w:p>
             <w:pPr>
+              <w:keepNext w:val="0"/>
               <w:spacing w:before="0" w:after="0" w:line="252" w:lineRule="auto"/>
               <w:jc w:val="left"/>
             </w:pPr>
@@ -10170,6 +10298,7 @@
           </w:tcPr>
           <w:p>
             <w:pPr>
+              <w:keepNext/>
               <w:spacing w:before="0" w:after="0" w:line="252" w:lineRule="auto"/>
               <w:jc w:val="center"/>
             </w:pPr>
@@ -10197,6 +10326,7 @@
           </w:tcPr>
           <w:p>
             <w:pPr>
+              <w:keepNext/>
               <w:spacing w:before="0" w:after="0" w:line="252" w:lineRule="auto"/>
               <w:jc w:val="left"/>
             </w:pPr>
@@ -10224,6 +10354,7 @@
           </w:tcPr>
           <w:p>
             <w:pPr>
+              <w:keepNext/>
               <w:spacing w:before="0" w:after="0" w:line="252" w:lineRule="auto"/>
               <w:jc w:val="left"/>
             </w:pPr>
@@ -10251,6 +10382,7 @@
           </w:tcPr>
           <w:p>
             <w:pPr>
+              <w:keepNext/>
               <w:spacing w:before="0" w:after="0" w:line="252" w:lineRule="auto"/>
               <w:jc w:val="left"/>
             </w:pPr>
@@ -10283,6 +10415,7 @@
           </w:tcPr>
           <w:p>
             <w:pPr>
+              <w:keepNext/>
               <w:spacing w:before="0" w:after="0" w:line="252" w:lineRule="auto"/>
               <w:jc w:val="left"/>
             </w:pPr>
@@ -10310,6 +10443,7 @@
           </w:tcPr>
           <w:p>
             <w:pPr>
+              <w:keepNext/>
               <w:spacing w:before="0" w:after="0" w:line="252" w:lineRule="auto"/>
               <w:jc w:val="left"/>
             </w:pPr>
@@ -10337,6 +10471,7 @@
           </w:tcPr>
           <w:p>
             <w:pPr>
+              <w:keepNext/>
               <w:spacing w:before="0" w:after="0" w:line="252" w:lineRule="auto"/>
               <w:jc w:val="left"/>
             </w:pPr>
@@ -10364,6 +10499,7 @@
           </w:tcPr>
           <w:p>
             <w:pPr>
+              <w:keepNext/>
               <w:spacing w:before="0" w:after="0" w:line="252" w:lineRule="auto"/>
               <w:jc w:val="left"/>
             </w:pPr>
@@ -10396,6 +10532,7 @@
           </w:tcPr>
           <w:p>
             <w:pPr>
+              <w:keepNext/>
               <w:spacing w:before="0" w:after="0" w:line="252" w:lineRule="auto"/>
               <w:jc w:val="left"/>
             </w:pPr>
@@ -10423,6 +10560,7 @@
           </w:tcPr>
           <w:p>
             <w:pPr>
+              <w:keepNext/>
               <w:spacing w:before="0" w:after="0" w:line="252" w:lineRule="auto"/>
               <w:jc w:val="left"/>
             </w:pPr>
@@ -10450,6 +10588,7 @@
           </w:tcPr>
           <w:p>
             <w:pPr>
+              <w:keepNext/>
               <w:spacing w:before="0" w:after="0" w:line="252" w:lineRule="auto"/>
               <w:jc w:val="left"/>
             </w:pPr>
@@ -10477,6 +10616,7 @@
           </w:tcPr>
           <w:p>
             <w:pPr>
+              <w:keepNext/>
               <w:spacing w:before="0" w:after="0" w:line="252" w:lineRule="auto"/>
               <w:jc w:val="left"/>
             </w:pPr>
@@ -10509,6 +10649,7 @@
           </w:tcPr>
           <w:p>
             <w:pPr>
+              <w:keepNext/>
               <w:spacing w:before="0" w:after="0" w:line="252" w:lineRule="auto"/>
               <w:jc w:val="left"/>
             </w:pPr>
@@ -10536,6 +10677,7 @@
           </w:tcPr>
           <w:p>
             <w:pPr>
+              <w:keepNext/>
               <w:spacing w:before="0" w:after="0" w:line="252" w:lineRule="auto"/>
               <w:jc w:val="left"/>
             </w:pPr>
@@ -10563,6 +10705,7 @@
           </w:tcPr>
           <w:p>
             <w:pPr>
+              <w:keepNext/>
               <w:spacing w:before="0" w:after="0" w:line="252" w:lineRule="auto"/>
               <w:jc w:val="left"/>
             </w:pPr>
@@ -10590,6 +10733,7 @@
           </w:tcPr>
           <w:p>
             <w:pPr>
+              <w:keepNext/>
               <w:spacing w:before="0" w:after="0" w:line="252" w:lineRule="auto"/>
               <w:jc w:val="left"/>
             </w:pPr>
@@ -10631,6 +10775,7 @@
           </w:tcPr>
           <w:p>
             <w:pPr>
+              <w:keepNext/>
               <w:spacing w:before="0" w:after="0" w:line="252" w:lineRule="auto"/>
               <w:jc w:val="center"/>
             </w:pPr>
@@ -10658,6 +10803,7 @@
           </w:tcPr>
           <w:p>
             <w:pPr>
+              <w:keepNext/>
               <w:spacing w:before="0" w:after="0" w:line="252" w:lineRule="auto"/>
               <w:jc w:val="left"/>
             </w:pPr>
@@ -10685,6 +10831,7 @@
           </w:tcPr>
           <w:p>
             <w:pPr>
+              <w:keepNext/>
               <w:spacing w:before="0" w:after="0" w:line="252" w:lineRule="auto"/>
               <w:jc w:val="left"/>
             </w:pPr>
@@ -10712,6 +10859,7 @@
           </w:tcPr>
           <w:p>
             <w:pPr>
+              <w:keepNext/>
               <w:spacing w:before="0" w:after="0" w:line="252" w:lineRule="auto"/>
               <w:jc w:val="left"/>
             </w:pPr>
@@ -10744,6 +10892,7 @@
           </w:tcPr>
           <w:p>
             <w:pPr>
+              <w:keepNext w:val="0"/>
               <w:spacing w:before="0" w:after="0" w:line="252" w:lineRule="auto"/>
               <w:jc w:val="center"/>
             </w:pPr>
@@ -10771,6 +10920,7 @@
           </w:tcPr>
           <w:p>
             <w:pPr>
+              <w:keepNext w:val="0"/>
               <w:spacing w:before="0" w:after="0" w:line="252" w:lineRule="auto"/>
               <w:jc w:val="left"/>
             </w:pPr>
@@ -10798,6 +10948,7 @@
           </w:tcPr>
           <w:p>
             <w:pPr>
+              <w:keepNext w:val="0"/>
               <w:spacing w:before="0" w:after="0" w:line="252" w:lineRule="auto"/>
               <w:jc w:val="left"/>
             </w:pPr>
@@ -10825,6 +10976,7 @@
           </w:tcPr>
           <w:p>
             <w:pPr>
+              <w:keepNext w:val="0"/>
               <w:spacing w:before="0" w:after="0" w:line="252" w:lineRule="auto"/>
               <w:jc w:val="left"/>
             </w:pPr>
@@ -11053,6 +11205,7 @@
           </w:tcPr>
           <w:p>
             <w:pPr>
+              <w:keepNext/>
               <w:spacing w:before="0" w:after="0" w:line="252" w:lineRule="auto"/>
               <w:jc w:val="center"/>
             </w:pPr>
@@ -11080,6 +11233,7 @@
           </w:tcPr>
           <w:p>
             <w:pPr>
+              <w:keepNext/>
               <w:spacing w:before="0" w:after="0" w:line="252" w:lineRule="auto"/>
               <w:jc w:val="left"/>
             </w:pPr>
@@ -11107,6 +11261,7 @@
           </w:tcPr>
           <w:p>
             <w:pPr>
+              <w:keepNext/>
               <w:spacing w:before="0" w:after="0" w:line="252" w:lineRule="auto"/>
               <w:jc w:val="left"/>
             </w:pPr>
@@ -11139,6 +11294,7 @@
           </w:tcPr>
           <w:p>
             <w:pPr>
+              <w:keepNext/>
               <w:spacing w:before="0" w:after="0" w:line="252" w:lineRule="auto"/>
               <w:jc w:val="center"/>
             </w:pPr>
@@ -11166,6 +11322,7 @@
           </w:tcPr>
           <w:p>
             <w:pPr>
+              <w:keepNext/>
               <w:spacing w:before="0" w:after="0" w:line="252" w:lineRule="auto"/>
               <w:jc w:val="left"/>
             </w:pPr>
@@ -11193,6 +11350,7 @@
           </w:tcPr>
           <w:p>
             <w:pPr>
+              <w:keepNext/>
               <w:spacing w:before="0" w:after="0" w:line="252" w:lineRule="auto"/>
               <w:jc w:val="left"/>
             </w:pPr>
@@ -11225,6 +11383,7 @@
           </w:tcPr>
           <w:p>
             <w:pPr>
+              <w:keepNext w:val="0"/>
               <w:spacing w:before="0" w:after="0" w:line="252" w:lineRule="auto"/>
               <w:jc w:val="center"/>
             </w:pPr>
@@ -11252,6 +11411,7 @@
           </w:tcPr>
           <w:p>
             <w:pPr>
+              <w:keepNext w:val="0"/>
               <w:spacing w:before="0" w:after="0" w:line="252" w:lineRule="auto"/>
               <w:jc w:val="left"/>
             </w:pPr>
@@ -11279,6 +11439,7 @@
           </w:tcPr>
           <w:p>
             <w:pPr>
+              <w:keepNext w:val="0"/>
               <w:spacing w:before="0" w:after="0" w:line="252" w:lineRule="auto"/>
               <w:jc w:val="left"/>
             </w:pPr>
@@ -11829,6 +11990,7 @@
           </w:tcPr>
           <w:p>
             <w:pPr>
+              <w:keepNext/>
               <w:spacing w:before="0" w:after="0" w:line="252" w:lineRule="auto"/>
               <w:jc w:val="center"/>
             </w:pPr>
@@ -11856,6 +12018,7 @@
           </w:tcPr>
           <w:p>
             <w:pPr>
+              <w:keepNext/>
               <w:spacing w:before="0" w:after="0" w:line="252" w:lineRule="auto"/>
               <w:jc w:val="center"/>
             </w:pPr>
@@ -11883,6 +12046,7 @@
           </w:tcPr>
           <w:p>
             <w:pPr>
+              <w:keepNext/>
               <w:spacing w:before="0" w:after="0" w:line="252" w:lineRule="auto"/>
               <w:jc w:val="center"/>
             </w:pPr>
@@ -11910,6 +12074,7 @@
           </w:tcPr>
           <w:p>
             <w:pPr>
+              <w:keepNext/>
               <w:spacing w:before="0" w:after="0" w:line="252" w:lineRule="auto"/>
               <w:jc w:val="left"/>
             </w:pPr>
@@ -11942,6 +12107,7 @@
           </w:tcPr>
           <w:p>
             <w:pPr>
+              <w:keepNext/>
               <w:spacing w:before="0" w:after="0" w:line="252" w:lineRule="auto"/>
               <w:jc w:val="center"/>
             </w:pPr>
@@ -11969,6 +12135,7 @@
           </w:tcPr>
           <w:p>
             <w:pPr>
+              <w:keepNext/>
               <w:spacing w:before="0" w:after="0" w:line="252" w:lineRule="auto"/>
               <w:jc w:val="center"/>
             </w:pPr>
@@ -11996,6 +12163,7 @@
           </w:tcPr>
           <w:p>
             <w:pPr>
+              <w:keepNext/>
               <w:spacing w:before="0" w:after="0" w:line="252" w:lineRule="auto"/>
               <w:jc w:val="left"/>
             </w:pPr>
@@ -12023,6 +12191,7 @@
           </w:tcPr>
           <w:p>
             <w:pPr>
+              <w:keepNext/>
               <w:spacing w:before="0" w:after="0" w:line="252" w:lineRule="auto"/>
               <w:jc w:val="left"/>
             </w:pPr>
@@ -12055,6 +12224,7 @@
           </w:tcPr>
           <w:p>
             <w:pPr>
+              <w:keepNext/>
               <w:spacing w:before="0" w:after="0" w:line="252" w:lineRule="auto"/>
               <w:jc w:val="center"/>
             </w:pPr>
@@ -12082,6 +12252,7 @@
           </w:tcPr>
           <w:p>
             <w:pPr>
+              <w:keepNext/>
               <w:spacing w:before="0" w:after="0" w:line="252" w:lineRule="auto"/>
               <w:jc w:val="left"/>
             </w:pPr>
@@ -12109,6 +12280,7 @@
           </w:tcPr>
           <w:p>
             <w:pPr>
+              <w:keepNext/>
               <w:spacing w:before="0" w:after="0" w:line="252" w:lineRule="auto"/>
               <w:jc w:val="left"/>
             </w:pPr>
@@ -12136,6 +12308,7 @@
           </w:tcPr>
           <w:p>
             <w:pPr>
+              <w:keepNext/>
               <w:spacing w:before="0" w:after="0" w:line="252" w:lineRule="auto"/>
               <w:jc w:val="left"/>
             </w:pPr>
@@ -12168,6 +12341,7 @@
           </w:tcPr>
           <w:p>
             <w:pPr>
+              <w:keepNext/>
               <w:spacing w:before="0" w:after="0" w:line="252" w:lineRule="auto"/>
               <w:jc w:val="center"/>
             </w:pPr>
@@ -12195,6 +12369,7 @@
           </w:tcPr>
           <w:p>
             <w:pPr>
+              <w:keepNext/>
               <w:spacing w:before="0" w:after="0" w:line="252" w:lineRule="auto"/>
               <w:jc w:val="left"/>
             </w:pPr>
@@ -12222,6 +12397,7 @@
           </w:tcPr>
           <w:p>
             <w:pPr>
+              <w:keepNext/>
               <w:spacing w:before="0" w:after="0" w:line="252" w:lineRule="auto"/>
               <w:jc w:val="left"/>
             </w:pPr>
@@ -12249,6 +12425,7 @@
           </w:tcPr>
           <w:p>
             <w:pPr>
+              <w:keepNext/>
               <w:spacing w:before="0" w:after="0" w:line="252" w:lineRule="auto"/>
               <w:jc w:val="left"/>
             </w:pPr>
@@ -12281,6 +12458,7 @@
           </w:tcPr>
           <w:p>
             <w:pPr>
+              <w:keepNext/>
               <w:spacing w:before="0" w:after="0" w:line="252" w:lineRule="auto"/>
               <w:jc w:val="center"/>
             </w:pPr>
@@ -12308,6 +12486,7 @@
           </w:tcPr>
           <w:p>
             <w:pPr>
+              <w:keepNext/>
               <w:spacing w:before="0" w:after="0" w:line="252" w:lineRule="auto"/>
               <w:jc w:val="left"/>
             </w:pPr>
@@ -12335,6 +12514,7 @@
           </w:tcPr>
           <w:p>
             <w:pPr>
+              <w:keepNext/>
               <w:spacing w:before="0" w:after="0" w:line="252" w:lineRule="auto"/>
               <w:jc w:val="left"/>
             </w:pPr>
@@ -12362,6 +12542,7 @@
           </w:tcPr>
           <w:p>
             <w:pPr>
+              <w:keepNext/>
               <w:spacing w:before="0" w:after="0" w:line="252" w:lineRule="auto"/>
               <w:jc w:val="left"/>
             </w:pPr>
@@ -12403,6 +12584,7 @@
           </w:tcPr>
           <w:p>
             <w:pPr>
+              <w:keepNext w:val="0"/>
               <w:spacing w:before="0" w:after="0" w:line="252" w:lineRule="auto"/>
               <w:jc w:val="center"/>
             </w:pPr>
@@ -12430,6 +12612,7 @@
           </w:tcPr>
           <w:p>
             <w:pPr>
+              <w:keepNext w:val="0"/>
               <w:spacing w:before="0" w:after="0" w:line="252" w:lineRule="auto"/>
               <w:jc w:val="left"/>
             </w:pPr>
@@ -12457,6 +12640,7 @@
           </w:tcPr>
           <w:p>
             <w:pPr>
+              <w:keepNext w:val="0"/>
               <w:spacing w:before="0" w:after="0" w:line="252" w:lineRule="auto"/>
               <w:jc w:val="left"/>
             </w:pPr>
@@ -12484,6 +12668,7 @@
           </w:tcPr>
           <w:p>
             <w:pPr>
+              <w:keepNext w:val="0"/>
               <w:spacing w:before="0" w:after="0" w:line="252" w:lineRule="auto"/>
               <w:jc w:val="left"/>
             </w:pPr>
@@ -12677,6 +12862,7 @@
           </w:tcPr>
           <w:p>
             <w:pPr>
+              <w:keepNext/>
               <w:spacing w:before="0" w:after="0" w:line="252" w:lineRule="auto"/>
               <w:jc w:val="center"/>
             </w:pPr>
@@ -12704,6 +12890,7 @@
           </w:tcPr>
           <w:p>
             <w:pPr>
+              <w:keepNext/>
               <w:spacing w:before="0" w:after="0" w:line="252" w:lineRule="auto"/>
               <w:jc w:val="left"/>
             </w:pPr>
@@ -12731,6 +12918,7 @@
           </w:tcPr>
           <w:p>
             <w:pPr>
+              <w:keepNext/>
               <w:spacing w:before="0" w:after="0" w:line="252" w:lineRule="auto"/>
               <w:jc w:val="center"/>
             </w:pPr>
@@ -12758,6 +12946,7 @@
           </w:tcPr>
           <w:p>
             <w:pPr>
+              <w:keepNext/>
               <w:spacing w:before="0" w:after="0" w:line="252" w:lineRule="auto"/>
               <w:jc w:val="left"/>
             </w:pPr>
@@ -12790,6 +12979,7 @@
           </w:tcPr>
           <w:p>
             <w:pPr>
+              <w:keepNext/>
               <w:spacing w:before="0" w:after="0" w:line="252" w:lineRule="auto"/>
               <w:jc w:val="center"/>
             </w:pPr>
@@ -12817,6 +13007,7 @@
           </w:tcPr>
           <w:p>
             <w:pPr>
+              <w:keepNext/>
               <w:spacing w:before="0" w:after="0" w:line="252" w:lineRule="auto"/>
               <w:jc w:val="left"/>
             </w:pPr>
@@ -12844,6 +13035,7 @@
           </w:tcPr>
           <w:p>
             <w:pPr>
+              <w:keepNext/>
               <w:spacing w:before="0" w:after="0" w:line="252" w:lineRule="auto"/>
               <w:jc w:val="center"/>
             </w:pPr>
@@ -12871,6 +13063,7 @@
           </w:tcPr>
           <w:p>
             <w:pPr>
+              <w:keepNext/>
               <w:spacing w:before="0" w:after="0" w:line="252" w:lineRule="auto"/>
               <w:jc w:val="left"/>
             </w:pPr>
@@ -12903,6 +13096,7 @@
           </w:tcPr>
           <w:p>
             <w:pPr>
+              <w:keepNext/>
               <w:spacing w:before="0" w:after="0" w:line="252" w:lineRule="auto"/>
               <w:jc w:val="center"/>
             </w:pPr>
@@ -12930,6 +13124,7 @@
           </w:tcPr>
           <w:p>
             <w:pPr>
+              <w:keepNext/>
               <w:spacing w:before="0" w:after="0" w:line="252" w:lineRule="auto"/>
               <w:jc w:val="left"/>
             </w:pPr>
@@ -12957,6 +13152,7 @@
           </w:tcPr>
           <w:p>
             <w:pPr>
+              <w:keepNext/>
               <w:spacing w:before="0" w:after="0" w:line="252" w:lineRule="auto"/>
               <w:jc w:val="left"/>
             </w:pPr>
@@ -12984,6 +13180,7 @@
           </w:tcPr>
           <w:p>
             <w:pPr>
+              <w:keepNext/>
               <w:spacing w:before="0" w:after="0" w:line="252" w:lineRule="auto"/>
               <w:jc w:val="left"/>
             </w:pPr>
@@ -13016,6 +13213,7 @@
           </w:tcPr>
           <w:p>
             <w:pPr>
+              <w:keepNext/>
               <w:spacing w:before="0" w:after="0" w:line="252" w:lineRule="auto"/>
               <w:jc w:val="center"/>
             </w:pPr>
@@ -13043,6 +13241,7 @@
           </w:tcPr>
           <w:p>
             <w:pPr>
+              <w:keepNext/>
               <w:spacing w:before="0" w:after="0" w:line="252" w:lineRule="auto"/>
               <w:jc w:val="left"/>
             </w:pPr>
@@ -13070,6 +13269,7 @@
           </w:tcPr>
           <w:p>
             <w:pPr>
+              <w:keepNext/>
               <w:spacing w:before="0" w:after="0" w:line="252" w:lineRule="auto"/>
               <w:jc w:val="left"/>
             </w:pPr>
@@ -13097,6 +13297,7 @@
           </w:tcPr>
           <w:p>
             <w:pPr>
+              <w:keepNext/>
               <w:spacing w:before="0" w:after="0" w:line="252" w:lineRule="auto"/>
               <w:jc w:val="left"/>
             </w:pPr>
@@ -13129,6 +13330,7 @@
           </w:tcPr>
           <w:p>
             <w:pPr>
+              <w:keepNext/>
               <w:spacing w:before="0" w:after="0" w:line="252" w:lineRule="auto"/>
               <w:jc w:val="center"/>
             </w:pPr>
@@ -13156,6 +13358,7 @@
           </w:tcPr>
           <w:p>
             <w:pPr>
+              <w:keepNext/>
               <w:spacing w:before="0" w:after="0" w:line="252" w:lineRule="auto"/>
               <w:jc w:val="left"/>
             </w:pPr>
@@ -13183,6 +13386,7 @@
           </w:tcPr>
           <w:p>
             <w:pPr>
+              <w:keepNext/>
               <w:spacing w:before="0" w:after="0" w:line="252" w:lineRule="auto"/>
               <w:jc w:val="center"/>
             </w:pPr>
@@ -13210,6 +13414,7 @@
           </w:tcPr>
           <w:p>
             <w:pPr>
+              <w:keepNext/>
               <w:spacing w:before="0" w:after="0" w:line="252" w:lineRule="auto"/>
               <w:jc w:val="left"/>
             </w:pPr>
@@ -13242,6 +13447,7 @@
           </w:tcPr>
           <w:p>
             <w:pPr>
+              <w:keepNext w:val="0"/>
               <w:spacing w:before="0" w:after="0" w:line="252" w:lineRule="auto"/>
               <w:jc w:val="center"/>
             </w:pPr>
@@ -13269,6 +13475,7 @@
           </w:tcPr>
           <w:p>
             <w:pPr>
+              <w:keepNext w:val="0"/>
               <w:spacing w:before="0" w:after="0" w:line="252" w:lineRule="auto"/>
               <w:jc w:val="left"/>
             </w:pPr>
@@ -13296,6 +13503,7 @@
           </w:tcPr>
           <w:p>
             <w:pPr>
+              <w:keepNext w:val="0"/>
               <w:spacing w:before="0" w:after="0" w:line="252" w:lineRule="auto"/>
               <w:jc w:val="left"/>
             </w:pPr>
@@ -13323,6 +13531,7 @@
           </w:tcPr>
           <w:p>
             <w:pPr>
+              <w:keepNext w:val="0"/>
               <w:spacing w:before="0" w:after="0" w:line="252" w:lineRule="auto"/>
               <w:jc w:val="left"/>
             </w:pPr>
@@ -14214,6 +14423,7 @@
           </w:tcPr>
           <w:p>
             <w:pPr>
+              <w:keepNext/>
               <w:spacing w:before="0" w:after="0" w:line="252" w:lineRule="auto"/>
               <w:jc w:val="center"/>
             </w:pPr>
@@ -14241,6 +14451,7 @@
           </w:tcPr>
           <w:p>
             <w:pPr>
+              <w:keepNext/>
               <w:spacing w:before="0" w:after="0" w:line="252" w:lineRule="auto"/>
               <w:jc w:val="left"/>
             </w:pPr>
@@ -14273,6 +14484,7 @@
           </w:tcPr>
           <w:p>
             <w:pPr>
+              <w:keepNext/>
               <w:spacing w:before="0" w:after="0" w:line="252" w:lineRule="auto"/>
               <w:jc w:val="center"/>
             </w:pPr>
@@ -14300,6 +14512,7 @@
           </w:tcPr>
           <w:p>
             <w:pPr>
+              <w:keepNext/>
               <w:spacing w:before="0" w:after="0" w:line="252" w:lineRule="auto"/>
               <w:jc w:val="left"/>
             </w:pPr>
@@ -14332,6 +14545,7 @@
           </w:tcPr>
           <w:p>
             <w:pPr>
+              <w:keepNext/>
               <w:spacing w:before="0" w:after="0" w:line="252" w:lineRule="auto"/>
               <w:jc w:val="center"/>
             </w:pPr>
@@ -14359,6 +14573,7 @@
           </w:tcPr>
           <w:p>
             <w:pPr>
+              <w:keepNext/>
               <w:spacing w:before="0" w:after="0" w:line="252" w:lineRule="auto"/>
               <w:jc w:val="left"/>
             </w:pPr>
@@ -14391,6 +14606,7 @@
           </w:tcPr>
           <w:p>
             <w:pPr>
+              <w:keepNext/>
               <w:spacing w:before="0" w:after="0" w:line="252" w:lineRule="auto"/>
               <w:jc w:val="left"/>
             </w:pPr>
@@ -14418,6 +14634,7 @@
           </w:tcPr>
           <w:p>
             <w:pPr>
+              <w:keepNext/>
               <w:spacing w:before="0" w:after="0" w:line="252" w:lineRule="auto"/>
               <w:jc w:val="left"/>
             </w:pPr>
@@ -14450,6 +14667,7 @@
           </w:tcPr>
           <w:p>
             <w:pPr>
+              <w:keepNext/>
               <w:spacing w:before="0" w:after="0" w:line="252" w:lineRule="auto"/>
               <w:jc w:val="left"/>
             </w:pPr>
@@ -14477,6 +14695,7 @@
           </w:tcPr>
           <w:p>
             <w:pPr>
+              <w:keepNext/>
               <w:spacing w:before="0" w:after="0" w:line="252" w:lineRule="auto"/>
               <w:jc w:val="left"/>
             </w:pPr>
@@ -14509,6 +14728,7 @@
           </w:tcPr>
           <w:p>
             <w:pPr>
+              <w:keepNext w:val="0"/>
               <w:spacing w:before="0" w:after="0" w:line="252" w:lineRule="auto"/>
               <w:jc w:val="left"/>
             </w:pPr>
@@ -14536,6 +14756,7 @@
           </w:tcPr>
           <w:p>
             <w:pPr>
+              <w:keepNext w:val="0"/>
               <w:spacing w:before="0" w:after="0" w:line="252" w:lineRule="auto"/>
               <w:jc w:val="left"/>
             </w:pPr>
@@ -14943,6 +15164,7 @@
           </w:tcPr>
           <w:p>
             <w:pPr>
+              <w:keepNext/>
               <w:spacing w:before="0" w:after="0" w:line="252" w:lineRule="auto"/>
               <w:jc w:val="center"/>
             </w:pPr>
@@ -14970,6 +15192,7 @@
           </w:tcPr>
           <w:p>
             <w:pPr>
+              <w:keepNext/>
               <w:spacing w:before="0" w:after="0" w:line="252" w:lineRule="auto"/>
               <w:jc w:val="left"/>
             </w:pPr>
@@ -14997,6 +15220,7 @@
           </w:tcPr>
           <w:p>
             <w:pPr>
+              <w:keepNext/>
               <w:spacing w:before="0" w:after="0" w:line="252" w:lineRule="auto"/>
               <w:jc w:val="left"/>
             </w:pPr>
@@ -15024,6 +15248,7 @@
           </w:tcPr>
           <w:p>
             <w:pPr>
+              <w:keepNext/>
               <w:spacing w:before="0" w:after="0" w:line="252" w:lineRule="auto"/>
               <w:jc w:val="center"/>
             </w:pPr>
@@ -15056,6 +15281,7 @@
           </w:tcPr>
           <w:p>
             <w:pPr>
+              <w:keepNext/>
               <w:spacing w:before="0" w:after="0" w:line="252" w:lineRule="auto"/>
               <w:jc w:val="center"/>
             </w:pPr>
@@ -15083,6 +15309,7 @@
           </w:tcPr>
           <w:p>
             <w:pPr>
+              <w:keepNext/>
               <w:spacing w:before="0" w:after="0" w:line="252" w:lineRule="auto"/>
               <w:jc w:val="left"/>
             </w:pPr>
@@ -15110,6 +15337,7 @@
           </w:tcPr>
           <w:p>
             <w:pPr>
+              <w:keepNext/>
               <w:spacing w:before="0" w:after="0" w:line="252" w:lineRule="auto"/>
               <w:jc w:val="center"/>
             </w:pPr>
@@ -15137,6 +15365,7 @@
           </w:tcPr>
           <w:p>
             <w:pPr>
+              <w:keepNext/>
               <w:spacing w:before="0" w:after="0" w:line="252" w:lineRule="auto"/>
               <w:jc w:val="left"/>
             </w:pPr>
@@ -15169,6 +15398,7 @@
           </w:tcPr>
           <w:p>
             <w:pPr>
+              <w:keepNext/>
               <w:spacing w:before="0" w:after="0" w:line="252" w:lineRule="auto"/>
               <w:jc w:val="center"/>
             </w:pPr>
@@ -15196,6 +15426,7 @@
           </w:tcPr>
           <w:p>
             <w:pPr>
+              <w:keepNext/>
               <w:spacing w:before="0" w:after="0" w:line="252" w:lineRule="auto"/>
               <w:jc w:val="left"/>
             </w:pPr>
@@ -15223,6 +15454,7 @@
           </w:tcPr>
           <w:p>
             <w:pPr>
+              <w:keepNext/>
               <w:spacing w:before="0" w:after="0" w:line="252" w:lineRule="auto"/>
               <w:jc w:val="left"/>
             </w:pPr>
@@ -15250,6 +15482,7 @@
           </w:tcPr>
           <w:p>
             <w:pPr>
+              <w:keepNext/>
               <w:spacing w:before="0" w:after="0" w:line="252" w:lineRule="auto"/>
               <w:jc w:val="center"/>
             </w:pPr>
@@ -15282,6 +15515,7 @@
           </w:tcPr>
           <w:p>
             <w:pPr>
+              <w:keepNext/>
               <w:spacing w:before="0" w:after="0" w:line="252" w:lineRule="auto"/>
               <w:jc w:val="center"/>
             </w:pPr>
@@ -15309,6 +15543,7 @@
           </w:tcPr>
           <w:p>
             <w:pPr>
+              <w:keepNext/>
               <w:spacing w:before="0" w:after="0" w:line="252" w:lineRule="auto"/>
               <w:jc w:val="left"/>
             </w:pPr>
@@ -15336,6 +15571,7 @@
           </w:tcPr>
           <w:p>
             <w:pPr>
+              <w:keepNext/>
               <w:spacing w:before="0" w:after="0" w:line="252" w:lineRule="auto"/>
               <w:jc w:val="center"/>
             </w:pPr>
@@ -15363,6 +15599,7 @@
           </w:tcPr>
           <w:p>
             <w:pPr>
+              <w:keepNext/>
               <w:spacing w:before="0" w:after="0" w:line="252" w:lineRule="auto"/>
               <w:jc w:val="center"/>
             </w:pPr>
@@ -15395,6 +15632,7 @@
           </w:tcPr>
           <w:p>
             <w:pPr>
+              <w:keepNext/>
               <w:spacing w:before="0" w:after="0" w:line="252" w:lineRule="auto"/>
               <w:jc w:val="center"/>
             </w:pPr>
@@ -15422,6 +15660,7 @@
           </w:tcPr>
           <w:p>
             <w:pPr>
+              <w:keepNext/>
               <w:spacing w:before="0" w:after="0" w:line="252" w:lineRule="auto"/>
               <w:jc w:val="left"/>
             </w:pPr>
@@ -15449,6 +15688,7 @@
           </w:tcPr>
           <w:p>
             <w:pPr>
+              <w:keepNext/>
               <w:spacing w:before="0" w:after="0" w:line="252" w:lineRule="auto"/>
               <w:jc w:val="left"/>
             </w:pPr>
@@ -15476,6 +15716,7 @@
           </w:tcPr>
           <w:p>
             <w:pPr>
+              <w:keepNext/>
               <w:spacing w:before="0" w:after="0" w:line="252" w:lineRule="auto"/>
               <w:jc w:val="left"/>
             </w:pPr>
@@ -15508,6 +15749,7 @@
           </w:tcPr>
           <w:p>
             <w:pPr>
+              <w:keepNext/>
               <w:spacing w:before="0" w:after="0" w:line="252" w:lineRule="auto"/>
               <w:jc w:val="center"/>
             </w:pPr>
@@ -15535,6 +15777,7 @@
           </w:tcPr>
           <w:p>
             <w:pPr>
+              <w:keepNext/>
               <w:spacing w:before="0" w:after="0" w:line="252" w:lineRule="auto"/>
               <w:jc w:val="left"/>
             </w:pPr>
@@ -15562,6 +15805,7 @@
           </w:tcPr>
           <w:p>
             <w:pPr>
+              <w:keepNext/>
               <w:spacing w:before="0" w:after="0" w:line="252" w:lineRule="auto"/>
               <w:jc w:val="left"/>
             </w:pPr>
@@ -15589,6 +15833,7 @@
           </w:tcPr>
           <w:p>
             <w:pPr>
+              <w:keepNext/>
               <w:spacing w:before="0" w:after="0" w:line="252" w:lineRule="auto"/>
               <w:jc w:val="center"/>
             </w:pPr>
@@ -15621,6 +15866,7 @@
           </w:tcPr>
           <w:p>
             <w:pPr>
+              <w:keepNext/>
               <w:spacing w:before="0" w:after="0" w:line="252" w:lineRule="auto"/>
               <w:jc w:val="center"/>
             </w:pPr>
@@ -15648,6 +15894,7 @@
           </w:tcPr>
           <w:p>
             <w:pPr>
+              <w:keepNext/>
               <w:spacing w:before="0" w:after="0" w:line="252" w:lineRule="auto"/>
               <w:jc w:val="left"/>
             </w:pPr>
@@ -15675,6 +15922,7 @@
           </w:tcPr>
           <w:p>
             <w:pPr>
+              <w:keepNext/>
               <w:spacing w:before="0" w:after="0" w:line="252" w:lineRule="auto"/>
               <w:jc w:val="left"/>
             </w:pPr>
@@ -15702,6 +15950,7 @@
           </w:tcPr>
           <w:p>
             <w:pPr>
+              <w:keepNext/>
               <w:spacing w:before="0" w:after="0" w:line="252" w:lineRule="auto"/>
               <w:jc w:val="left"/>
             </w:pPr>
@@ -15734,6 +15983,7 @@
           </w:tcPr>
           <w:p>
             <w:pPr>
+              <w:keepNext/>
               <w:spacing w:before="0" w:after="0" w:line="252" w:lineRule="auto"/>
               <w:jc w:val="center"/>
             </w:pPr>
@@ -15761,6 +16011,7 @@
           </w:tcPr>
           <w:p>
             <w:pPr>
+              <w:keepNext/>
               <w:spacing w:before="0" w:after="0" w:line="252" w:lineRule="auto"/>
               <w:jc w:val="left"/>
             </w:pPr>
@@ -15788,6 +16039,7 @@
           </w:tcPr>
           <w:p>
             <w:pPr>
+              <w:keepNext/>
               <w:spacing w:before="0" w:after="0" w:line="252" w:lineRule="auto"/>
               <w:jc w:val="left"/>
             </w:pPr>
@@ -15815,6 +16067,7 @@
           </w:tcPr>
           <w:p>
             <w:pPr>
+              <w:keepNext/>
               <w:spacing w:before="0" w:after="0" w:line="252" w:lineRule="auto"/>
               <w:jc w:val="left"/>
             </w:pPr>
@@ -15847,6 +16100,7 @@
           </w:tcPr>
           <w:p>
             <w:pPr>
+              <w:keepNext w:val="0"/>
               <w:spacing w:before="0" w:after="0" w:line="252" w:lineRule="auto"/>
               <w:jc w:val="center"/>
             </w:pPr>
@@ -15874,6 +16128,7 @@
           </w:tcPr>
           <w:p>
             <w:pPr>
+              <w:keepNext w:val="0"/>
               <w:spacing w:before="0" w:after="0" w:line="252" w:lineRule="auto"/>
               <w:jc w:val="left"/>
             </w:pPr>
@@ -15901,6 +16156,7 @@
           </w:tcPr>
           <w:p>
             <w:pPr>
+              <w:keepNext w:val="0"/>
               <w:spacing w:before="0" w:after="0" w:line="252" w:lineRule="auto"/>
               <w:jc w:val="left"/>
             </w:pPr>
@@ -15928,6 +16184,7 @@
           </w:tcPr>
           <w:p>
             <w:pPr>
+              <w:keepNext w:val="0"/>
               <w:spacing w:before="0" w:after="0" w:line="252" w:lineRule="auto"/>
               <w:jc w:val="left"/>
             </w:pPr>
@@ -16336,6 +16593,7 @@
           </w:tcPr>
           <w:p>
             <w:pPr>
+              <w:keepNext/>
               <w:spacing w:before="0" w:after="0" w:line="252" w:lineRule="auto"/>
               <w:jc w:val="left"/>
             </w:pPr>
@@ -16363,6 +16621,7 @@
           </w:tcPr>
           <w:p>
             <w:pPr>
+              <w:keepNext/>
               <w:spacing w:before="0" w:after="0" w:line="252" w:lineRule="auto"/>
               <w:jc w:val="left"/>
             </w:pPr>
@@ -16390,6 +16649,7 @@
           </w:tcPr>
           <w:p>
             <w:pPr>
+              <w:keepNext/>
               <w:spacing w:before="0" w:after="0" w:line="252" w:lineRule="auto"/>
               <w:jc w:val="left"/>
             </w:pPr>
@@ -16422,6 +16682,7 @@
           </w:tcPr>
           <w:p>
             <w:pPr>
+              <w:keepNext/>
               <w:spacing w:before="0" w:after="0" w:line="252" w:lineRule="auto"/>
               <w:jc w:val="left"/>
             </w:pPr>
@@ -16449,6 +16710,7 @@
           </w:tcPr>
           <w:p>
             <w:pPr>
+              <w:keepNext/>
               <w:spacing w:before="0" w:after="0" w:line="252" w:lineRule="auto"/>
               <w:jc w:val="left"/>
             </w:pPr>
@@ -16476,6 +16738,7 @@
           </w:tcPr>
           <w:p>
             <w:pPr>
+              <w:keepNext/>
               <w:spacing w:before="0" w:after="0" w:line="252" w:lineRule="auto"/>
               <w:jc w:val="left"/>
             </w:pPr>
@@ -16508,6 +16771,7 @@
           </w:tcPr>
           <w:p>
             <w:pPr>
+              <w:keepNext/>
               <w:spacing w:before="0" w:after="0" w:line="252" w:lineRule="auto"/>
               <w:jc w:val="left"/>
             </w:pPr>
@@ -16535,6 +16799,7 @@
           </w:tcPr>
           <w:p>
             <w:pPr>
+              <w:keepNext/>
               <w:spacing w:before="0" w:after="0" w:line="252" w:lineRule="auto"/>
               <w:jc w:val="left"/>
             </w:pPr>
@@ -16562,6 +16827,7 @@
           </w:tcPr>
           <w:p>
             <w:pPr>
+              <w:keepNext/>
               <w:spacing w:before="0" w:after="0" w:line="252" w:lineRule="auto"/>
               <w:jc w:val="left"/>
             </w:pPr>
@@ -16594,6 +16860,7 @@
           </w:tcPr>
           <w:p>
             <w:pPr>
+              <w:keepNext/>
               <w:spacing w:before="0" w:after="0" w:line="252" w:lineRule="auto"/>
               <w:jc w:val="left"/>
             </w:pPr>
@@ -16621,6 +16888,7 @@
           </w:tcPr>
           <w:p>
             <w:pPr>
+              <w:keepNext/>
               <w:spacing w:before="0" w:after="0" w:line="252" w:lineRule="auto"/>
               <w:jc w:val="left"/>
             </w:pPr>
@@ -16648,6 +16916,7 @@
           </w:tcPr>
           <w:p>
             <w:pPr>
+              <w:keepNext/>
               <w:spacing w:before="0" w:after="0" w:line="252" w:lineRule="auto"/>
               <w:jc w:val="left"/>
             </w:pPr>
@@ -16680,6 +16949,7 @@
           </w:tcPr>
           <w:p>
             <w:pPr>
+              <w:keepNext/>
               <w:spacing w:before="0" w:after="0" w:line="252" w:lineRule="auto"/>
               <w:jc w:val="left"/>
             </w:pPr>
@@ -16707,6 +16977,7 @@
           </w:tcPr>
           <w:p>
             <w:pPr>
+              <w:keepNext/>
               <w:spacing w:before="0" w:after="0" w:line="252" w:lineRule="auto"/>
               <w:jc w:val="left"/>
             </w:pPr>
@@ -16734,6 +17005,7 @@
           </w:tcPr>
           <w:p>
             <w:pPr>
+              <w:keepNext/>
               <w:spacing w:before="0" w:after="0" w:line="252" w:lineRule="auto"/>
               <w:jc w:val="left"/>
             </w:pPr>
@@ -16766,6 +17038,7 @@
           </w:tcPr>
           <w:p>
             <w:pPr>
+              <w:keepNext w:val="0"/>
               <w:spacing w:before="0" w:after="0" w:line="252" w:lineRule="auto"/>
               <w:jc w:val="center"/>
             </w:pPr>
@@ -16793,6 +17066,7 @@
           </w:tcPr>
           <w:p>
             <w:pPr>
+              <w:keepNext w:val="0"/>
               <w:spacing w:before="0" w:after="0" w:line="252" w:lineRule="auto"/>
               <w:jc w:val="left"/>
             </w:pPr>
@@ -16820,6 +17094,7 @@
           </w:tcPr>
           <w:p>
             <w:pPr>
+              <w:keepNext w:val="0"/>
               <w:spacing w:before="0" w:after="0" w:line="252" w:lineRule="auto"/>
               <w:jc w:val="left"/>
             </w:pPr>
@@ -17008,6 +17283,7 @@
           </w:tcPr>
           <w:p>
             <w:pPr>
+              <w:keepNext/>
               <w:spacing w:before="0" w:after="0" w:line="252" w:lineRule="auto"/>
               <w:jc w:val="center"/>
             </w:pPr>
@@ -17035,6 +17311,7 @@
           </w:tcPr>
           <w:p>
             <w:pPr>
+              <w:keepNext/>
               <w:spacing w:before="0" w:after="0" w:line="252" w:lineRule="auto"/>
               <w:jc w:val="center"/>
             </w:pPr>
@@ -17062,6 +17339,7 @@
           </w:tcPr>
           <w:p>
             <w:pPr>
+              <w:keepNext/>
               <w:spacing w:before="0" w:after="0" w:line="252" w:lineRule="auto"/>
               <w:jc w:val="left"/>
             </w:pPr>
@@ -17089,6 +17367,7 @@
           </w:tcPr>
           <w:p>
             <w:pPr>
+              <w:keepNext/>
               <w:spacing w:before="0" w:after="0" w:line="252" w:lineRule="auto"/>
               <w:jc w:val="left"/>
             </w:pPr>
@@ -17121,6 +17400,7 @@
           </w:tcPr>
           <w:p>
             <w:pPr>
+              <w:keepNext/>
               <w:spacing w:before="0" w:after="0" w:line="252" w:lineRule="auto"/>
               <w:jc w:val="left"/>
             </w:pPr>
@@ -17148,6 +17428,7 @@
           </w:tcPr>
           <w:p>
             <w:pPr>
+              <w:keepNext/>
               <w:spacing w:before="0" w:after="0" w:line="252" w:lineRule="auto"/>
               <w:jc w:val="center"/>
             </w:pPr>
@@ -17175,6 +17456,7 @@
           </w:tcPr>
           <w:p>
             <w:pPr>
+              <w:keepNext/>
               <w:spacing w:before="0" w:after="0" w:line="252" w:lineRule="auto"/>
               <w:jc w:val="left"/>
             </w:pPr>
@@ -17202,6 +17484,7 @@
           </w:tcPr>
           <w:p>
             <w:pPr>
+              <w:keepNext/>
               <w:spacing w:before="0" w:after="0" w:line="252" w:lineRule="auto"/>
               <w:jc w:val="left"/>
             </w:pPr>
@@ -17234,6 +17517,7 @@
           </w:tcPr>
           <w:p>
             <w:pPr>
+              <w:keepNext/>
               <w:spacing w:before="0" w:after="0" w:line="252" w:lineRule="auto"/>
               <w:jc w:val="left"/>
             </w:pPr>
@@ -17261,6 +17545,7 @@
           </w:tcPr>
           <w:p>
             <w:pPr>
+              <w:keepNext/>
               <w:spacing w:before="0" w:after="0" w:line="252" w:lineRule="auto"/>
               <w:jc w:val="left"/>
             </w:pPr>
@@ -17288,6 +17573,7 @@
           </w:tcPr>
           <w:p>
             <w:pPr>
+              <w:keepNext/>
               <w:spacing w:before="0" w:after="0" w:line="252" w:lineRule="auto"/>
               <w:jc w:val="center"/>
             </w:pPr>
@@ -17315,6 +17601,7 @@
           </w:tcPr>
           <w:p>
             <w:pPr>
+              <w:keepNext/>
               <w:spacing w:before="0" w:after="0" w:line="252" w:lineRule="auto"/>
               <w:jc w:val="left"/>
             </w:pPr>
@@ -17347,6 +17634,7 @@
           </w:tcPr>
           <w:p>
             <w:pPr>
+              <w:keepNext/>
               <w:spacing w:before="0" w:after="0" w:line="252" w:lineRule="auto"/>
               <w:jc w:val="left"/>
             </w:pPr>
@@ -17374,6 +17662,7 @@
           </w:tcPr>
           <w:p>
             <w:pPr>
+              <w:keepNext/>
               <w:spacing w:before="0" w:after="0" w:line="252" w:lineRule="auto"/>
               <w:jc w:val="left"/>
             </w:pPr>
@@ -17401,6 +17690,7 @@
           </w:tcPr>
           <w:p>
             <w:pPr>
+              <w:keepNext/>
               <w:spacing w:before="0" w:after="0" w:line="252" w:lineRule="auto"/>
               <w:jc w:val="left"/>
             </w:pPr>
@@ -17428,6 +17718,7 @@
           </w:tcPr>
           <w:p>
             <w:pPr>
+              <w:keepNext/>
               <w:spacing w:before="0" w:after="0" w:line="252" w:lineRule="auto"/>
               <w:jc w:val="left"/>
             </w:pPr>
@@ -17460,6 +17751,7 @@
           </w:tcPr>
           <w:p>
             <w:pPr>
+              <w:keepNext/>
               <w:spacing w:before="0" w:after="0" w:line="252" w:lineRule="auto"/>
               <w:jc w:val="center"/>
             </w:pPr>
@@ -17487,6 +17779,7 @@
           </w:tcPr>
           <w:p>
             <w:pPr>
+              <w:keepNext/>
               <w:spacing w:before="0" w:after="0" w:line="252" w:lineRule="auto"/>
               <w:jc w:val="center"/>
             </w:pPr>
@@ -17514,6 +17807,7 @@
           </w:tcPr>
           <w:p>
             <w:pPr>
+              <w:keepNext/>
               <w:spacing w:before="0" w:after="0" w:line="252" w:lineRule="auto"/>
               <w:jc w:val="center"/>
             </w:pPr>
@@ -17541,6 +17835,7 @@
           </w:tcPr>
           <w:p>
             <w:pPr>
+              <w:keepNext/>
               <w:spacing w:before="0" w:after="0" w:line="252" w:lineRule="auto"/>
               <w:jc w:val="left"/>
             </w:pPr>
@@ -17573,6 +17868,7 @@
           </w:tcPr>
           <w:p>
             <w:pPr>
+              <w:keepNext w:val="0"/>
               <w:spacing w:before="0" w:after="0" w:line="252" w:lineRule="auto"/>
               <w:jc w:val="left"/>
             </w:pPr>
@@ -17600,6 +17896,7 @@
           </w:tcPr>
           <w:p>
             <w:pPr>
+              <w:keepNext w:val="0"/>
               <w:spacing w:before="0" w:after="0" w:line="252" w:lineRule="auto"/>
               <w:jc w:val="left"/>
             </w:pPr>
@@ -17627,6 +17924,7 @@
           </w:tcPr>
           <w:p>
             <w:pPr>
+              <w:keepNext w:val="0"/>
               <w:spacing w:before="0" w:after="0" w:line="252" w:lineRule="auto"/>
               <w:jc w:val="center"/>
             </w:pPr>
@@ -17654,6 +17952,7 @@
           </w:tcPr>
           <w:p>
             <w:pPr>
+              <w:keepNext w:val="0"/>
               <w:spacing w:before="0" w:after="0" w:line="252" w:lineRule="auto"/>
               <w:jc w:val="left"/>
             </w:pPr>
@@ -17825,6 +18124,7 @@
           </w:tcPr>
           <w:p>
             <w:pPr>
+              <w:keepNext/>
               <w:spacing w:before="0" w:after="0" w:line="252" w:lineRule="auto"/>
               <w:jc w:val="left"/>
             </w:pPr>
@@ -17852,6 +18152,7 @@
           </w:tcPr>
           <w:p>
             <w:pPr>
+              <w:keepNext/>
               <w:spacing w:before="0" w:after="0" w:line="252" w:lineRule="auto"/>
               <w:jc w:val="center"/>
             </w:pPr>
@@ -17884,6 +18185,7 @@
           </w:tcPr>
           <w:p>
             <w:pPr>
+              <w:keepNext/>
               <w:spacing w:before="0" w:after="0" w:line="252" w:lineRule="auto"/>
               <w:jc w:val="left"/>
             </w:pPr>
@@ -17911,6 +18213,7 @@
           </w:tcPr>
           <w:p>
             <w:pPr>
+              <w:keepNext/>
               <w:spacing w:before="0" w:after="0" w:line="252" w:lineRule="auto"/>
               <w:jc w:val="center"/>
             </w:pPr>
@@ -17943,6 +18246,7 @@
           </w:tcPr>
           <w:p>
             <w:pPr>
+              <w:keepNext/>
               <w:spacing w:before="0" w:after="0" w:line="252" w:lineRule="auto"/>
               <w:jc w:val="left"/>
             </w:pPr>
@@ -17970,6 +18274,7 @@
           </w:tcPr>
           <w:p>
             <w:pPr>
+              <w:keepNext/>
               <w:spacing w:before="0" w:after="0" w:line="252" w:lineRule="auto"/>
               <w:jc w:val="center"/>
             </w:pPr>
@@ -18002,6 +18307,7 @@
           </w:tcPr>
           <w:p>
             <w:pPr>
+              <w:keepNext/>
               <w:spacing w:before="0" w:after="0" w:line="252" w:lineRule="auto"/>
               <w:jc w:val="left"/>
             </w:pPr>
@@ -18029,6 +18335,7 @@
           </w:tcPr>
           <w:p>
             <w:pPr>
+              <w:keepNext/>
               <w:spacing w:before="0" w:after="0" w:line="252" w:lineRule="auto"/>
               <w:jc w:val="center"/>
             </w:pPr>
@@ -18061,6 +18368,7 @@
           </w:tcPr>
           <w:p>
             <w:pPr>
+              <w:keepNext/>
               <w:spacing w:before="0" w:after="0" w:line="252" w:lineRule="auto"/>
               <w:jc w:val="left"/>
             </w:pPr>
@@ -18088,6 +18396,7 @@
           </w:tcPr>
           <w:p>
             <w:pPr>
+              <w:keepNext/>
               <w:spacing w:before="0" w:after="0" w:line="252" w:lineRule="auto"/>
               <w:jc w:val="center"/>
             </w:pPr>
@@ -18120,6 +18429,7 @@
           </w:tcPr>
           <w:p>
             <w:pPr>
+              <w:keepNext/>
               <w:spacing w:before="0" w:after="0" w:line="252" w:lineRule="auto"/>
               <w:jc w:val="left"/>
             </w:pPr>
@@ -18147,6 +18457,7 @@
           </w:tcPr>
           <w:p>
             <w:pPr>
+              <w:keepNext/>
               <w:spacing w:before="0" w:after="0" w:line="252" w:lineRule="auto"/>
               <w:jc w:val="center"/>
             </w:pPr>
@@ -18179,6 +18490,7 @@
           </w:tcPr>
           <w:p>
             <w:pPr>
+              <w:keepNext/>
               <w:spacing w:before="0" w:after="0" w:line="252" w:lineRule="auto"/>
               <w:jc w:val="left"/>
             </w:pPr>
@@ -18206,6 +18518,7 @@
           </w:tcPr>
           <w:p>
             <w:pPr>
+              <w:keepNext/>
               <w:spacing w:before="0" w:after="0" w:line="252" w:lineRule="auto"/>
               <w:jc w:val="center"/>
             </w:pPr>
@@ -18238,6 +18551,7 @@
           </w:tcPr>
           <w:p>
             <w:pPr>
+              <w:keepNext w:val="0"/>
               <w:spacing w:before="0" w:after="0" w:line="252" w:lineRule="auto"/>
               <w:jc w:val="left"/>
             </w:pPr>
@@ -18265,6 +18579,7 @@
           </w:tcPr>
           <w:p>
             <w:pPr>
+              <w:keepNext w:val="0"/>
               <w:spacing w:before="0" w:after="0" w:line="252" w:lineRule="auto"/>
               <w:jc w:val="center"/>
             </w:pPr>
@@ -18713,6 +19028,7 @@
           </w:tcPr>
           <w:p>
             <w:pPr>
+              <w:keepNext/>
               <w:spacing w:before="0" w:after="0" w:line="252" w:lineRule="auto"/>
               <w:jc w:val="left"/>
             </w:pPr>
@@ -18740,6 +19056,7 @@
           </w:tcPr>
           <w:p>
             <w:pPr>
+              <w:keepNext/>
               <w:spacing w:before="0" w:after="0" w:line="252" w:lineRule="auto"/>
               <w:jc w:val="center"/>
             </w:pPr>
@@ -18767,6 +19084,7 @@
           </w:tcPr>
           <w:p>
             <w:pPr>
+              <w:keepNext/>
               <w:spacing w:before="0" w:after="0" w:line="252" w:lineRule="auto"/>
               <w:jc w:val="left"/>
             </w:pPr>
@@ -18799,6 +19117,7 @@
           </w:tcPr>
           <w:p>
             <w:pPr>
+              <w:keepNext/>
               <w:spacing w:before="0" w:after="0" w:line="252" w:lineRule="auto"/>
               <w:jc w:val="center"/>
             </w:pPr>
@@ -18826,6 +19145,7 @@
           </w:tcPr>
           <w:p>
             <w:pPr>
+              <w:keepNext/>
               <w:spacing w:before="0" w:after="0" w:line="252" w:lineRule="auto"/>
               <w:jc w:val="center"/>
             </w:pPr>
@@ -18853,6 +19173,7 @@
           </w:tcPr>
           <w:p>
             <w:pPr>
+              <w:keepNext/>
               <w:spacing w:before="0" w:after="0" w:line="252" w:lineRule="auto"/>
               <w:jc w:val="left"/>
             </w:pPr>
@@ -18885,6 +19206,7 @@
           </w:tcPr>
           <w:p>
             <w:pPr>
+              <w:keepNext/>
               <w:spacing w:before="0" w:after="0" w:line="252" w:lineRule="auto"/>
               <w:jc w:val="left"/>
             </w:pPr>
@@ -18912,6 +19234,7 @@
           </w:tcPr>
           <w:p>
             <w:pPr>
+              <w:keepNext/>
               <w:spacing w:before="0" w:after="0" w:line="252" w:lineRule="auto"/>
               <w:jc w:val="center"/>
             </w:pPr>
@@ -18939,6 +19262,7 @@
           </w:tcPr>
           <w:p>
             <w:pPr>
+              <w:keepNext/>
               <w:spacing w:before="0" w:after="0" w:line="252" w:lineRule="auto"/>
               <w:jc w:val="left"/>
             </w:pPr>
@@ -18971,6 +19295,7 @@
           </w:tcPr>
           <w:p>
             <w:pPr>
+              <w:keepNext/>
               <w:spacing w:before="0" w:after="0" w:line="252" w:lineRule="auto"/>
               <w:jc w:val="left"/>
             </w:pPr>
@@ -18998,6 +19323,7 @@
           </w:tcPr>
           <w:p>
             <w:pPr>
+              <w:keepNext/>
               <w:spacing w:before="0" w:after="0" w:line="252" w:lineRule="auto"/>
               <w:jc w:val="center"/>
             </w:pPr>
@@ -19025,6 +19351,7 @@
           </w:tcPr>
           <w:p>
             <w:pPr>
+              <w:keepNext/>
               <w:spacing w:before="0" w:after="0" w:line="252" w:lineRule="auto"/>
               <w:jc w:val="left"/>
             </w:pPr>
@@ -19057,6 +19384,7 @@
           </w:tcPr>
           <w:p>
             <w:pPr>
+              <w:keepNext/>
               <w:spacing w:before="0" w:after="0" w:line="252" w:lineRule="auto"/>
               <w:jc w:val="left"/>
             </w:pPr>
@@ -19084,6 +19412,7 @@
           </w:tcPr>
           <w:p>
             <w:pPr>
+              <w:keepNext/>
               <w:spacing w:before="0" w:after="0" w:line="252" w:lineRule="auto"/>
               <w:jc w:val="center"/>
             </w:pPr>
@@ -19111,6 +19440,7 @@
           </w:tcPr>
           <w:p>
             <w:pPr>
+              <w:keepNext/>
               <w:spacing w:before="0" w:after="0" w:line="252" w:lineRule="auto"/>
               <w:jc w:val="left"/>
             </w:pPr>
@@ -19143,6 +19473,7 @@
           </w:tcPr>
           <w:p>
             <w:pPr>
+              <w:keepNext/>
               <w:spacing w:before="0" w:after="0" w:line="252" w:lineRule="auto"/>
               <w:jc w:val="left"/>
             </w:pPr>
@@ -19170,6 +19501,7 @@
           </w:tcPr>
           <w:p>
             <w:pPr>
+              <w:keepNext/>
               <w:spacing w:before="0" w:after="0" w:line="252" w:lineRule="auto"/>
               <w:jc w:val="center"/>
             </w:pPr>
@@ -19197,6 +19529,7 @@
           </w:tcPr>
           <w:p>
             <w:pPr>
+              <w:keepNext/>
               <w:spacing w:before="0" w:after="0" w:line="252" w:lineRule="auto"/>
               <w:jc w:val="left"/>
             </w:pPr>
@@ -19229,6 +19562,7 @@
           </w:tcPr>
           <w:p>
             <w:pPr>
+              <w:keepNext w:val="0"/>
               <w:spacing w:before="0" w:after="0" w:line="252" w:lineRule="auto"/>
               <w:jc w:val="left"/>
             </w:pPr>
@@ -19256,6 +19590,7 @@
           </w:tcPr>
           <w:p>
             <w:pPr>
+              <w:keepNext w:val="0"/>
               <w:spacing w:before="0" w:after="0" w:line="252" w:lineRule="auto"/>
               <w:jc w:val="center"/>
             </w:pPr>
@@ -19283,6 +19618,7 @@
           </w:tcPr>
           <w:p>
             <w:pPr>
+              <w:keepNext w:val="0"/>
               <w:spacing w:before="0" w:after="0" w:line="252" w:lineRule="auto"/>
               <w:jc w:val="left"/>
             </w:pPr>
@@ -19432,6 +19768,7 @@
           </w:tcPr>
           <w:p>
             <w:pPr>
+              <w:keepNext/>
               <w:spacing w:before="0" w:after="0" w:line="252" w:lineRule="auto"/>
               <w:jc w:val="left"/>
             </w:pPr>
@@ -19459,6 +19796,7 @@
           </w:tcPr>
           <w:p>
             <w:pPr>
+              <w:keepNext/>
               <w:spacing w:before="0" w:after="0" w:line="252" w:lineRule="auto"/>
               <w:jc w:val="center"/>
             </w:pPr>
@@ -19491,6 +19829,7 @@
           </w:tcPr>
           <w:p>
             <w:pPr>
+              <w:keepNext/>
               <w:spacing w:before="0" w:after="0" w:line="252" w:lineRule="auto"/>
               <w:jc w:val="left"/>
             </w:pPr>
@@ -19518,6 +19857,7 @@
           </w:tcPr>
           <w:p>
             <w:pPr>
+              <w:keepNext/>
               <w:spacing w:before="0" w:after="0" w:line="252" w:lineRule="auto"/>
               <w:jc w:val="center"/>
             </w:pPr>
@@ -19550,6 +19890,7 @@
           </w:tcPr>
           <w:p>
             <w:pPr>
+              <w:keepNext/>
               <w:spacing w:before="0" w:after="0" w:line="252" w:lineRule="auto"/>
               <w:jc w:val="left"/>
             </w:pPr>
@@ -19577,6 +19918,7 @@
           </w:tcPr>
           <w:p>
             <w:pPr>
+              <w:keepNext/>
               <w:spacing w:before="0" w:after="0" w:line="252" w:lineRule="auto"/>
               <w:jc w:val="center"/>
             </w:pPr>
@@ -19609,6 +19951,7 @@
           </w:tcPr>
           <w:p>
             <w:pPr>
+              <w:keepNext/>
               <w:spacing w:before="0" w:after="0" w:line="252" w:lineRule="auto"/>
               <w:jc w:val="left"/>
             </w:pPr>
@@ -19636,6 +19979,7 @@
           </w:tcPr>
           <w:p>
             <w:pPr>
+              <w:keepNext/>
               <w:spacing w:before="0" w:after="0" w:line="252" w:lineRule="auto"/>
               <w:jc w:val="center"/>
             </w:pPr>
@@ -19668,6 +20012,7 @@
           </w:tcPr>
           <w:p>
             <w:pPr>
+              <w:keepNext/>
               <w:spacing w:before="0" w:after="0" w:line="252" w:lineRule="auto"/>
               <w:jc w:val="left"/>
             </w:pPr>
@@ -19695,6 +20040,7 @@
           </w:tcPr>
           <w:p>
             <w:pPr>
+              <w:keepNext/>
               <w:spacing w:before="0" w:after="0" w:line="252" w:lineRule="auto"/>
               <w:jc w:val="center"/>
             </w:pPr>
@@ -19727,6 +20073,7 @@
           </w:tcPr>
           <w:p>
             <w:pPr>
+              <w:keepNext w:val="0"/>
               <w:spacing w:before="0" w:after="0" w:line="252" w:lineRule="auto"/>
               <w:jc w:val="left"/>
             </w:pPr>
@@ -19754,6 +20101,7 @@
           </w:tcPr>
           <w:p>
             <w:pPr>
+              <w:keepNext w:val="0"/>
               <w:spacing w:before="0" w:after="0" w:line="252" w:lineRule="auto"/>
               <w:jc w:val="left"/>
             </w:pPr>
@@ -19918,6 +20266,7 @@
           </w:tcPr>
           <w:p>
             <w:pPr>
+              <w:keepNext/>
               <w:spacing w:before="0" w:after="0" w:line="252" w:lineRule="auto"/>
               <w:jc w:val="center"/>
             </w:pPr>
@@ -19945,6 +20294,7 @@
           </w:tcPr>
           <w:p>
             <w:pPr>
+              <w:keepNext/>
               <w:spacing w:before="0" w:after="0" w:line="252" w:lineRule="auto"/>
               <w:jc w:val="center"/>
             </w:pPr>
@@ -19977,6 +20327,7 @@
           </w:tcPr>
           <w:p>
             <w:pPr>
+              <w:keepNext/>
               <w:spacing w:before="0" w:after="0" w:line="252" w:lineRule="auto"/>
               <w:jc w:val="left"/>
             </w:pPr>
@@ -20004,6 +20355,7 @@
           </w:tcPr>
           <w:p>
             <w:pPr>
+              <w:keepNext/>
               <w:spacing w:before="0" w:after="0" w:line="252" w:lineRule="auto"/>
               <w:jc w:val="center"/>
             </w:pPr>
@@ -20036,6 +20388,7 @@
           </w:tcPr>
           <w:p>
             <w:pPr>
+              <w:keepNext/>
               <w:spacing w:before="0" w:after="0" w:line="252" w:lineRule="auto"/>
               <w:jc w:val="left"/>
             </w:pPr>
@@ -20063,6 +20416,7 @@
           </w:tcPr>
           <w:p>
             <w:pPr>
+              <w:keepNext/>
               <w:spacing w:before="0" w:after="0" w:line="252" w:lineRule="auto"/>
               <w:jc w:val="center"/>
             </w:pPr>
@@ -20095,6 +20449,7 @@
           </w:tcPr>
           <w:p>
             <w:pPr>
+              <w:keepNext/>
               <w:spacing w:before="0" w:after="0" w:line="252" w:lineRule="auto"/>
               <w:jc w:val="left"/>
             </w:pPr>
@@ -20122,6 +20477,7 @@
           </w:tcPr>
           <w:p>
             <w:pPr>
+              <w:keepNext/>
               <w:spacing w:before="0" w:after="0" w:line="252" w:lineRule="auto"/>
               <w:jc w:val="center"/>
             </w:pPr>
@@ -20154,6 +20510,7 @@
           </w:tcPr>
           <w:p>
             <w:pPr>
+              <w:keepNext/>
               <w:spacing w:before="0" w:after="0" w:line="252" w:lineRule="auto"/>
               <w:jc w:val="left"/>
             </w:pPr>
@@ -20181,6 +20538,7 @@
           </w:tcPr>
           <w:p>
             <w:pPr>
+              <w:keepNext/>
               <w:spacing w:before="0" w:after="0" w:line="252" w:lineRule="auto"/>
               <w:jc w:val="center"/>
             </w:pPr>
@@ -20213,6 +20571,7 @@
           </w:tcPr>
           <w:p>
             <w:pPr>
+              <w:keepNext/>
               <w:spacing w:before="0" w:after="0" w:line="252" w:lineRule="auto"/>
               <w:jc w:val="left"/>
             </w:pPr>
@@ -20240,6 +20599,7 @@
           </w:tcPr>
           <w:p>
             <w:pPr>
+              <w:keepNext/>
               <w:spacing w:before="0" w:after="0" w:line="252" w:lineRule="auto"/>
               <w:jc w:val="center"/>
             </w:pPr>
@@ -20272,6 +20632,7 @@
           </w:tcPr>
           <w:p>
             <w:pPr>
+              <w:keepNext w:val="0"/>
               <w:spacing w:before="0" w:after="0" w:line="252" w:lineRule="auto"/>
               <w:jc w:val="center"/>
             </w:pPr>
@@ -20299,6 +20660,7 @@
           </w:tcPr>
           <w:p>
             <w:pPr>
+              <w:keepNext w:val="0"/>
               <w:spacing w:before="0" w:after="0" w:line="252" w:lineRule="auto"/>
               <w:jc w:val="center"/>
             </w:pPr>
@@ -20493,6 +20855,7 @@
           </w:tcPr>
           <w:p>
             <w:pPr>
+              <w:keepNext/>
               <w:spacing w:before="0" w:after="0" w:line="252" w:lineRule="auto"/>
               <w:jc w:val="center"/>
             </w:pPr>
@@ -20520,6 +20883,7 @@
           </w:tcPr>
           <w:p>
             <w:pPr>
+              <w:keepNext/>
               <w:spacing w:before="0" w:after="0" w:line="252" w:lineRule="auto"/>
               <w:jc w:val="center"/>
             </w:pPr>
@@ -20547,6 +20911,7 @@
           </w:tcPr>
           <w:p>
             <w:pPr>
+              <w:keepNext/>
               <w:spacing w:before="0" w:after="0" w:line="252" w:lineRule="auto"/>
               <w:jc w:val="center"/>
             </w:pPr>
@@ -20579,6 +20944,7 @@
           </w:tcPr>
           <w:p>
             <w:pPr>
+              <w:keepNext w:val="0"/>
               <w:spacing w:before="0" w:after="0" w:line="252" w:lineRule="auto"/>
               <w:jc w:val="center"/>
             </w:pPr>
@@ -20606,6 +20972,7 @@
           </w:tcPr>
           <w:p>
             <w:pPr>
+              <w:keepNext w:val="0"/>
               <w:spacing w:before="0" w:after="0" w:line="252" w:lineRule="auto"/>
               <w:jc w:val="center"/>
             </w:pPr>
@@ -20633,6 +21000,7 @@
           </w:tcPr>
           <w:p>
             <w:pPr>
+              <w:keepNext w:val="0"/>
               <w:spacing w:before="0" w:after="0" w:line="252" w:lineRule="auto"/>
               <w:jc w:val="center"/>
             </w:pPr>
@@ -20748,6 +21116,7 @@
           </w:tcPr>
           <w:p>
             <w:pPr>
+              <w:keepNext/>
               <w:spacing w:before="0" w:after="0" w:line="252" w:lineRule="auto"/>
               <w:jc w:val="center"/>
             </w:pPr>
@@ -20775,6 +21144,7 @@
           </w:tcPr>
           <w:p>
             <w:pPr>
+              <w:keepNext/>
               <w:spacing w:before="0" w:after="0" w:line="252" w:lineRule="auto"/>
               <w:jc w:val="left"/>
             </w:pPr>
@@ -20807,6 +21177,7 @@
           </w:tcPr>
           <w:p>
             <w:pPr>
+              <w:keepNext/>
               <w:spacing w:before="0" w:after="0" w:line="252" w:lineRule="auto"/>
               <w:jc w:val="left"/>
             </w:pPr>
@@ -20834,6 +21205,7 @@
           </w:tcPr>
           <w:p>
             <w:pPr>
+              <w:keepNext/>
               <w:spacing w:before="0" w:after="0" w:line="252" w:lineRule="auto"/>
               <w:jc w:val="left"/>
             </w:pPr>
@@ -20866,6 +21238,7 @@
           </w:tcPr>
           <w:p>
             <w:pPr>
+              <w:keepNext/>
               <w:spacing w:before="0" w:after="0" w:line="252" w:lineRule="auto"/>
               <w:jc w:val="center"/>
             </w:pPr>
@@ -20893,6 +21266,7 @@
           </w:tcPr>
           <w:p>
             <w:pPr>
+              <w:keepNext/>
               <w:spacing w:before="0" w:after="0" w:line="252" w:lineRule="auto"/>
               <w:jc w:val="left"/>
             </w:pPr>
@@ -20925,6 +21299,7 @@
           </w:tcPr>
           <w:p>
             <w:pPr>
+              <w:keepNext/>
               <w:spacing w:before="0" w:after="0" w:line="252" w:lineRule="auto"/>
               <w:jc w:val="left"/>
             </w:pPr>
@@ -20952,6 +21327,7 @@
           </w:tcPr>
           <w:p>
             <w:pPr>
+              <w:keepNext/>
               <w:spacing w:before="0" w:after="0" w:line="252" w:lineRule="auto"/>
               <w:jc w:val="left"/>
             </w:pPr>
@@ -20984,6 +21360,7 @@
           </w:tcPr>
           <w:p>
             <w:pPr>
+              <w:keepNext/>
               <w:spacing w:before="0" w:after="0" w:line="252" w:lineRule="auto"/>
               <w:jc w:val="center"/>
             </w:pPr>
@@ -21011,6 +21388,7 @@
           </w:tcPr>
           <w:p>
             <w:pPr>
+              <w:keepNext/>
               <w:spacing w:before="0" w:after="0" w:line="252" w:lineRule="auto"/>
               <w:jc w:val="left"/>
             </w:pPr>
@@ -21043,6 +21421,7 @@
           </w:tcPr>
           <w:p>
             <w:pPr>
+              <w:keepNext w:val="0"/>
               <w:spacing w:before="0" w:after="0" w:line="252" w:lineRule="auto"/>
               <w:jc w:val="center"/>
             </w:pPr>
@@ -21070,6 +21449,7 @@
           </w:tcPr>
           <w:p>
             <w:pPr>
+              <w:keepNext w:val="0"/>
               <w:spacing w:before="0" w:after="0" w:line="252" w:lineRule="auto"/>
               <w:jc w:val="left"/>
             </w:pPr>
@@ -22081,7 +22461,7 @@
     </w:p>
     <w:p>
       <w:r>
-        <w:t>The dominant threats are the small, leakage-heavy evidence base, missing independent labels, unstable class prevalence, and the risk of optimistic policy selection. The calibration, two-reviewer workflow, fixed 16/8 split, development-suitability gate, paired estimand, one-time holdout, and external replication form a chain of partial mitigations. None guarantees a positive result. They ensure that positive, null, mixed, or harmful outcomes can be interpreted without changing the evidence rules after the fact.</w:t>
+        <w:t>Key threats are missing labels, leakage, small and unstable classes, policy overfitting, and model drift. Dual review, a frozen split, paired analysis, a one-time holdout, and external replication keep outcomes interpretable under rules fixed in advance; none guarantees benefit.</w:t>
       </w:r>
     </w:p>
     <w:p>
@@ -22948,6 +23328,7 @@
           </w:tcPr>
           <w:p>
             <w:pPr>
+              <w:keepNext/>
               <w:spacing w:before="0" w:after="0" w:line="252" w:lineRule="auto"/>
               <w:jc w:val="center"/>
             </w:pPr>
@@ -22975,6 +23356,7 @@
           </w:tcPr>
           <w:p>
             <w:pPr>
+              <w:keepNext/>
               <w:spacing w:before="0" w:after="0" w:line="252" w:lineRule="auto"/>
               <w:jc w:val="left"/>
             </w:pPr>
@@ -23002,6 +23384,7 @@
           </w:tcPr>
           <w:p>
             <w:pPr>
+              <w:keepNext/>
               <w:spacing w:before="0" w:after="0" w:line="252" w:lineRule="auto"/>
               <w:jc w:val="left"/>
             </w:pPr>
@@ -23029,6 +23412,7 @@
           </w:tcPr>
           <w:p>
             <w:pPr>
+              <w:keepNext/>
               <w:spacing w:before="0" w:after="0" w:line="252" w:lineRule="auto"/>
               <w:jc w:val="left"/>
             </w:pPr>
@@ -23061,6 +23445,7 @@
           </w:tcPr>
           <w:p>
             <w:pPr>
+              <w:keepNext/>
               <w:spacing w:before="0" w:after="0" w:line="252" w:lineRule="auto"/>
               <w:jc w:val="left"/>
             </w:pPr>
@@ -23088,6 +23473,7 @@
           </w:tcPr>
           <w:p>
             <w:pPr>
+              <w:keepNext/>
               <w:spacing w:before="0" w:after="0" w:line="252" w:lineRule="auto"/>
               <w:jc w:val="left"/>
             </w:pPr>
@@ -23115,6 +23501,7 @@
           </w:tcPr>
           <w:p>
             <w:pPr>
+              <w:keepNext/>
               <w:spacing w:before="0" w:after="0" w:line="252" w:lineRule="auto"/>
               <w:jc w:val="left"/>
             </w:pPr>
@@ -23142,6 +23529,7 @@
           </w:tcPr>
           <w:p>
             <w:pPr>
+              <w:keepNext/>
               <w:spacing w:before="0" w:after="0" w:line="252" w:lineRule="auto"/>
               <w:jc w:val="left"/>
             </w:pPr>
@@ -23174,6 +23562,7 @@
           </w:tcPr>
           <w:p>
             <w:pPr>
+              <w:keepNext/>
               <w:spacing w:before="0" w:after="0" w:line="252" w:lineRule="auto"/>
               <w:jc w:val="left"/>
             </w:pPr>
@@ -23201,6 +23590,7 @@
           </w:tcPr>
           <w:p>
             <w:pPr>
+              <w:keepNext/>
               <w:spacing w:before="0" w:after="0" w:line="252" w:lineRule="auto"/>
               <w:jc w:val="left"/>
             </w:pPr>
@@ -23228,6 +23618,7 @@
           </w:tcPr>
           <w:p>
             <w:pPr>
+              <w:keepNext/>
               <w:spacing w:before="0" w:after="0" w:line="252" w:lineRule="auto"/>
               <w:jc w:val="left"/>
             </w:pPr>
@@ -23255,6 +23646,7 @@
           </w:tcPr>
           <w:p>
             <w:pPr>
+              <w:keepNext/>
               <w:spacing w:before="0" w:after="0" w:line="252" w:lineRule="auto"/>
               <w:jc w:val="left"/>
             </w:pPr>
@@ -23287,6 +23679,7 @@
           </w:tcPr>
           <w:p>
             <w:pPr>
+              <w:keepNext/>
               <w:spacing w:before="0" w:after="0" w:line="252" w:lineRule="auto"/>
               <w:jc w:val="left"/>
             </w:pPr>
@@ -23314,6 +23707,7 @@
           </w:tcPr>
           <w:p>
             <w:pPr>
+              <w:keepNext/>
               <w:spacing w:before="0" w:after="0" w:line="252" w:lineRule="auto"/>
               <w:jc w:val="left"/>
             </w:pPr>
@@ -23341,6 +23735,7 @@
           </w:tcPr>
           <w:p>
             <w:pPr>
+              <w:keepNext/>
               <w:spacing w:before="0" w:after="0" w:line="252" w:lineRule="auto"/>
               <w:jc w:val="left"/>
             </w:pPr>
@@ -23368,6 +23763,7 @@
           </w:tcPr>
           <w:p>
             <w:pPr>
+              <w:keepNext/>
               <w:spacing w:before="0" w:after="0" w:line="252" w:lineRule="auto"/>
               <w:jc w:val="left"/>
             </w:pPr>
@@ -23400,6 +23796,7 @@
           </w:tcPr>
           <w:p>
             <w:pPr>
+              <w:keepNext/>
               <w:spacing w:before="0" w:after="0" w:line="252" w:lineRule="auto"/>
               <w:jc w:val="left"/>
             </w:pPr>
@@ -23427,6 +23824,7 @@
           </w:tcPr>
           <w:p>
             <w:pPr>
+              <w:keepNext/>
               <w:spacing w:before="0" w:after="0" w:line="252" w:lineRule="auto"/>
               <w:jc w:val="left"/>
             </w:pPr>
@@ -23454,6 +23852,7 @@
           </w:tcPr>
           <w:p>
             <w:pPr>
+              <w:keepNext/>
               <w:spacing w:before="0" w:after="0" w:line="252" w:lineRule="auto"/>
               <w:jc w:val="left"/>
             </w:pPr>
@@ -23481,6 +23880,7 @@
           </w:tcPr>
           <w:p>
             <w:pPr>
+              <w:keepNext/>
               <w:spacing w:before="0" w:after="0" w:line="252" w:lineRule="auto"/>
               <w:jc w:val="left"/>
             </w:pPr>
@@ -23513,6 +23913,7 @@
           </w:tcPr>
           <w:p>
             <w:pPr>
+              <w:keepNext w:val="0"/>
               <w:spacing w:before="0" w:after="0" w:line="252" w:lineRule="auto"/>
               <w:jc w:val="left"/>
             </w:pPr>
@@ -23540,6 +23941,7 @@
           </w:tcPr>
           <w:p>
             <w:pPr>
+              <w:keepNext w:val="0"/>
               <w:spacing w:before="0" w:after="0" w:line="252" w:lineRule="auto"/>
               <w:jc w:val="left"/>
             </w:pPr>
@@ -23567,6 +23969,7 @@
           </w:tcPr>
           <w:p>
             <w:pPr>
+              <w:keepNext w:val="0"/>
               <w:spacing w:before="0" w:after="0" w:line="252" w:lineRule="auto"/>
               <w:jc w:val="left"/>
             </w:pPr>
@@ -23594,6 +23997,7 @@
           </w:tcPr>
           <w:p>
             <w:pPr>
+              <w:keepNext w:val="0"/>
               <w:spacing w:before="0" w:after="0" w:line="252" w:lineRule="auto"/>
               <w:jc w:val="left"/>
             </w:pPr>
@@ -24523,6 +24927,7 @@
           </w:tcPr>
           <w:p>
             <w:pPr>
+              <w:keepNext/>
               <w:spacing w:before="0" w:after="0" w:line="252" w:lineRule="auto"/>
               <w:jc w:val="center"/>
             </w:pPr>
@@ -24550,6 +24955,7 @@
           </w:tcPr>
           <w:p>
             <w:pPr>
+              <w:keepNext/>
               <w:spacing w:before="0" w:after="0" w:line="252" w:lineRule="auto"/>
               <w:jc w:val="left"/>
             </w:pPr>
@@ -24577,6 +24983,7 @@
           </w:tcPr>
           <w:p>
             <w:pPr>
+              <w:keepNext/>
               <w:spacing w:before="0" w:after="0" w:line="252" w:lineRule="auto"/>
               <w:jc w:val="left"/>
             </w:pPr>
@@ -24604,6 +25011,7 @@
           </w:tcPr>
           <w:p>
             <w:pPr>
+              <w:keepNext/>
               <w:spacing w:before="0" w:after="0" w:line="252" w:lineRule="auto"/>
               <w:jc w:val="left"/>
             </w:pPr>
@@ -24636,6 +25044,7 @@
           </w:tcPr>
           <w:p>
             <w:pPr>
+              <w:keepNext/>
               <w:spacing w:before="0" w:after="0" w:line="252" w:lineRule="auto"/>
               <w:jc w:val="center"/>
             </w:pPr>
@@ -24663,6 +25072,7 @@
           </w:tcPr>
           <w:p>
             <w:pPr>
+              <w:keepNext/>
               <w:spacing w:before="0" w:after="0" w:line="252" w:lineRule="auto"/>
               <w:jc w:val="left"/>
             </w:pPr>
@@ -24690,6 +25100,7 @@
           </w:tcPr>
           <w:p>
             <w:pPr>
+              <w:keepNext/>
               <w:spacing w:before="0" w:after="0" w:line="252" w:lineRule="auto"/>
               <w:jc w:val="left"/>
             </w:pPr>
@@ -24717,6 +25128,7 @@
           </w:tcPr>
           <w:p>
             <w:pPr>
+              <w:keepNext/>
               <w:spacing w:before="0" w:after="0" w:line="252" w:lineRule="auto"/>
               <w:jc w:val="left"/>
             </w:pPr>
@@ -24749,6 +25161,7 @@
           </w:tcPr>
           <w:p>
             <w:pPr>
+              <w:keepNext/>
               <w:spacing w:before="0" w:after="0" w:line="252" w:lineRule="auto"/>
               <w:jc w:val="center"/>
             </w:pPr>
@@ -24776,6 +25189,7 @@
           </w:tcPr>
           <w:p>
             <w:pPr>
+              <w:keepNext/>
               <w:spacing w:before="0" w:after="0" w:line="252" w:lineRule="auto"/>
               <w:jc w:val="left"/>
             </w:pPr>
@@ -24803,6 +25217,7 @@
           </w:tcPr>
           <w:p>
             <w:pPr>
+              <w:keepNext/>
               <w:spacing w:before="0" w:after="0" w:line="252" w:lineRule="auto"/>
               <w:jc w:val="left"/>
             </w:pPr>
@@ -24830,6 +25245,7 @@
           </w:tcPr>
           <w:p>
             <w:pPr>
+              <w:keepNext/>
               <w:spacing w:before="0" w:after="0" w:line="252" w:lineRule="auto"/>
               <w:jc w:val="left"/>
             </w:pPr>
@@ -24862,6 +25278,7 @@
           </w:tcPr>
           <w:p>
             <w:pPr>
+              <w:keepNext/>
               <w:spacing w:before="0" w:after="0" w:line="252" w:lineRule="auto"/>
               <w:jc w:val="center"/>
             </w:pPr>
@@ -24889,6 +25306,7 @@
           </w:tcPr>
           <w:p>
             <w:pPr>
+              <w:keepNext/>
               <w:spacing w:before="0" w:after="0" w:line="252" w:lineRule="auto"/>
               <w:jc w:val="left"/>
             </w:pPr>
@@ -24916,6 +25334,7 @@
           </w:tcPr>
           <w:p>
             <w:pPr>
+              <w:keepNext/>
               <w:spacing w:before="0" w:after="0" w:line="252" w:lineRule="auto"/>
               <w:jc w:val="left"/>
             </w:pPr>
@@ -24943,6 +25362,7 @@
           </w:tcPr>
           <w:p>
             <w:pPr>
+              <w:keepNext/>
               <w:spacing w:before="0" w:after="0" w:line="252" w:lineRule="auto"/>
               <w:jc w:val="left"/>
             </w:pPr>
@@ -24975,6 +25395,7 @@
           </w:tcPr>
           <w:p>
             <w:pPr>
+              <w:keepNext/>
               <w:spacing w:before="0" w:after="0" w:line="252" w:lineRule="auto"/>
               <w:jc w:val="center"/>
             </w:pPr>
@@ -25002,6 +25423,7 @@
           </w:tcPr>
           <w:p>
             <w:pPr>
+              <w:keepNext/>
               <w:spacing w:before="0" w:after="0" w:line="252" w:lineRule="auto"/>
               <w:jc w:val="center"/>
             </w:pPr>
@@ -25029,6 +25451,7 @@
           </w:tcPr>
           <w:p>
             <w:pPr>
+              <w:keepNext/>
               <w:spacing w:before="0" w:after="0" w:line="252" w:lineRule="auto"/>
               <w:jc w:val="left"/>
             </w:pPr>
@@ -25056,6 +25479,7 @@
           </w:tcPr>
           <w:p>
             <w:pPr>
+              <w:keepNext/>
               <w:spacing w:before="0" w:after="0" w:line="252" w:lineRule="auto"/>
               <w:jc w:val="left"/>
             </w:pPr>
@@ -25088,6 +25512,7 @@
           </w:tcPr>
           <w:p>
             <w:pPr>
+              <w:keepNext/>
               <w:spacing w:before="0" w:after="0" w:line="252" w:lineRule="auto"/>
               <w:jc w:val="center"/>
             </w:pPr>
@@ -25115,6 +25540,7 @@
           </w:tcPr>
           <w:p>
             <w:pPr>
+              <w:keepNext/>
               <w:spacing w:before="0" w:after="0" w:line="252" w:lineRule="auto"/>
               <w:jc w:val="center"/>
             </w:pPr>
@@ -25142,6 +25568,7 @@
           </w:tcPr>
           <w:p>
             <w:pPr>
+              <w:keepNext/>
               <w:spacing w:before="0" w:after="0" w:line="252" w:lineRule="auto"/>
               <w:jc w:val="left"/>
             </w:pPr>
@@ -25169,6 +25596,7 @@
           </w:tcPr>
           <w:p>
             <w:pPr>
+              <w:keepNext/>
               <w:spacing w:before="0" w:after="0" w:line="252" w:lineRule="auto"/>
               <w:jc w:val="left"/>
             </w:pPr>
@@ -25201,6 +25629,7 @@
           </w:tcPr>
           <w:p>
             <w:pPr>
+              <w:keepNext w:val="0"/>
               <w:spacing w:before="0" w:after="0" w:line="252" w:lineRule="auto"/>
               <w:jc w:val="center"/>
             </w:pPr>
@@ -25228,6 +25657,7 @@
           </w:tcPr>
           <w:p>
             <w:pPr>
+              <w:keepNext w:val="0"/>
               <w:spacing w:before="0" w:after="0" w:line="252" w:lineRule="auto"/>
               <w:jc w:val="left"/>
             </w:pPr>
@@ -25255,6 +25685,7 @@
           </w:tcPr>
           <w:p>
             <w:pPr>
+              <w:keepNext w:val="0"/>
               <w:spacing w:before="0" w:after="0" w:line="252" w:lineRule="auto"/>
               <w:jc w:val="left"/>
             </w:pPr>
@@ -25282,6 +25713,7 @@
           </w:tcPr>
           <w:p>
             <w:pPr>
+              <w:keepNext w:val="0"/>
               <w:spacing w:before="0" w:after="0" w:line="252" w:lineRule="auto"/>
               <w:jc w:val="left"/>
             </w:pPr>
@@ -26538,6 +26970,7 @@
           </w:tcPr>
           <w:p>
             <w:pPr>
+              <w:keepNext/>
               <w:spacing w:before="0" w:after="0" w:line="252" w:lineRule="auto"/>
               <w:jc w:val="center"/>
             </w:pPr>
@@ -26565,6 +26998,7 @@
           </w:tcPr>
           <w:p>
             <w:pPr>
+              <w:keepNext/>
               <w:spacing w:before="0" w:after="0" w:line="252" w:lineRule="auto"/>
               <w:jc w:val="center"/>
             </w:pPr>
@@ -26592,6 +27026,7 @@
           </w:tcPr>
           <w:p>
             <w:pPr>
+              <w:keepNext/>
               <w:spacing w:before="0" w:after="0" w:line="252" w:lineRule="auto"/>
               <w:jc w:val="center"/>
             </w:pPr>
@@ -26619,6 +27054,7 @@
           </w:tcPr>
           <w:p>
             <w:pPr>
+              <w:keepNext/>
               <w:spacing w:before="0" w:after="0" w:line="252" w:lineRule="auto"/>
               <w:jc w:val="center"/>
             </w:pPr>
@@ -26646,6 +27082,7 @@
           </w:tcPr>
           <w:p>
             <w:pPr>
+              <w:keepNext/>
               <w:spacing w:before="0" w:after="0" w:line="252" w:lineRule="auto"/>
               <w:jc w:val="center"/>
             </w:pPr>
@@ -26673,6 +27110,7 @@
           </w:tcPr>
           <w:p>
             <w:pPr>
+              <w:keepNext/>
               <w:spacing w:before="0" w:after="0" w:line="252" w:lineRule="auto"/>
               <w:jc w:val="center"/>
             </w:pPr>
@@ -26705,6 +27143,7 @@
           </w:tcPr>
           <w:p>
             <w:pPr>
+              <w:keepNext/>
               <w:spacing w:before="0" w:after="0" w:line="252" w:lineRule="auto"/>
               <w:jc w:val="center"/>
             </w:pPr>
@@ -26732,6 +27171,7 @@
           </w:tcPr>
           <w:p>
             <w:pPr>
+              <w:keepNext/>
               <w:spacing w:before="0" w:after="0" w:line="252" w:lineRule="auto"/>
               <w:jc w:val="center"/>
             </w:pPr>
@@ -26759,6 +27199,7 @@
           </w:tcPr>
           <w:p>
             <w:pPr>
+              <w:keepNext/>
               <w:spacing w:before="0" w:after="0" w:line="252" w:lineRule="auto"/>
               <w:jc w:val="center"/>
             </w:pPr>
@@ -26786,6 +27227,7 @@
           </w:tcPr>
           <w:p>
             <w:pPr>
+              <w:keepNext/>
               <w:spacing w:before="0" w:after="0" w:line="252" w:lineRule="auto"/>
               <w:jc w:val="center"/>
             </w:pPr>
@@ -26813,6 +27255,7 @@
           </w:tcPr>
           <w:p>
             <w:pPr>
+              <w:keepNext/>
               <w:spacing w:before="0" w:after="0" w:line="252" w:lineRule="auto"/>
               <w:jc w:val="center"/>
             </w:pPr>
@@ -26840,6 +27283,7 @@
           </w:tcPr>
           <w:p>
             <w:pPr>
+              <w:keepNext/>
               <w:spacing w:before="0" w:after="0" w:line="252" w:lineRule="auto"/>
               <w:jc w:val="center"/>
             </w:pPr>
@@ -26872,6 +27316,7 @@
           </w:tcPr>
           <w:p>
             <w:pPr>
+              <w:keepNext/>
               <w:spacing w:before="0" w:after="0" w:line="252" w:lineRule="auto"/>
               <w:jc w:val="center"/>
             </w:pPr>
@@ -26899,6 +27344,7 @@
           </w:tcPr>
           <w:p>
             <w:pPr>
+              <w:keepNext/>
               <w:spacing w:before="0" w:after="0" w:line="252" w:lineRule="auto"/>
               <w:jc w:val="center"/>
             </w:pPr>
@@ -26926,6 +27372,7 @@
           </w:tcPr>
           <w:p>
             <w:pPr>
+              <w:keepNext/>
               <w:spacing w:before="0" w:after="0" w:line="252" w:lineRule="auto"/>
               <w:jc w:val="center"/>
             </w:pPr>
@@ -26953,6 +27400,7 @@
           </w:tcPr>
           <w:p>
             <w:pPr>
+              <w:keepNext/>
               <w:spacing w:before="0" w:after="0" w:line="252" w:lineRule="auto"/>
               <w:jc w:val="center"/>
             </w:pPr>
@@ -26980,6 +27428,7 @@
           </w:tcPr>
           <w:p>
             <w:pPr>
+              <w:keepNext/>
               <w:spacing w:before="0" w:after="0" w:line="252" w:lineRule="auto"/>
               <w:jc w:val="center"/>
             </w:pPr>
@@ -27007,6 +27456,7 @@
           </w:tcPr>
           <w:p>
             <w:pPr>
+              <w:keepNext/>
               <w:spacing w:before="0" w:after="0" w:line="252" w:lineRule="auto"/>
               <w:jc w:val="center"/>
             </w:pPr>
@@ -27039,6 +27489,7 @@
           </w:tcPr>
           <w:p>
             <w:pPr>
+              <w:keepNext/>
               <w:spacing w:before="0" w:after="0" w:line="252" w:lineRule="auto"/>
               <w:jc w:val="center"/>
             </w:pPr>
@@ -27066,6 +27517,7 @@
           </w:tcPr>
           <w:p>
             <w:pPr>
+              <w:keepNext/>
               <w:spacing w:before="0" w:after="0" w:line="252" w:lineRule="auto"/>
               <w:jc w:val="center"/>
             </w:pPr>
@@ -27093,6 +27545,7 @@
           </w:tcPr>
           <w:p>
             <w:pPr>
+              <w:keepNext/>
               <w:spacing w:before="0" w:after="0" w:line="252" w:lineRule="auto"/>
               <w:jc w:val="center"/>
             </w:pPr>
@@ -27120,6 +27573,7 @@
           </w:tcPr>
           <w:p>
             <w:pPr>
+              <w:keepNext/>
               <w:spacing w:before="0" w:after="0" w:line="252" w:lineRule="auto"/>
               <w:jc w:val="center"/>
             </w:pPr>
@@ -27147,6 +27601,7 @@
           </w:tcPr>
           <w:p>
             <w:pPr>
+              <w:keepNext/>
               <w:spacing w:before="0" w:after="0" w:line="252" w:lineRule="auto"/>
               <w:jc w:val="center"/>
             </w:pPr>
@@ -27174,6 +27629,7 @@
           </w:tcPr>
           <w:p>
             <w:pPr>
+              <w:keepNext/>
               <w:spacing w:before="0" w:after="0" w:line="252" w:lineRule="auto"/>
               <w:jc w:val="center"/>
             </w:pPr>
@@ -27206,6 +27662,7 @@
           </w:tcPr>
           <w:p>
             <w:pPr>
+              <w:keepNext/>
               <w:spacing w:before="0" w:after="0" w:line="252" w:lineRule="auto"/>
               <w:jc w:val="center"/>
             </w:pPr>
@@ -27233,6 +27690,7 @@
           </w:tcPr>
           <w:p>
             <w:pPr>
+              <w:keepNext/>
               <w:spacing w:before="0" w:after="0" w:line="252" w:lineRule="auto"/>
               <w:jc w:val="center"/>
             </w:pPr>
@@ -27260,6 +27718,7 @@
           </w:tcPr>
           <w:p>
             <w:pPr>
+              <w:keepNext/>
               <w:spacing w:before="0" w:after="0" w:line="252" w:lineRule="auto"/>
               <w:jc w:val="center"/>
             </w:pPr>
@@ -27287,6 +27746,7 @@
           </w:tcPr>
           <w:p>
             <w:pPr>
+              <w:keepNext/>
               <w:spacing w:before="0" w:after="0" w:line="252" w:lineRule="auto"/>
               <w:jc w:val="center"/>
             </w:pPr>
@@ -27314,6 +27774,7 @@
           </w:tcPr>
           <w:p>
             <w:pPr>
+              <w:keepNext/>
               <w:spacing w:before="0" w:after="0" w:line="252" w:lineRule="auto"/>
               <w:jc w:val="center"/>
             </w:pPr>
@@ -27341,6 +27802,7 @@
           </w:tcPr>
           <w:p>
             <w:pPr>
+              <w:keepNext/>
               <w:spacing w:before="0" w:after="0" w:line="252" w:lineRule="auto"/>
               <w:jc w:val="center"/>
             </w:pPr>
@@ -27373,6 +27835,7 @@
           </w:tcPr>
           <w:p>
             <w:pPr>
+              <w:keepNext/>
               <w:spacing w:before="0" w:after="0" w:line="252" w:lineRule="auto"/>
               <w:jc w:val="center"/>
             </w:pPr>
@@ -27400,6 +27863,7 @@
           </w:tcPr>
           <w:p>
             <w:pPr>
+              <w:keepNext/>
               <w:spacing w:before="0" w:after="0" w:line="252" w:lineRule="auto"/>
               <w:jc w:val="center"/>
             </w:pPr>
@@ -27427,6 +27891,7 @@
           </w:tcPr>
           <w:p>
             <w:pPr>
+              <w:keepNext/>
               <w:spacing w:before="0" w:after="0" w:line="252" w:lineRule="auto"/>
               <w:jc w:val="center"/>
             </w:pPr>
@@ -27454,6 +27919,7 @@
           </w:tcPr>
           <w:p>
             <w:pPr>
+              <w:keepNext/>
               <w:spacing w:before="0" w:after="0" w:line="252" w:lineRule="auto"/>
               <w:jc w:val="center"/>
             </w:pPr>
@@ -27481,6 +27947,7 @@
           </w:tcPr>
           <w:p>
             <w:pPr>
+              <w:keepNext/>
               <w:spacing w:before="0" w:after="0" w:line="252" w:lineRule="auto"/>
               <w:jc w:val="left"/>
             </w:pPr>
@@ -27508,6 +27975,7 @@
           </w:tcPr>
           <w:p>
             <w:pPr>
+              <w:keepNext/>
               <w:spacing w:before="0" w:after="0" w:line="252" w:lineRule="auto"/>
               <w:jc w:val="center"/>
             </w:pPr>
@@ -27540,6 +28008,7 @@
           </w:tcPr>
           <w:p>
             <w:pPr>
+              <w:keepNext w:val="0"/>
               <w:spacing w:before="0" w:after="0" w:line="252" w:lineRule="auto"/>
               <w:jc w:val="center"/>
             </w:pPr>
@@ -27567,6 +28036,7 @@
           </w:tcPr>
           <w:p>
             <w:pPr>
+              <w:keepNext w:val="0"/>
               <w:spacing w:before="0" w:after="0" w:line="252" w:lineRule="auto"/>
               <w:jc w:val="center"/>
             </w:pPr>
@@ -27594,6 +28064,7 @@
           </w:tcPr>
           <w:p>
             <w:pPr>
+              <w:keepNext w:val="0"/>
               <w:spacing w:before="0" w:after="0" w:line="252" w:lineRule="auto"/>
               <w:jc w:val="center"/>
             </w:pPr>
@@ -27621,6 +28092,7 @@
           </w:tcPr>
           <w:p>
             <w:pPr>
+              <w:keepNext w:val="0"/>
               <w:spacing w:before="0" w:after="0" w:line="252" w:lineRule="auto"/>
               <w:jc w:val="center"/>
             </w:pPr>
@@ -27648,6 +28120,7 @@
           </w:tcPr>
           <w:p>
             <w:pPr>
+              <w:keepNext w:val="0"/>
               <w:spacing w:before="0" w:after="0" w:line="252" w:lineRule="auto"/>
               <w:jc w:val="center"/>
             </w:pPr>
@@ -27675,6 +28148,7 @@
           </w:tcPr>
           <w:p>
             <w:pPr>
+              <w:keepNext w:val="0"/>
               <w:spacing w:before="0" w:after="0" w:line="252" w:lineRule="auto"/>
               <w:jc w:val="center"/>
             </w:pPr>
@@ -27838,6 +28312,7 @@
           </w:tcPr>
           <w:p>
             <w:pPr>
+              <w:keepNext/>
               <w:spacing w:before="0" w:after="0" w:line="252" w:lineRule="auto"/>
               <w:jc w:val="left"/>
             </w:pPr>
@@ -27865,6 +28340,7 @@
           </w:tcPr>
           <w:p>
             <w:pPr>
+              <w:keepNext/>
               <w:spacing w:before="0" w:after="0" w:line="252" w:lineRule="auto"/>
               <w:jc w:val="center"/>
             </w:pPr>
@@ -27892,6 +28368,7 @@
           </w:tcPr>
           <w:p>
             <w:pPr>
+              <w:keepNext/>
               <w:spacing w:before="0" w:after="0" w:line="252" w:lineRule="auto"/>
               <w:jc w:val="left"/>
             </w:pPr>
@@ -27978,6 +28455,7 @@
           </w:tcPr>
           <w:p>
             <w:pPr>
+              <w:keepNext/>
               <w:spacing w:before="0" w:after="0" w:line="252" w:lineRule="auto"/>
               <w:jc w:val="left"/>
             </w:pPr>
@@ -28005,6 +28483,7 @@
           </w:tcPr>
           <w:p>
             <w:pPr>
+              <w:keepNext/>
               <w:spacing w:before="0" w:after="0" w:line="252" w:lineRule="auto"/>
               <w:jc w:val="center"/>
             </w:pPr>
@@ -28032,6 +28511,7 @@
           </w:tcPr>
           <w:p>
             <w:pPr>
+              <w:keepNext/>
               <w:spacing w:before="0" w:after="0" w:line="252" w:lineRule="auto"/>
               <w:jc w:val="left"/>
             </w:pPr>
@@ -28118,6 +28598,7 @@
           </w:tcPr>
           <w:p>
             <w:pPr>
+              <w:keepNext/>
               <w:spacing w:before="0" w:after="0" w:line="252" w:lineRule="auto"/>
               <w:jc w:val="left"/>
             </w:pPr>
@@ -28145,6 +28626,7 @@
           </w:tcPr>
           <w:p>
             <w:pPr>
+              <w:keepNext/>
               <w:spacing w:before="0" w:after="0" w:line="252" w:lineRule="auto"/>
               <w:jc w:val="center"/>
             </w:pPr>
@@ -28172,6 +28654,7 @@
           </w:tcPr>
           <w:p>
             <w:pPr>
+              <w:keepNext/>
               <w:spacing w:before="0" w:after="0" w:line="252" w:lineRule="auto"/>
               <w:jc w:val="left"/>
             </w:pPr>
@@ -28276,6 +28759,7 @@
           </w:tcPr>
           <w:p>
             <w:pPr>
+              <w:keepNext/>
               <w:spacing w:before="0" w:after="0" w:line="252" w:lineRule="auto"/>
               <w:jc w:val="left"/>
             </w:pPr>
@@ -28303,6 +28787,7 @@
           </w:tcPr>
           <w:p>
             <w:pPr>
+              <w:keepNext/>
               <w:spacing w:before="0" w:after="0" w:line="252" w:lineRule="auto"/>
               <w:jc w:val="center"/>
             </w:pPr>
@@ -28330,6 +28815,7 @@
           </w:tcPr>
           <w:p>
             <w:pPr>
+              <w:keepNext/>
               <w:spacing w:before="0" w:after="0" w:line="252" w:lineRule="auto"/>
               <w:jc w:val="left"/>
             </w:pPr>
@@ -28425,6 +28911,7 @@
           </w:tcPr>
           <w:p>
             <w:pPr>
+              <w:keepNext/>
               <w:spacing w:before="0" w:after="0" w:line="252" w:lineRule="auto"/>
               <w:jc w:val="left"/>
             </w:pPr>
@@ -28452,6 +28939,7 @@
           </w:tcPr>
           <w:p>
             <w:pPr>
+              <w:keepNext/>
               <w:spacing w:before="0" w:after="0" w:line="252" w:lineRule="auto"/>
               <w:jc w:val="center"/>
             </w:pPr>
@@ -28479,6 +28967,7 @@
           </w:tcPr>
           <w:p>
             <w:pPr>
+              <w:keepNext/>
               <w:spacing w:before="0" w:after="0" w:line="252" w:lineRule="auto"/>
               <w:jc w:val="left"/>
             </w:pPr>
@@ -28583,6 +29072,7 @@
           </w:tcPr>
           <w:p>
             <w:pPr>
+              <w:keepNext w:val="0"/>
               <w:spacing w:before="0" w:after="0" w:line="252" w:lineRule="auto"/>
               <w:jc w:val="left"/>
             </w:pPr>
@@ -28610,6 +29100,7 @@
           </w:tcPr>
           <w:p>
             <w:pPr>
+              <w:keepNext w:val="0"/>
               <w:spacing w:before="0" w:after="0" w:line="252" w:lineRule="auto"/>
               <w:jc w:val="center"/>
             </w:pPr>
@@ -28637,6 +29128,7 @@
           </w:tcPr>
           <w:p>
             <w:pPr>
+              <w:keepNext w:val="0"/>
               <w:spacing w:before="0" w:after="0" w:line="252" w:lineRule="auto"/>
               <w:jc w:val="left"/>
             </w:pPr>
@@ -28847,6 +29339,7 @@
           </w:tcPr>
           <w:p>
             <w:pPr>
+              <w:keepNext/>
               <w:spacing w:before="0" w:after="0" w:line="252" w:lineRule="auto"/>
               <w:jc w:val="left"/>
             </w:pPr>
@@ -28874,6 +29367,7 @@
           </w:tcPr>
           <w:p>
             <w:pPr>
+              <w:keepNext/>
               <w:spacing w:before="0" w:after="0" w:line="252" w:lineRule="auto"/>
               <w:jc w:val="left"/>
             </w:pPr>
@@ -28901,6 +29395,7 @@
           </w:tcPr>
           <w:p>
             <w:pPr>
+              <w:keepNext/>
               <w:spacing w:before="0" w:after="0" w:line="252" w:lineRule="auto"/>
               <w:jc w:val="center"/>
             </w:pPr>
@@ -28933,6 +29428,7 @@
           </w:tcPr>
           <w:p>
             <w:pPr>
+              <w:keepNext/>
               <w:spacing w:before="0" w:after="0" w:line="252" w:lineRule="auto"/>
               <w:jc w:val="center"/>
             </w:pPr>
@@ -28960,6 +29456,7 @@
           </w:tcPr>
           <w:p>
             <w:pPr>
+              <w:keepNext/>
               <w:spacing w:before="0" w:after="0" w:line="252" w:lineRule="auto"/>
               <w:jc w:val="left"/>
             </w:pPr>
@@ -28987,6 +29484,7 @@
           </w:tcPr>
           <w:p>
             <w:pPr>
+              <w:keepNext/>
               <w:spacing w:before="0" w:after="0" w:line="252" w:lineRule="auto"/>
               <w:jc w:val="center"/>
             </w:pPr>
@@ -29019,6 +29517,7 @@
           </w:tcPr>
           <w:p>
             <w:pPr>
+              <w:keepNext/>
               <w:spacing w:before="0" w:after="0" w:line="252" w:lineRule="auto"/>
               <w:jc w:val="left"/>
             </w:pPr>
@@ -29046,6 +29545,7 @@
           </w:tcPr>
           <w:p>
             <w:pPr>
+              <w:keepNext/>
               <w:spacing w:before="0" w:after="0" w:line="252" w:lineRule="auto"/>
               <w:jc w:val="left"/>
             </w:pPr>
@@ -29073,6 +29573,7 @@
           </w:tcPr>
           <w:p>
             <w:pPr>
+              <w:keepNext/>
               <w:spacing w:before="0" w:after="0" w:line="252" w:lineRule="auto"/>
               <w:jc w:val="left"/>
             </w:pPr>
@@ -29105,6 +29606,7 @@
           </w:tcPr>
           <w:p>
             <w:pPr>
+              <w:keepNext/>
               <w:spacing w:before="0" w:after="0" w:line="252" w:lineRule="auto"/>
               <w:jc w:val="left"/>
             </w:pPr>
@@ -29132,6 +29634,7 @@
           </w:tcPr>
           <w:p>
             <w:pPr>
+              <w:keepNext/>
               <w:spacing w:before="0" w:after="0" w:line="252" w:lineRule="auto"/>
               <w:jc w:val="left"/>
             </w:pPr>
@@ -29159,6 +29662,7 @@
           </w:tcPr>
           <w:p>
             <w:pPr>
+              <w:keepNext/>
               <w:spacing w:before="0" w:after="0" w:line="252" w:lineRule="auto"/>
               <w:jc w:val="left"/>
             </w:pPr>
@@ -29191,6 +29695,7 @@
           </w:tcPr>
           <w:p>
             <w:pPr>
+              <w:keepNext/>
               <w:spacing w:before="0" w:after="0" w:line="252" w:lineRule="auto"/>
               <w:jc w:val="left"/>
             </w:pPr>
@@ -29218,6 +29723,7 @@
           </w:tcPr>
           <w:p>
             <w:pPr>
+              <w:keepNext/>
               <w:spacing w:before="0" w:after="0" w:line="252" w:lineRule="auto"/>
               <w:jc w:val="left"/>
             </w:pPr>
@@ -29245,6 +29751,7 @@
           </w:tcPr>
           <w:p>
             <w:pPr>
+              <w:keepNext/>
               <w:spacing w:before="0" w:after="0" w:line="252" w:lineRule="auto"/>
               <w:jc w:val="center"/>
             </w:pPr>
@@ -29277,6 +29784,7 @@
           </w:tcPr>
           <w:p>
             <w:pPr>
+              <w:keepNext/>
               <w:spacing w:before="0" w:after="0" w:line="252" w:lineRule="auto"/>
               <w:jc w:val="center"/>
             </w:pPr>
@@ -29304,6 +29812,7 @@
           </w:tcPr>
           <w:p>
             <w:pPr>
+              <w:keepNext/>
               <w:spacing w:before="0" w:after="0" w:line="252" w:lineRule="auto"/>
               <w:jc w:val="left"/>
             </w:pPr>
@@ -29331,6 +29840,7 @@
           </w:tcPr>
           <w:p>
             <w:pPr>
+              <w:keepNext/>
               <w:spacing w:before="0" w:after="0" w:line="252" w:lineRule="auto"/>
               <w:jc w:val="left"/>
             </w:pPr>
@@ -29363,6 +29873,7 @@
           </w:tcPr>
           <w:p>
             <w:pPr>
+              <w:keepNext/>
               <w:spacing w:before="0" w:after="0" w:line="252" w:lineRule="auto"/>
               <w:jc w:val="center"/>
             </w:pPr>
@@ -29390,6 +29901,7 @@
           </w:tcPr>
           <w:p>
             <w:pPr>
+              <w:keepNext/>
               <w:spacing w:before="0" w:after="0" w:line="252" w:lineRule="auto"/>
               <w:jc w:val="left"/>
             </w:pPr>
@@ -29418,6 +29930,7 @@
           </w:tcPr>
           <w:p>
             <w:pPr>
+              <w:keepNext/>
               <w:spacing w:before="0" w:after="0" w:line="252" w:lineRule="auto"/>
               <w:jc w:val="center"/>
             </w:pPr>
@@ -29450,6 +29963,7 @@
           </w:tcPr>
           <w:p>
             <w:pPr>
+              <w:keepNext/>
               <w:spacing w:before="0" w:after="0" w:line="252" w:lineRule="auto"/>
               <w:jc w:val="left"/>
             </w:pPr>
@@ -29477,6 +29991,7 @@
           </w:tcPr>
           <w:p>
             <w:pPr>
+              <w:keepNext/>
               <w:spacing w:before="0" w:after="0" w:line="252" w:lineRule="auto"/>
               <w:jc w:val="left"/>
             </w:pPr>
@@ -29505,6 +30020,7 @@
           </w:tcPr>
           <w:p>
             <w:pPr>
+              <w:keepNext/>
               <w:spacing w:before="0" w:after="0" w:line="252" w:lineRule="auto"/>
               <w:jc w:val="center"/>
             </w:pPr>
@@ -29537,6 +30053,7 @@
           </w:tcPr>
           <w:p>
             <w:pPr>
+              <w:keepNext w:val="0"/>
               <w:spacing w:before="0" w:after="0" w:line="252" w:lineRule="auto"/>
               <w:jc w:val="left"/>
             </w:pPr>
@@ -29564,6 +30081,7 @@
           </w:tcPr>
           <w:p>
             <w:pPr>
+              <w:keepNext w:val="0"/>
               <w:spacing w:before="0" w:after="0" w:line="252" w:lineRule="auto"/>
               <w:jc w:val="left"/>
             </w:pPr>
@@ -29592,6 +30110,7 @@
           </w:tcPr>
           <w:p>
             <w:pPr>
+              <w:keepNext w:val="0"/>
               <w:spacing w:before="0" w:after="0" w:line="252" w:lineRule="auto"/>
               <w:jc w:val="center"/>
             </w:pPr>
@@ -30244,6 +30763,7 @@
           </w:tcPr>
           <w:p>
             <w:pPr>
+              <w:keepNext/>
               <w:spacing w:before="0" w:after="0" w:line="252" w:lineRule="auto"/>
               <w:jc w:val="left"/>
             </w:pPr>
@@ -30271,6 +30791,7 @@
           </w:tcPr>
           <w:p>
             <w:pPr>
+              <w:keepNext/>
               <w:spacing w:before="0" w:after="0" w:line="252" w:lineRule="auto"/>
               <w:jc w:val="left"/>
             </w:pPr>
@@ -30298,6 +30819,7 @@
           </w:tcPr>
           <w:p>
             <w:pPr>
+              <w:keepNext/>
               <w:spacing w:before="0" w:after="0" w:line="252" w:lineRule="auto"/>
               <w:jc w:val="left"/>
             </w:pPr>
@@ -30330,6 +30852,7 @@
           </w:tcPr>
           <w:p>
             <w:pPr>
+              <w:keepNext/>
               <w:spacing w:before="0" w:after="0" w:line="252" w:lineRule="auto"/>
               <w:jc w:val="left"/>
             </w:pPr>
@@ -30357,6 +30880,7 @@
           </w:tcPr>
           <w:p>
             <w:pPr>
+              <w:keepNext/>
               <w:spacing w:before="0" w:after="0" w:line="252" w:lineRule="auto"/>
               <w:jc w:val="left"/>
             </w:pPr>
@@ -30384,6 +30908,7 @@
           </w:tcPr>
           <w:p>
             <w:pPr>
+              <w:keepNext/>
               <w:spacing w:before="0" w:after="0" w:line="252" w:lineRule="auto"/>
               <w:jc w:val="left"/>
             </w:pPr>
@@ -30416,6 +30941,7 @@
           </w:tcPr>
           <w:p>
             <w:pPr>
+              <w:keepNext/>
               <w:spacing w:before="0" w:after="0" w:line="252" w:lineRule="auto"/>
               <w:jc w:val="left"/>
             </w:pPr>
@@ -30443,6 +30969,7 @@
           </w:tcPr>
           <w:p>
             <w:pPr>
+              <w:keepNext/>
               <w:spacing w:before="0" w:after="0" w:line="252" w:lineRule="auto"/>
               <w:jc w:val="left"/>
             </w:pPr>
@@ -30470,6 +30997,7 @@
           </w:tcPr>
           <w:p>
             <w:pPr>
+              <w:keepNext/>
               <w:spacing w:before="0" w:after="0" w:line="252" w:lineRule="auto"/>
               <w:jc w:val="center"/>
             </w:pPr>
@@ -30502,6 +31030,7 @@
           </w:tcPr>
           <w:p>
             <w:pPr>
+              <w:keepNext/>
               <w:spacing w:before="0" w:after="0" w:line="252" w:lineRule="auto"/>
               <w:jc w:val="left"/>
             </w:pPr>
@@ -30529,6 +31058,7 @@
           </w:tcPr>
           <w:p>
             <w:pPr>
+              <w:keepNext/>
               <w:spacing w:before="0" w:after="0" w:line="252" w:lineRule="auto"/>
               <w:jc w:val="left"/>
             </w:pPr>
@@ -30556,6 +31086,7 @@
           </w:tcPr>
           <w:p>
             <w:pPr>
+              <w:keepNext/>
               <w:spacing w:before="0" w:after="0" w:line="252" w:lineRule="auto"/>
               <w:jc w:val="left"/>
             </w:pPr>
@@ -30588,6 +31119,7 @@
           </w:tcPr>
           <w:p>
             <w:pPr>
+              <w:keepNext w:val="0"/>
               <w:spacing w:before="0" w:after="0" w:line="252" w:lineRule="auto"/>
               <w:jc w:val="left"/>
             </w:pPr>
@@ -30615,6 +31147,7 @@
           </w:tcPr>
           <w:p>
             <w:pPr>
+              <w:keepNext w:val="0"/>
               <w:spacing w:before="0" w:after="0" w:line="252" w:lineRule="auto"/>
               <w:jc w:val="left"/>
             </w:pPr>
@@ -30642,6 +31175,7 @@
           </w:tcPr>
           <w:p>
             <w:pPr>
+              <w:keepNext w:val="0"/>
               <w:spacing w:before="0" w:after="0" w:line="252" w:lineRule="auto"/>
               <w:jc w:val="left"/>
             </w:pPr>
@@ -30890,6 +31424,7 @@
           </w:tcPr>
           <w:p>
             <w:pPr>
+              <w:keepNext/>
               <w:spacing w:before="0" w:after="0" w:line="252" w:lineRule="auto"/>
               <w:jc w:val="center"/>
             </w:pPr>
@@ -30917,6 +31452,7 @@
           </w:tcPr>
           <w:p>
             <w:pPr>
+              <w:keepNext/>
               <w:spacing w:before="0" w:after="0" w:line="252" w:lineRule="auto"/>
               <w:jc w:val="left"/>
             </w:pPr>
@@ -30944,6 +31480,7 @@
           </w:tcPr>
           <w:p>
             <w:pPr>
+              <w:keepNext/>
               <w:spacing w:before="0" w:after="0" w:line="252" w:lineRule="auto"/>
               <w:jc w:val="left"/>
             </w:pPr>
@@ -30971,6 +31508,7 @@
           </w:tcPr>
           <w:p>
             <w:pPr>
+              <w:keepNext/>
               <w:spacing w:before="0" w:after="0" w:line="252" w:lineRule="auto"/>
               <w:jc w:val="left"/>
             </w:pPr>
@@ -30998,6 +31536,7 @@
           </w:tcPr>
           <w:p>
             <w:pPr>
+              <w:keepNext/>
               <w:spacing w:before="0" w:after="0" w:line="252" w:lineRule="auto"/>
               <w:jc w:val="center"/>
             </w:pPr>
@@ -31025,6 +31564,7 @@
           </w:tcPr>
           <w:p>
             <w:pPr>
+              <w:keepNext/>
               <w:spacing w:before="0" w:after="0" w:line="252" w:lineRule="auto"/>
               <w:jc w:val="left"/>
             </w:pPr>
@@ -31057,6 +31597,7 @@
           </w:tcPr>
           <w:p>
             <w:pPr>
+              <w:keepNext/>
               <w:spacing w:before="0" w:after="0" w:line="252" w:lineRule="auto"/>
               <w:jc w:val="center"/>
             </w:pPr>
@@ -31084,6 +31625,7 @@
           </w:tcPr>
           <w:p>
             <w:pPr>
+              <w:keepNext/>
               <w:spacing w:before="0" w:after="0" w:line="252" w:lineRule="auto"/>
               <w:jc w:val="center"/>
             </w:pPr>
@@ -31111,6 +31653,7 @@
           </w:tcPr>
           <w:p>
             <w:pPr>
+              <w:keepNext/>
               <w:spacing w:before="0" w:after="0" w:line="252" w:lineRule="auto"/>
               <w:jc w:val="left"/>
             </w:pPr>
@@ -31138,6 +31681,7 @@
           </w:tcPr>
           <w:p>
             <w:pPr>
+              <w:keepNext/>
               <w:spacing w:before="0" w:after="0" w:line="252" w:lineRule="auto"/>
               <w:jc w:val="left"/>
             </w:pPr>
@@ -31165,6 +31709,7 @@
           </w:tcPr>
           <w:p>
             <w:pPr>
+              <w:keepNext/>
               <w:spacing w:before="0" w:after="0" w:line="252" w:lineRule="auto"/>
               <w:jc w:val="left"/>
             </w:pPr>
@@ -31192,6 +31737,7 @@
           </w:tcPr>
           <w:p>
             <w:pPr>
+              <w:keepNext/>
               <w:spacing w:before="0" w:after="0" w:line="252" w:lineRule="auto"/>
               <w:jc w:val="left"/>
             </w:pPr>
@@ -31224,6 +31770,7 @@
           </w:tcPr>
           <w:p>
             <w:pPr>
+              <w:keepNext/>
               <w:spacing w:before="0" w:after="0" w:line="252" w:lineRule="auto"/>
               <w:jc w:val="center"/>
             </w:pPr>
@@ -31251,6 +31798,7 @@
           </w:tcPr>
           <w:p>
             <w:pPr>
+              <w:keepNext/>
               <w:spacing w:before="0" w:after="0" w:line="252" w:lineRule="auto"/>
               <w:jc w:val="left"/>
             </w:pPr>
@@ -31278,6 +31826,7 @@
           </w:tcPr>
           <w:p>
             <w:pPr>
+              <w:keepNext/>
               <w:spacing w:before="0" w:after="0" w:line="252" w:lineRule="auto"/>
               <w:jc w:val="left"/>
             </w:pPr>
@@ -31305,6 +31854,7 @@
           </w:tcPr>
           <w:p>
             <w:pPr>
+              <w:keepNext/>
               <w:spacing w:before="0" w:after="0" w:line="252" w:lineRule="auto"/>
               <w:jc w:val="left"/>
             </w:pPr>
@@ -31332,6 +31882,7 @@
           </w:tcPr>
           <w:p>
             <w:pPr>
+              <w:keepNext/>
               <w:spacing w:before="0" w:after="0" w:line="252" w:lineRule="auto"/>
               <w:jc w:val="left"/>
             </w:pPr>
@@ -31359,6 +31910,7 @@
           </w:tcPr>
           <w:p>
             <w:pPr>
+              <w:keepNext/>
               <w:spacing w:before="0" w:after="0" w:line="252" w:lineRule="auto"/>
               <w:jc w:val="left"/>
             </w:pPr>
@@ -31391,6 +31943,7 @@
           </w:tcPr>
           <w:p>
             <w:pPr>
+              <w:keepNext/>
               <w:spacing w:before="0" w:after="0" w:line="252" w:lineRule="auto"/>
               <w:jc w:val="center"/>
             </w:pPr>
@@ -31418,6 +31971,7 @@
           </w:tcPr>
           <w:p>
             <w:pPr>
+              <w:keepNext/>
               <w:spacing w:before="0" w:after="0" w:line="252" w:lineRule="auto"/>
               <w:jc w:val="center"/>
             </w:pPr>
@@ -31445,6 +31999,7 @@
           </w:tcPr>
           <w:p>
             <w:pPr>
+              <w:keepNext/>
               <w:spacing w:before="0" w:after="0" w:line="252" w:lineRule="auto"/>
               <w:jc w:val="left"/>
             </w:pPr>
@@ -31472,6 +32027,7 @@
           </w:tcPr>
           <w:p>
             <w:pPr>
+              <w:keepNext/>
               <w:spacing w:before="0" w:after="0" w:line="252" w:lineRule="auto"/>
               <w:jc w:val="left"/>
             </w:pPr>
@@ -31499,6 +32055,7 @@
           </w:tcPr>
           <w:p>
             <w:pPr>
+              <w:keepNext/>
               <w:spacing w:before="0" w:after="0" w:line="252" w:lineRule="auto"/>
               <w:jc w:val="left"/>
             </w:pPr>
@@ -31526,6 +32083,7 @@
           </w:tcPr>
           <w:p>
             <w:pPr>
+              <w:keepNext/>
               <w:spacing w:before="0" w:after="0" w:line="252" w:lineRule="auto"/>
               <w:jc w:val="left"/>
             </w:pPr>
@@ -31558,6 +32116,7 @@
           </w:tcPr>
           <w:p>
             <w:pPr>
+              <w:keepNext w:val="0"/>
               <w:spacing w:before="0" w:after="0" w:line="252" w:lineRule="auto"/>
               <w:jc w:val="center"/>
             </w:pPr>
@@ -31585,6 +32144,7 @@
           </w:tcPr>
           <w:p>
             <w:pPr>
+              <w:keepNext w:val="0"/>
               <w:spacing w:before="0" w:after="0" w:line="252" w:lineRule="auto"/>
               <w:jc w:val="center"/>
             </w:pPr>
@@ -31612,6 +32172,7 @@
           </w:tcPr>
           <w:p>
             <w:pPr>
+              <w:keepNext w:val="0"/>
               <w:spacing w:before="0" w:after="0" w:line="252" w:lineRule="auto"/>
               <w:jc w:val="left"/>
             </w:pPr>
@@ -31639,6 +32200,7 @@
           </w:tcPr>
           <w:p>
             <w:pPr>
+              <w:keepNext w:val="0"/>
               <w:spacing w:before="0" w:after="0" w:line="252" w:lineRule="auto"/>
               <w:jc w:val="left"/>
             </w:pPr>
@@ -31666,6 +32228,7 @@
           </w:tcPr>
           <w:p>
             <w:pPr>
+              <w:keepNext w:val="0"/>
               <w:spacing w:before="0" w:after="0" w:line="252" w:lineRule="auto"/>
               <w:jc w:val="center"/>
             </w:pPr>
@@ -31693,6 +32256,7 @@
           </w:tcPr>
           <w:p>
             <w:pPr>
+              <w:keepNext w:val="0"/>
               <w:spacing w:before="0" w:after="0" w:line="252" w:lineRule="auto"/>
               <w:jc w:val="left"/>
             </w:pPr>
@@ -31788,7 +32352,7 @@
         <w:color w:val="596573"/>
         <w:sz w:val="17"/>
       </w:rPr>
-      <w:t xml:space="preserve">   |   source 145b2e6c</w:t>
+      <w:t xml:space="preserve">   |   source 9f7287fc</w:t>
     </w:r>
   </w:p>
 </w:hdr>

</xml_diff>

<commit_message>
Republish thesis artifacts after final review
</commit_message>
<xml_diff>
--- a/thesis/output/VEGO-AI-MSc-Thesis-Evidence-Ready-Draft-2026-07-25.docx
+++ b/thesis/output/VEGO-AI-MSc-Thesis-Evidence-Ready-Draft-2026-07-25.docx
@@ -82,7 +82,7 @@
         <w:br/>
         <w:t>25 July 2026</w:t>
         <w:br/>
-        <w:t>Source revision 9f7287fc1d00</w:t>
+        <w:t>Source revision 304e6596c1a8</w:t>
       </w:r>
     </w:p>
     <w:p>
@@ -30527,7 +30527,7 @@
         <w:t xml:space="preserve">16. </w:t>
       </w:r>
       <w:r>
-        <w:t>Current verified inventory passes (105 VEGO-AI tests, 82 research-infrastructure tests plus 7 subtests, and 39 offline H-layer tests)</w:t>
+        <w:t>Current verified inventory passes (106 VEGO-AI tests, 82 research-infrastructure tests plus 7 subtests, and 39 offline H-layer tests)</w:t>
       </w:r>
     </w:p>
     <w:p>
@@ -31097,7 +31097,7 @@
                 <w:color w:val="1E232A"/>
                 <w:sz w:val="18"/>
               </w:rPr>
-              <w:t>105 VEGO-AI tests, 82 research-infrastructure tests plus 7 subtests, and 39 offline H-layer tests pass</w:t>
+              <w:t>106 VEGO-AI tests, 82 research-infrastructure tests plus 7 subtests, and 39 offline H-layer tests pass</w:t>
             </w:r>
           </w:p>
         </w:tc>
@@ -32352,7 +32352,7 @@
         <w:color w:val="596573"/>
         <w:sz w:val="17"/>
       </w:rPr>
-      <w:t xml:space="preserve">   |   source 9f7287fc</w:t>
+      <w:t xml:space="preserve">   |   source 304e6596</w:t>
     </w:r>
   </w:p>
 </w:hdr>

</xml_diff>

<commit_message>
Republish thesis after authorization review
</commit_message>
<xml_diff>
--- a/thesis/output/VEGO-AI-MSc-Thesis-Evidence-Ready-Draft-2026-07-25.docx
+++ b/thesis/output/VEGO-AI-MSc-Thesis-Evidence-Ready-Draft-2026-07-25.docx
@@ -82,7 +82,7 @@
         <w:br/>
         <w:t>25 July 2026</w:t>
         <w:br/>
-        <w:t>Source revision 304e6596c1a8</w:t>
+        <w:t>Source revision 20dd84a5022c</w:t>
       </w:r>
     </w:p>
     <w:p>
@@ -30527,7 +30527,7 @@
         <w:t xml:space="preserve">16. </w:t>
       </w:r>
       <w:r>
-        <w:t>Current verified inventory passes (106 VEGO-AI tests, 82 research-infrastructure tests plus 7 subtests, and 39 offline H-layer tests)</w:t>
+        <w:t>Current verified inventory passes (106 VEGO-AI tests, 84 research-infrastructure tests plus 7 subtests, and 39 offline H-layer tests)</w:t>
       </w:r>
     </w:p>
     <w:p>
@@ -31097,7 +31097,7 @@
                 <w:color w:val="1E232A"/>
                 <w:sz w:val="18"/>
               </w:rPr>
-              <w:t>106 VEGO-AI tests, 82 research-infrastructure tests plus 7 subtests, and 39 offline H-layer tests pass</w:t>
+              <w:t>106 VEGO-AI tests, 84 research-infrastructure tests plus 7 subtests, and 39 offline H-layer tests pass</w:t>
             </w:r>
           </w:p>
         </w:tc>
@@ -32352,7 +32352,7 @@
         <w:color w:val="596573"/>
         <w:sz w:val="17"/>
       </w:rPr>
-      <w:t xml:space="preserve">   |   source 304e6596</w:t>
+      <w:t xml:space="preserve">   |   source 20dd84a5</w:t>
     </w:r>
   </w:p>
 </w:hdr>

</xml_diff>

<commit_message>
Republish thesis after encrypted-key review
</commit_message>
<xml_diff>
--- a/thesis/output/VEGO-AI-MSc-Thesis-Evidence-Ready-Draft-2026-07-25.docx
+++ b/thesis/output/VEGO-AI-MSc-Thesis-Evidence-Ready-Draft-2026-07-25.docx
@@ -82,7 +82,7 @@
         <w:br/>
         <w:t>25 July 2026</w:t>
         <w:br/>
-        <w:t>Source revision 20dd84a5022c</w:t>
+        <w:t>Source revision 806998c56bf7</w:t>
       </w:r>
     </w:p>
     <w:p>
@@ -30527,7 +30527,7 @@
         <w:t xml:space="preserve">16. </w:t>
       </w:r>
       <w:r>
-        <w:t>Current verified inventory passes (106 VEGO-AI tests, 84 research-infrastructure tests plus 7 subtests, and 39 offline H-layer tests)</w:t>
+        <w:t>Current verified inventory passes (106 VEGO-AI tests, 85 research-infrastructure tests plus 7 subtests, and 39 offline H-layer tests)</w:t>
       </w:r>
     </w:p>
     <w:p>
@@ -31097,7 +31097,7 @@
                 <w:color w:val="1E232A"/>
                 <w:sz w:val="18"/>
               </w:rPr>
-              <w:t>106 VEGO-AI tests, 84 research-infrastructure tests plus 7 subtests, and 39 offline H-layer tests pass</w:t>
+              <w:t>106 VEGO-AI tests, 85 research-infrastructure tests plus 7 subtests, and 39 offline H-layer tests pass</w:t>
             </w:r>
           </w:p>
         </w:tc>
@@ -32352,7 +32352,7 @@
         <w:color w:val="596573"/>
         <w:sz w:val="17"/>
       </w:rPr>
-      <w:t xml:space="preserve">   |   source 20dd84a5</w:t>
+      <w:t xml:space="preserve">   |   source 806998c5</w:t>
     </w:r>
   </w:p>
 </w:hdr>

</xml_diff>

<commit_message>
Republish thesis after security audit ratchet
</commit_message>
<xml_diff>
--- a/thesis/output/VEGO-AI-MSc-Thesis-Evidence-Ready-Draft-2026-07-25.docx
+++ b/thesis/output/VEGO-AI-MSc-Thesis-Evidence-Ready-Draft-2026-07-25.docx
@@ -82,7 +82,7 @@
         <w:br/>
         <w:t>25 July 2026</w:t>
         <w:br/>
-        <w:t>Source revision 806998c56bf7</w:t>
+        <w:t>Source revision 0dd685ceb58c</w:t>
       </w:r>
     </w:p>
     <w:p>
@@ -32352,7 +32352,7 @@
         <w:color w:val="596573"/>
         <w:sz w:val="17"/>
       </w:rPr>
-      <w:t xml:space="preserve">   |   source 806998c5</w:t>
+      <w:t xml:space="preserve">   |   source 0dd685ce</w:t>
     </w:r>
   </w:p>
 </w:hdr>

</xml_diff>

<commit_message>
Republish thesis with squash-safe provenance
</commit_message>
<xml_diff>
--- a/thesis/output/VEGO-AI-MSc-Thesis-Evidence-Ready-Draft-2026-07-25.docx
+++ b/thesis/output/VEGO-AI-MSc-Thesis-Evidence-Ready-Draft-2026-07-25.docx
@@ -82,7 +82,7 @@
         <w:br/>
         <w:t>25 July 2026</w:t>
         <w:br/>
-        <w:t>Source revision 0dd685ceb58c</w:t>
+        <w:t>Source revision 0e94b0c369b4</w:t>
       </w:r>
     </w:p>
     <w:p>
@@ -30527,7 +30527,7 @@
         <w:t xml:space="preserve">16. </w:t>
       </w:r>
       <w:r>
-        <w:t>Current verified inventory passes (106 VEGO-AI tests, 85 research-infrastructure tests plus 7 subtests, and 39 offline H-layer tests)</w:t>
+        <w:t>Current verified inventory passes (106 VEGO-AI tests, 86 research-infrastructure tests plus 7 subtests, and 39 offline H-layer tests)</w:t>
       </w:r>
     </w:p>
     <w:p>
@@ -31097,7 +31097,7 @@
                 <w:color w:val="1E232A"/>
                 <w:sz w:val="18"/>
               </w:rPr>
-              <w:t>106 VEGO-AI tests, 85 research-infrastructure tests plus 7 subtests, and 39 offline H-layer tests pass</w:t>
+              <w:t>106 VEGO-AI tests, 86 research-infrastructure tests plus 7 subtests, and 39 offline H-layer tests pass</w:t>
             </w:r>
           </w:p>
         </w:tc>
@@ -32352,7 +32352,7 @@
         <w:color w:val="596573"/>
         <w:sz w:val="17"/>
       </w:rPr>
-      <w:t xml:space="preserve">   |   source 0dd685ce</w:t>
+      <w:t xml:space="preserve">   |   source 0e94b0c3</w:t>
     </w:r>
   </w:p>
 </w:hdr>

</xml_diff>

<commit_message>
Republish thesis after interaction log review
</commit_message>
<xml_diff>
--- a/thesis/output/VEGO-AI-MSc-Thesis-Evidence-Ready-Draft-2026-07-25.docx
+++ b/thesis/output/VEGO-AI-MSc-Thesis-Evidence-Ready-Draft-2026-07-25.docx
@@ -82,7 +82,7 @@
         <w:br/>
         <w:t>25 July 2026</w:t>
         <w:br/>
-        <w:t>Source revision 0e94b0c369b4</w:t>
+        <w:t>Source revision f77b718f395a</w:t>
       </w:r>
     </w:p>
     <w:p>
@@ -32352,7 +32352,7 @@
         <w:color w:val="596573"/>
         <w:sz w:val="17"/>
       </w:rPr>
-      <w:t xml:space="preserve">   |   source 0e94b0c3</w:t>
+      <w:t xml:space="preserve">   |   source f77b718f</w:t>
     </w:r>
   </w:p>
 </w:hdr>

</xml_diff>

<commit_message>
Republish thesis after parity portability review
</commit_message>
<xml_diff>
--- a/thesis/output/VEGO-AI-MSc-Thesis-Evidence-Ready-Draft-2026-07-25.docx
+++ b/thesis/output/VEGO-AI-MSc-Thesis-Evidence-Ready-Draft-2026-07-25.docx
@@ -82,7 +82,7 @@
         <w:br/>
         <w:t>25 July 2026</w:t>
         <w:br/>
-        <w:t>Source revision f77b718f395a</w:t>
+        <w:t>Source revision 0b83dffcdd99</w:t>
       </w:r>
     </w:p>
     <w:p>
@@ -32352,7 +32352,7 @@
         <w:color w:val="596573"/>
         <w:sz w:val="17"/>
       </w:rPr>
-      <w:t xml:space="preserve">   |   source f77b718f</w:t>
+      <w:t xml:space="preserve">   |   source 0b83dffc</w:t>
     </w:r>
   </w:p>
 </w:hdr>

</xml_diff>

<commit_message>
Publish thesis with reconciled test evidence
</commit_message>
<xml_diff>
--- a/thesis/output/VEGO-AI-MSc-Thesis-Evidence-Ready-Draft-2026-07-25.docx
+++ b/thesis/output/VEGO-AI-MSc-Thesis-Evidence-Ready-Draft-2026-07-25.docx
@@ -82,7 +82,7 @@
         <w:br/>
         <w:t>25 July 2026</w:t>
         <w:br/>
-        <w:t>Source revision 0b83dffcdd99</w:t>
+        <w:t>Source revision f2abc5f37d1d</w:t>
       </w:r>
     </w:p>
     <w:p>
@@ -30527,7 +30527,7 @@
         <w:t xml:space="preserve">16. </w:t>
       </w:r>
       <w:r>
-        <w:t>Current verified inventory passes (106 VEGO-AI tests, 86 research-infrastructure tests plus 7 subtests, and 39 offline H-layer tests)</w:t>
+        <w:t>Current verified inventory passes (106 VEGO-AI tests, 89 research-infrastructure tests plus 7 subtests, and 39 offline H-layer tests)</w:t>
       </w:r>
     </w:p>
     <w:p>
@@ -31097,7 +31097,7 @@
                 <w:color w:val="1E232A"/>
                 <w:sz w:val="18"/>
               </w:rPr>
-              <w:t>106 VEGO-AI tests, 86 research-infrastructure tests plus 7 subtests, and 39 offline H-layer tests pass</w:t>
+              <w:t>106 VEGO-AI tests, 89 research-infrastructure tests plus 7 subtests, and 39 offline H-layer tests pass</w:t>
             </w:r>
           </w:p>
         </w:tc>
@@ -32352,7 +32352,7 @@
         <w:color w:val="596573"/>
         <w:sz w:val="17"/>
       </w:rPr>
-      <w:t xml:space="preserve">   |   source 0b83dffc</w:t>
+      <w:t xml:space="preserve">   |   source f2abc5f3</w:t>
     </w:r>
   </w:p>
 </w:hdr>

</xml_diff>

<commit_message>
Republish thesis after history scan hardening
</commit_message>
<xml_diff>
--- a/thesis/output/VEGO-AI-MSc-Thesis-Evidence-Ready-Draft-2026-07-25.docx
+++ b/thesis/output/VEGO-AI-MSc-Thesis-Evidence-Ready-Draft-2026-07-25.docx
@@ -82,7 +82,7 @@
         <w:br/>
         <w:t>25 July 2026</w:t>
         <w:br/>
-        <w:t>Source revision f2abc5f37d1d</w:t>
+        <w:t>Source revision a23541c24a31</w:t>
       </w:r>
     </w:p>
     <w:p>
@@ -30527,7 +30527,7 @@
         <w:t xml:space="preserve">16. </w:t>
       </w:r>
       <w:r>
-        <w:t>Current verified inventory passes (106 VEGO-AI tests, 89 research-infrastructure tests plus 7 subtests, and 39 offline H-layer tests)</w:t>
+        <w:t>Current verified inventory passes (106 VEGO-AI tests, 91 research-infrastructure tests plus 7 subtests, and 39 offline H-layer tests)</w:t>
       </w:r>
     </w:p>
     <w:p>
@@ -31097,7 +31097,7 @@
                 <w:color w:val="1E232A"/>
                 <w:sz w:val="18"/>
               </w:rPr>
-              <w:t>106 VEGO-AI tests, 89 research-infrastructure tests plus 7 subtests, and 39 offline H-layer tests pass</w:t>
+              <w:t>106 VEGO-AI tests, 91 research-infrastructure tests plus 7 subtests, and 39 offline H-layer tests pass</w:t>
             </w:r>
           </w:p>
         </w:tc>
@@ -32352,7 +32352,7 @@
         <w:color w:val="596573"/>
         <w:sz w:val="17"/>
       </w:rPr>
-      <w:t xml:space="preserve">   |   source f2abc5f3</w:t>
+      <w:t xml:space="preserve">   |   source a23541c2</w:t>
     </w:r>
   </w:p>
 </w:hdr>

</xml_diff>

<commit_message>
Republish evidence package after review hardening
</commit_message>
<xml_diff>
--- a/thesis/output/VEGO-AI-MSc-Thesis-Evidence-Ready-Draft-2026-07-25.docx
+++ b/thesis/output/VEGO-AI-MSc-Thesis-Evidence-Ready-Draft-2026-07-25.docx
@@ -82,7 +82,7 @@
         <w:br/>
         <w:t>25 July 2026</w:t>
         <w:br/>
-        <w:t>Source revision a23541c24a31</w:t>
+        <w:t>Source revision 62b31b92119c</w:t>
       </w:r>
     </w:p>
     <w:p>
@@ -32352,7 +32352,7 @@
         <w:color w:val="596573"/>
         <w:sz w:val="17"/>
       </w:rPr>
-      <w:t xml:space="preserve">   |   source a23541c2</w:t>
+      <w:t xml:space="preserve">   |   source 62b31b92</w:t>
     </w:r>
   </w:p>
 </w:hdr>

</xml_diff>

<commit_message>
Republish package after final security review
</commit_message>
<xml_diff>
--- a/thesis/output/VEGO-AI-MSc-Thesis-Evidence-Ready-Draft-2026-07-25.docx
+++ b/thesis/output/VEGO-AI-MSc-Thesis-Evidence-Ready-Draft-2026-07-25.docx
@@ -82,7 +82,7 @@
         <w:br/>
         <w:t>25 July 2026</w:t>
         <w:br/>
-        <w:t>Source revision 62b31b92119c</w:t>
+        <w:t>Source revision b8d68338ce56</w:t>
       </w:r>
     </w:p>
     <w:p>
@@ -32352,7 +32352,7 @@
         <w:color w:val="596573"/>
         <w:sz w:val="17"/>
       </w:rPr>
-      <w:t xml:space="preserve">   |   source 62b31b92</w:t>
+      <w:t xml:space="preserve">   |   source b8d68338</w:t>
     </w:r>
   </w:p>
 </w:hdr>

</xml_diff>

<commit_message>
Republish package after final exact-head review
</commit_message>
<xml_diff>
--- a/thesis/output/VEGO-AI-MSc-Thesis-Evidence-Ready-Draft-2026-07-25.docx
+++ b/thesis/output/VEGO-AI-MSc-Thesis-Evidence-Ready-Draft-2026-07-25.docx
@@ -82,7 +82,7 @@
         <w:br/>
         <w:t>25 July 2026</w:t>
         <w:br/>
-        <w:t>Source revision b8d68338ce56</w:t>
+        <w:t>Source revision 5d9b8139cf65</w:t>
       </w:r>
     </w:p>
     <w:p>
@@ -32352,7 +32352,7 @@
         <w:color w:val="596573"/>
         <w:sz w:val="17"/>
       </w:rPr>
-      <w:t xml:space="preserve">   |   source b8d68338</w:t>
+      <w:t xml:space="preserve">   |   source 5d9b8139</w:t>
     </w:r>
   </w:p>
 </w:hdr>

</xml_diff>

<commit_message>
Republish package with reconciled verification state
</commit_message>
<xml_diff>
--- a/thesis/output/VEGO-AI-MSc-Thesis-Evidence-Ready-Draft-2026-07-25.docx
+++ b/thesis/output/VEGO-AI-MSc-Thesis-Evidence-Ready-Draft-2026-07-25.docx
@@ -82,7 +82,7 @@
         <w:br/>
         <w:t>25 July 2026</w:t>
         <w:br/>
-        <w:t>Source revision 5d9b8139cf65</w:t>
+        <w:t>Source revision 462321dc15d6</w:t>
       </w:r>
     </w:p>
     <w:p>
@@ -30527,7 +30527,7 @@
         <w:t xml:space="preserve">16. </w:t>
       </w:r>
       <w:r>
-        <w:t>Current verified inventory passes (106 VEGO-AI tests, 91 research-infrastructure tests plus 7 subtests, and 39 offline H-layer tests)</w:t>
+        <w:t>Current verified inventory passes (108 VEGO-AI tests, 92 research-infrastructure tests plus 7 subtests, and 41 offline H-layer tests)</w:t>
       </w:r>
     </w:p>
     <w:p>
@@ -31097,7 +31097,7 @@
                 <w:color w:val="1E232A"/>
                 <w:sz w:val="18"/>
               </w:rPr>
-              <w:t>106 VEGO-AI tests, 91 research-infrastructure tests plus 7 subtests, and 39 offline H-layer tests pass</w:t>
+              <w:t>108 VEGO-AI tests, 92 research-infrastructure tests plus 7 subtests, and 41 offline H-layer tests pass</w:t>
             </w:r>
           </w:p>
         </w:tc>
@@ -32352,7 +32352,7 @@
         <w:color w:val="596573"/>
         <w:sz w:val="17"/>
       </w:rPr>
-      <w:t xml:space="preserve">   |   source 5d9b8139</w:t>
+      <w:t xml:space="preserve">   |   source 462321dc</w:t>
     </w:r>
   </w:p>
 </w:hdr>

</xml_diff>

<commit_message>
Republish thesis package after final review fixes
</commit_message>
<xml_diff>
--- a/thesis/output/VEGO-AI-MSc-Thesis-Evidence-Ready-Draft-2026-07-25.docx
+++ b/thesis/output/VEGO-AI-MSc-Thesis-Evidence-Ready-Draft-2026-07-25.docx
@@ -82,7 +82,7 @@
         <w:br/>
         <w:t>25 July 2026</w:t>
         <w:br/>
-        <w:t>Source revision 462321dc15d6</w:t>
+        <w:t>Source revision e5dfc6d6c4a1</w:t>
       </w:r>
     </w:p>
     <w:p>
@@ -32352,7 +32352,7 @@
         <w:color w:val="596573"/>
         <w:sz w:val="17"/>
       </w:rPr>
-      <w:t xml:space="preserve">   |   source 462321dc</w:t>
+      <w:t xml:space="preserve">   |   source e5dfc6d6</w:t>
     </w:r>
   </w:p>
 </w:hdr>

</xml_diff>

<commit_message>
Republish thesis evidence from reviewed source
</commit_message>
<xml_diff>
--- a/thesis/output/VEGO-AI-MSc-Thesis-Evidence-Ready-Draft-2026-07-25.docx
+++ b/thesis/output/VEGO-AI-MSc-Thesis-Evidence-Ready-Draft-2026-07-25.docx
@@ -82,7 +82,7 @@
         <w:br/>
         <w:t>25 July 2026</w:t>
         <w:br/>
-        <w:t>Source revision e5dfc6d6c4a1</w:t>
+        <w:t>Source revision 0c2fcbbb8079</w:t>
       </w:r>
     </w:p>
     <w:p>
@@ -32352,7 +32352,7 @@
         <w:color w:val="596573"/>
         <w:sz w:val="17"/>
       </w:rPr>
-      <w:t xml:space="preserve">   |   source e5dfc6d6</w:t>
+      <w:t xml:space="preserve">   |   source 0c2fcbbb</w:t>
     </w:r>
   </w:p>
 </w:hdr>

</xml_diff>

<commit_message>
Republish evidence after final governance fixes
</commit_message>
<xml_diff>
--- a/thesis/output/VEGO-AI-MSc-Thesis-Evidence-Ready-Draft-2026-07-25.docx
+++ b/thesis/output/VEGO-AI-MSc-Thesis-Evidence-Ready-Draft-2026-07-25.docx
@@ -82,7 +82,7 @@
         <w:br/>
         <w:t>25 July 2026</w:t>
         <w:br/>
-        <w:t>Source revision 0c2fcbbb8079</w:t>
+        <w:t>Source revision 78c74427575e</w:t>
       </w:r>
     </w:p>
     <w:p>
@@ -32352,7 +32352,7 @@
         <w:color w:val="596573"/>
         <w:sz w:val="17"/>
       </w:rPr>
-      <w:t xml:space="preserve">   |   source 0c2fcbbb</w:t>
+      <w:t xml:space="preserve">   |   source 78c74427</w:t>
     </w:r>
   </w:p>
 </w:hdr>

</xml_diff>

<commit_message>
Republish thesis evidence after security review
</commit_message>
<xml_diff>
--- a/thesis/output/VEGO-AI-MSc-Thesis-Evidence-Ready-Draft-2026-07-25.docx
+++ b/thesis/output/VEGO-AI-MSc-Thesis-Evidence-Ready-Draft-2026-07-25.docx
@@ -82,7 +82,7 @@
         <w:br/>
         <w:t>25 July 2026</w:t>
         <w:br/>
-        <w:t>Source revision 78c74427575e</w:t>
+        <w:t>Source revision d1d9c8eb8942</w:t>
       </w:r>
     </w:p>
     <w:p>
@@ -30527,7 +30527,7 @@
         <w:t xml:space="preserve">16. </w:t>
       </w:r>
       <w:r>
-        <w:t>Current verified inventory passes (108 VEGO-AI tests, 92 research-infrastructure tests plus 7 subtests, and 41 offline H-layer tests)</w:t>
+        <w:t>Current verified inventory passes (108 VEGO-AI tests, 96 research-infrastructure tests plus 7 subtests, and 41 offline H-layer tests)</w:t>
       </w:r>
     </w:p>
     <w:p>
@@ -31097,7 +31097,7 @@
                 <w:color w:val="1E232A"/>
                 <w:sz w:val="18"/>
               </w:rPr>
-              <w:t>108 VEGO-AI tests, 92 research-infrastructure tests plus 7 subtests, and 41 offline H-layer tests pass</w:t>
+              <w:t>108 VEGO-AI tests, 96 research-infrastructure tests plus 7 subtests, and 41 offline H-layer tests pass</w:t>
             </w:r>
           </w:p>
         </w:tc>
@@ -32352,7 +32352,7 @@
         <w:color w:val="596573"/>
         <w:sz w:val="17"/>
       </w:rPr>
-      <w:t xml:space="preserve">   |   source 78c74427</w:t>
+      <w:t xml:space="preserve">   |   source d1d9c8eb</w:t>
     </w:r>
   </w:p>
 </w:hdr>

</xml_diff>

<commit_message>
Republish exact-head thesis review package
</commit_message>
<xml_diff>
--- a/thesis/output/VEGO-AI-MSc-Thesis-Evidence-Ready-Draft-2026-07-25.docx
+++ b/thesis/output/VEGO-AI-MSc-Thesis-Evidence-Ready-Draft-2026-07-25.docx
@@ -82,7 +82,7 @@
         <w:br/>
         <w:t>25 July 2026</w:t>
         <w:br/>
-        <w:t>Source revision d1d9c8eb8942</w:t>
+        <w:t>Source revision 3a810ddd3577</w:t>
       </w:r>
     </w:p>
     <w:p>
@@ -32352,7 +32352,7 @@
         <w:color w:val="596573"/>
         <w:sz w:val="17"/>
       </w:rPr>
-      <w:t xml:space="preserve">   |   source d1d9c8eb</w:t>
+      <w:t xml:space="preserve">   |   source 3a810ddd</w:t>
     </w:r>
   </w:p>
 </w:hdr>

</xml_diff>

<commit_message>
Republish validated thesis review package
</commit_message>
<xml_diff>
--- a/thesis/output/VEGO-AI-MSc-Thesis-Evidence-Ready-Draft-2026-07-25.docx
+++ b/thesis/output/VEGO-AI-MSc-Thesis-Evidence-Ready-Draft-2026-07-25.docx
@@ -82,7 +82,7 @@
         <w:br/>
         <w:t>25 July 2026</w:t>
         <w:br/>
-        <w:t>Source revision 3a810ddd3577</w:t>
+        <w:t>Source revision d07e106c2a36</w:t>
       </w:r>
     </w:p>
     <w:p>
@@ -30527,7 +30527,7 @@
         <w:t xml:space="preserve">16. </w:t>
       </w:r>
       <w:r>
-        <w:t>Current verified inventory passes (108 VEGO-AI tests, 96 research-infrastructure tests plus 7 subtests, and 41 offline H-layer tests)</w:t>
+        <w:t>Current verified inventory passes (108 VEGO-AI tests, 101 research-infrastructure tests plus 7 subtests, and 41 offline H-layer tests)</w:t>
       </w:r>
     </w:p>
     <w:p>
@@ -31097,7 +31097,7 @@
                 <w:color w:val="1E232A"/>
                 <w:sz w:val="18"/>
               </w:rPr>
-              <w:t>108 VEGO-AI tests, 96 research-infrastructure tests plus 7 subtests, and 41 offline H-layer tests pass</w:t>
+              <w:t>108 VEGO-AI tests, 101 research-infrastructure tests plus 7 subtests, and 41 offline H-layer tests pass</w:t>
             </w:r>
           </w:p>
         </w:tc>
@@ -32352,7 +32352,7 @@
         <w:color w:val="596573"/>
         <w:sz w:val="17"/>
       </w:rPr>
-      <w:t xml:space="preserve">   |   source 3a810ddd</w:t>
+      <w:t xml:space="preserve">   |   source d07e106c</w:t>
     </w:r>
   </w:p>
 </w:hdr>

</xml_diff>

<commit_message>
Republish exact test thesis package
</commit_message>
<xml_diff>
--- a/thesis/output/VEGO-AI-MSc-Thesis-Evidence-Ready-Draft-2026-07-25.docx
+++ b/thesis/output/VEGO-AI-MSc-Thesis-Evidence-Ready-Draft-2026-07-25.docx
@@ -82,7 +82,7 @@
         <w:br/>
         <w:t>25 July 2026</w:t>
         <w:br/>
-        <w:t>Source revision d07e106c2a36</w:t>
+        <w:t>Source revision 13a8bab86d5c</w:t>
       </w:r>
     </w:p>
     <w:p>
@@ -30527,7 +30527,7 @@
         <w:t xml:space="preserve">16. </w:t>
       </w:r>
       <w:r>
-        <w:t>Current verified inventory passes (108 VEGO-AI tests, 101 research-infrastructure tests plus 7 subtests, and 41 offline H-layer tests)</w:t>
+        <w:t>Current verified inventory passes (108 VEGO-AI tests, 102 research-infrastructure tests plus 7 subtests, and 41 offline H-layer tests)</w:t>
       </w:r>
     </w:p>
     <w:p>
@@ -31097,7 +31097,7 @@
                 <w:color w:val="1E232A"/>
                 <w:sz w:val="18"/>
               </w:rPr>
-              <w:t>108 VEGO-AI tests, 101 research-infrastructure tests plus 7 subtests, and 41 offline H-layer tests pass</w:t>
+              <w:t>108 VEGO-AI tests, 102 research-infrastructure tests plus 7 subtests, and 41 offline H-layer tests pass</w:t>
             </w:r>
           </w:p>
         </w:tc>
@@ -32352,7 +32352,7 @@
         <w:color w:val="596573"/>
         <w:sz w:val="17"/>
       </w:rPr>
-      <w:t xml:space="preserve">   |   source d07e106c</w:t>
+      <w:t xml:space="preserve">   |   source 13a8bab8</w:t>
     </w:r>
   </w:p>
 </w:hdr>

</xml_diff>

<commit_message>
Republish security-reviewed thesis package
</commit_message>
<xml_diff>
--- a/thesis/output/VEGO-AI-MSc-Thesis-Evidence-Ready-Draft-2026-07-25.docx
+++ b/thesis/output/VEGO-AI-MSc-Thesis-Evidence-Ready-Draft-2026-07-25.docx
@@ -82,7 +82,7 @@
         <w:br/>
         <w:t>25 July 2026</w:t>
         <w:br/>
-        <w:t>Source revision 13a8bab86d5c</w:t>
+        <w:t>Source revision 37fb17664d37</w:t>
       </w:r>
     </w:p>
     <w:p>
@@ -30527,7 +30527,7 @@
         <w:t xml:space="preserve">16. </w:t>
       </w:r>
       <w:r>
-        <w:t>Current verified inventory passes (108 VEGO-AI tests, 102 research-infrastructure tests plus 7 subtests, and 41 offline H-layer tests)</w:t>
+        <w:t>Current verified inventory passes (108 VEGO-AI tests, 105 research-infrastructure tests plus 7 subtests, and 41 offline H-layer tests)</w:t>
       </w:r>
     </w:p>
     <w:p>
@@ -31097,7 +31097,7 @@
                 <w:color w:val="1E232A"/>
                 <w:sz w:val="18"/>
               </w:rPr>
-              <w:t>108 VEGO-AI tests, 102 research-infrastructure tests plus 7 subtests, and 41 offline H-layer tests pass</w:t>
+              <w:t>108 VEGO-AI tests, 105 research-infrastructure tests plus 7 subtests, and 41 offline H-layer tests pass</w:t>
             </w:r>
           </w:p>
         </w:tc>
@@ -32352,7 +32352,7 @@
         <w:color w:val="596573"/>
         <w:sz w:val="17"/>
       </w:rPr>
-      <w:t xml:space="preserve">   |   source 13a8bab8</w:t>
+      <w:t xml:space="preserve">   |   source 37fb1766</w:t>
     </w:r>
   </w:p>
 </w:hdr>

</xml_diff>

<commit_message>
Refresh deterministic thesis review document
</commit_message>
<xml_diff>
--- a/thesis/output/VEGO-AI-MSc-Thesis-Evidence-Ready-Draft-2026-07-25.docx
+++ b/thesis/output/VEGO-AI-MSc-Thesis-Evidence-Ready-Draft-2026-07-25.docx
@@ -82,7 +82,7 @@
         <w:br/>
         <w:t>25 July 2026</w:t>
         <w:br/>
-        <w:t>Source revision 37fb17664d37</w:t>
+        <w:t>Source revision 7c90827659a5</w:t>
       </w:r>
     </w:p>
     <w:p>
@@ -30527,7 +30527,7 @@
         <w:t xml:space="preserve">16. </w:t>
       </w:r>
       <w:r>
-        <w:t>Current verified inventory passes (108 VEGO-AI tests, 105 research-infrastructure tests plus 7 subtests, and 41 offline H-layer tests)</w:t>
+        <w:t>Current verified inventory passes (111 VEGO-AI tests, 108 research-infrastructure tests plus 7 subtests, and 41 offline H-layer tests)</w:t>
       </w:r>
     </w:p>
     <w:p>
@@ -31097,7 +31097,7 @@
                 <w:color w:val="1E232A"/>
                 <w:sz w:val="18"/>
               </w:rPr>
-              <w:t>108 VEGO-AI tests, 105 research-infrastructure tests plus 7 subtests, and 41 offline H-layer tests pass</w:t>
+              <w:t>111 VEGO-AI tests, 108 research-infrastructure tests plus 7 subtests, and 41 offline H-layer tests pass</w:t>
             </w:r>
           </w:p>
         </w:tc>
@@ -32352,7 +32352,7 @@
         <w:color w:val="596573"/>
         <w:sz w:val="17"/>
       </w:rPr>
-      <w:t xml:space="preserve">   |   source 37fb1766</w:t>
+      <w:t xml:space="preserve">   |   source 7c908276</w:t>
     </w:r>
   </w:p>
 </w:hdr>

</xml_diff>

<commit_message>
Publish clone-verified thesis evidence package
</commit_message>
<xml_diff>
--- a/thesis/output/VEGO-AI-MSc-Thesis-Evidence-Ready-Draft-2026-07-25.docx
+++ b/thesis/output/VEGO-AI-MSc-Thesis-Evidence-Ready-Draft-2026-07-25.docx
@@ -82,7 +82,7 @@
         <w:br/>
         <w:t>25 July 2026</w:t>
         <w:br/>
-        <w:t>Source revision 7c90827659a5</w:t>
+        <w:t>Source revision 09883e98b502</w:t>
       </w:r>
     </w:p>
     <w:p>
@@ -30527,7 +30527,7 @@
         <w:t xml:space="preserve">16. </w:t>
       </w:r>
       <w:r>
-        <w:t>Current verified inventory passes (111 VEGO-AI tests, 108 research-infrastructure tests plus 7 subtests, and 41 offline H-layer tests)</w:t>
+        <w:t>Current verified inventory passes (111 VEGO-AI tests, 109 research-infrastructure tests plus 7 subtests, and 41 offline H-layer tests)</w:t>
       </w:r>
     </w:p>
     <w:p>
@@ -31097,7 +31097,7 @@
                 <w:color w:val="1E232A"/>
                 <w:sz w:val="18"/>
               </w:rPr>
-              <w:t>111 VEGO-AI tests, 108 research-infrastructure tests plus 7 subtests, and 41 offline H-layer tests pass</w:t>
+              <w:t>111 VEGO-AI tests, 109 research-infrastructure tests plus 7 subtests, and 41 offline H-layer tests pass</w:t>
             </w:r>
           </w:p>
         </w:tc>
@@ -32352,7 +32352,7 @@
         <w:color w:val="596573"/>
         <w:sz w:val="17"/>
       </w:rPr>
-      <w:t xml:space="preserve">   |   source 7c908276</w:t>
+      <w:t xml:space="preserve">   |   source 09883e98</w:t>
     </w:r>
   </w:p>
 </w:hdr>

</xml_diff>

<commit_message>
Publish baseline-pinned thesis evidence package
</commit_message>
<xml_diff>
--- a/thesis/output/VEGO-AI-MSc-Thesis-Evidence-Ready-Draft-2026-07-25.docx
+++ b/thesis/output/VEGO-AI-MSc-Thesis-Evidence-Ready-Draft-2026-07-25.docx
@@ -82,7 +82,7 @@
         <w:br/>
         <w:t>25 July 2026</w:t>
         <w:br/>
-        <w:t>Source revision 09883e98b502</w:t>
+        <w:t>Source revision f8848d7ee70c</w:t>
       </w:r>
     </w:p>
     <w:p>
@@ -32352,7 +32352,7 @@
         <w:color w:val="596573"/>
         <w:sz w:val="17"/>
       </w:rPr>
-      <w:t xml:space="preserve">   |   source 09883e98</w:t>
+      <w:t xml:space="preserve">   |   source f8848d7e</w:t>
     </w:r>
   </w:p>
 </w:hdr>

</xml_diff>

<commit_message>
Publish isolated-trust thesis evidence package
</commit_message>
<xml_diff>
--- a/thesis/output/VEGO-AI-MSc-Thesis-Evidence-Ready-Draft-2026-07-25.docx
+++ b/thesis/output/VEGO-AI-MSc-Thesis-Evidence-Ready-Draft-2026-07-25.docx
@@ -82,7 +82,7 @@
         <w:br/>
         <w:t>25 July 2026</w:t>
         <w:br/>
-        <w:t>Source revision f8848d7ee70c</w:t>
+        <w:t>Source revision c984c6aebc1f</w:t>
       </w:r>
     </w:p>
     <w:p>
@@ -32352,7 +32352,7 @@
         <w:color w:val="596573"/>
         <w:sz w:val="17"/>
       </w:rPr>
-      <w:t xml:space="preserve">   |   source f8848d7e</w:t>
+      <w:t xml:space="preserve">   |   source c984c6ae</w:t>
     </w:r>
   </w:p>
 </w:hdr>

</xml_diff>

<commit_message>
Rebuild thesis package from remediated source
</commit_message>
<xml_diff>
--- a/thesis/output/VEGO-AI-MSc-Thesis-Evidence-Ready-Draft-2026-07-25.docx
+++ b/thesis/output/VEGO-AI-MSc-Thesis-Evidence-Ready-Draft-2026-07-25.docx
@@ -82,7 +82,7 @@
         <w:br/>
         <w:t>25 July 2026</w:t>
         <w:br/>
-        <w:t>Source revision c984c6aebc1f</w:t>
+        <w:t>Source revision 6997a9934904</w:t>
       </w:r>
     </w:p>
     <w:p>
@@ -30527,7 +30527,7 @@
         <w:t xml:space="preserve">16. </w:t>
       </w:r>
       <w:r>
-        <w:t>Current verified inventory passes (111 VEGO-AI tests, 109 research-infrastructure tests plus 7 subtests, and 41 offline H-layer tests)</w:t>
+        <w:t>Current verified inventory passes (113 VEGO-AI tests, 113 research-infrastructure tests plus 7 subtests, and 46 offline H-layer tests)</w:t>
       </w:r>
     </w:p>
     <w:p>
@@ -31097,7 +31097,7 @@
                 <w:color w:val="1E232A"/>
                 <w:sz w:val="18"/>
               </w:rPr>
-              <w:t>111 VEGO-AI tests, 109 research-infrastructure tests plus 7 subtests, and 41 offline H-layer tests pass</w:t>
+              <w:t>113 VEGO-AI tests, 113 research-infrastructure tests plus 7 subtests, and 46 offline H-layer tests pass</w:t>
             </w:r>
           </w:p>
         </w:tc>
@@ -32352,7 +32352,7 @@
         <w:color w:val="596573"/>
         <w:sz w:val="17"/>
       </w:rPr>
-      <w:t xml:space="preserve">   |   source c984c6ae</w:t>
+      <w:t xml:space="preserve">   |   source 6997a993</w:t>
     </w:r>
   </w:p>
 </w:hdr>

</xml_diff>

<commit_message>
Rebuild thesis package from corrected provenance
</commit_message>
<xml_diff>
--- a/thesis/output/VEGO-AI-MSc-Thesis-Evidence-Ready-Draft-2026-07-25.docx
+++ b/thesis/output/VEGO-AI-MSc-Thesis-Evidence-Ready-Draft-2026-07-25.docx
@@ -82,7 +82,7 @@
         <w:br/>
         <w:t>25 July 2026</w:t>
         <w:br/>
-        <w:t>Source revision 6997a9934904</w:t>
+        <w:t>Source revision 3247a6e335ae</w:t>
       </w:r>
     </w:p>
     <w:p>
@@ -32352,7 +32352,7 @@
         <w:color w:val="596573"/>
         <w:sz w:val="17"/>
       </w:rPr>
-      <w:t xml:space="preserve">   |   source 6997a993</w:t>
+      <w:t xml:space="preserve">   |   source 3247a6e3</w:t>
     </w:r>
   </w:p>
 </w:hdr>

</xml_diff>

<commit_message>
Rebuild thesis package after safety remediation
</commit_message>
<xml_diff>
--- a/thesis/output/VEGO-AI-MSc-Thesis-Evidence-Ready-Draft-2026-07-25.docx
+++ b/thesis/output/VEGO-AI-MSc-Thesis-Evidence-Ready-Draft-2026-07-25.docx
@@ -82,7 +82,7 @@
         <w:br/>
         <w:t>25 July 2026</w:t>
         <w:br/>
-        <w:t>Source revision 3247a6e335ae</w:t>
+        <w:t>Source revision c1a27570adab</w:t>
       </w:r>
     </w:p>
     <w:p>
@@ -32352,7 +32352,7 @@
         <w:color w:val="596573"/>
         <w:sz w:val="17"/>
       </w:rPr>
-      <w:t xml:space="preserve">   |   source 3247a6e3</w:t>
+      <w:t xml:space="preserve">   |   source c1a27570</w:t>
     </w:r>
   </w:p>
 </w:hdr>

</xml_diff>

<commit_message>
Rebuild thesis package from lint-clean source
</commit_message>
<xml_diff>
--- a/thesis/output/VEGO-AI-MSc-Thesis-Evidence-Ready-Draft-2026-07-25.docx
+++ b/thesis/output/VEGO-AI-MSc-Thesis-Evidence-Ready-Draft-2026-07-25.docx
@@ -82,7 +82,7 @@
         <w:br/>
         <w:t>25 July 2026</w:t>
         <w:br/>
-        <w:t>Source revision c1a27570adab</w:t>
+        <w:t>Source revision 91e6214cd7d3</w:t>
       </w:r>
     </w:p>
     <w:p>
@@ -32352,7 +32352,7 @@
         <w:color w:val="596573"/>
         <w:sz w:val="17"/>
       </w:rPr>
-      <w:t xml:space="preserve">   |   source c1a27570</w:t>
+      <w:t xml:space="preserve">   |   source 91e6214c</w:t>
     </w:r>
   </w:p>
 </w:hdr>

</xml_diff>

<commit_message>
Rebuild deterministic thesis artifact after provenance refresh
</commit_message>
<xml_diff>
--- a/thesis/output/VEGO-AI-MSc-Thesis-Evidence-Ready-Draft-2026-07-25.docx
+++ b/thesis/output/VEGO-AI-MSc-Thesis-Evidence-Ready-Draft-2026-07-25.docx
@@ -82,7 +82,7 @@
         <w:br/>
         <w:t>25 July 2026</w:t>
         <w:br/>
-        <w:t>Source revision 91e6214cd7d3</w:t>
+        <w:t>Source revision 2e0d014bd9af</w:t>
       </w:r>
     </w:p>
     <w:p>
@@ -32352,7 +32352,7 @@
         <w:color w:val="596573"/>
         <w:sz w:val="17"/>
       </w:rPr>
-      <w:t xml:space="preserve">   |   source 91e6214c</w:t>
+      <w:t xml:space="preserve">   |   source 2e0d014b</w:t>
     </w:r>
   </w:p>
 </w:hdr>

</xml_diff>

<commit_message>
Execute the experiment benchmark and publish the results-first BigUI (#11)
Publish the canonical EXP-000–040 catalog, accepted-run history, paper-aligned comparison contracts, offline architecture evidence, and results-first BigUI.
</commit_message>
<xml_diff>
--- a/thesis/output/VEGO-AI-MSc-Thesis-Evidence-Ready-Draft-2026-07-25.docx
+++ b/thesis/output/VEGO-AI-MSc-Thesis-Evidence-Ready-Draft-2026-07-25.docx
@@ -82,7 +82,7 @@
         <w:br/>
         <w:t>25 July 2026</w:t>
         <w:br/>
-        <w:t>Source revision 91e6214cd7d3</w:t>
+        <w:t>Source revision 2e0d014bd9af</w:t>
       </w:r>
     </w:p>
     <w:p>
@@ -32352,7 +32352,7 @@
         <w:color w:val="596573"/>
         <w:sz w:val="17"/>
       </w:rPr>
-      <w:t xml:space="preserve">   |   source 91e6214c</w:t>
+      <w:t xml:space="preserve">   |   source 2e0d014b</w:t>
     </w:r>
   </w:p>
 </w:hdr>

</xml_diff>